<commit_message>
minwage: restrict everything to the main design's window (events 2010-2025, observations 2007-2026)
Descriptive figures run 2007-2025; the all-events (1994-2025) and pre-2010 rows leave
the robustness table; sample counts, the data section, the event definition and the
discussion's timing argument are rewritten for the window. Word file regenerated.

Co-Authored-By: Claude Fable 5.1 <noreply@anthropic.com>
Claude-Session: https://claude.ai/code/session_01Rd74HvTpozFfpcfGubVirr
</commit_message>
<xml_diff>
--- a/minwage/paper/minwage_teens.docx
+++ b/minwage/paper/minwage_teens.docx
@@ -939,7 +939,7 @@
         <w:t xml:space="preserve"> </w:t>
       </w:r>
       <w:r>
-        <w:t xml:space="preserve">5.5</w:t>
+        <w:t xml:space="preserve">3.1</w:t>
       </w:r>
       <w:r>
         <w:t xml:space="preserve"> </w:t>
@@ -963,7 +963,31 @@
         <w:t xml:space="preserve"> </w:t>
       </w:r>
       <w:r>
-        <w:t xml:space="preserve">olds.</w:t>
+        <w:t xml:space="preserve">olds</w:t>
+      </w:r>
+      <w:r>
+        <w:t xml:space="preserve"> </w:t>
+      </w:r>
+      <w:r>
+        <w:t xml:space="preserve">from</w:t>
+      </w:r>
+      <w:r>
+        <w:t xml:space="preserve"> </w:t>
+      </w:r>
+      <w:r>
+        <w:t xml:space="preserve">2007</w:t>
+      </w:r>
+      <w:r>
+        <w:t xml:space="preserve"> </w:t>
+      </w:r>
+      <w:r>
+        <w:t xml:space="preserve">to</w:t>
+      </w:r>
+      <w:r>
+        <w:t xml:space="preserve"> </w:t>
+      </w:r>
+      <w:r>
+        <w:t xml:space="preserve">2026.</w:t>
       </w:r>
       <w:r>
         <w:t xml:space="preserve"> </w:t>
@@ -1848,7 +1872,7 @@
         <w:pStyle w:val="FirstParagraph"/>
       </w:pPr>
       <w:r>
-        <w:t xml:space="preserve">The economic literature on the consequences of the minimum wage is both vast and contentious. Researchers concentrate mainly on the possible disemployment effects of the policy, frequently focusing on teenagers, the age group most subject to the minimum wage: a quarter of 16–19 year old wage earners are paid at or near it, against a tenth of 20–24 year olds. Far less attention has been paid to the policy’s effect on how teenagers allocate their time between school and work, even though that allocation is the channel through which the minimum wage would matter for their later lives and the one policymakers care most about. The question has become pressing for a specific reason. Employment of 16–19 year olds fell from 45 percent in 2000 to 27 percent in 2010 and has only partly recovered, school enrollment rose from 68 to 77 percent, and the share of teens both enrolled and employed fell from 26 to 17 percent. Neumark and Shupe (2019) weigh the candidate explanations against one another in CPS data for 1986–2015 and conclude that higher minimum wages are the predominant factor, moving teens from being enrolled and employed to being enrolled only. Smith (2021) finds, for 1992–2012, that minimum wage increases lower high school dropout among teens from low-socioeconomic-status families and do nothing for other teens. I contribute to this literature by using the event design that the minimum wage employment literature adopted after Cengiz et al. (2019), on the largest increases in the modern era and with local minimums treated as the policies they are, to establish the causal effect of minimum wage changes on teenagers’ wages and on their division between school and work.</w:t>
+        <w:t xml:space="preserve">The economic literature on the consequences of the minimum wage is both vast and contentious. Researchers concentrate mainly on the possible disemployment effects of the policy, frequently focusing on teenagers, the age group most subject to the minimum wage: a quarter of 16–19 year old wage earners are paid at or near it, against a tenth of 20–24 year olds. Far less attention has been paid to the policy’s effect on how teenagers allocate their time between school and work, even though that allocation is the channel through which the minimum wage would matter for their later lives and the one policymakers care most about. The question has become pressing for a specific reason. In the published CPS series, employment of 16–19 year olds fell from 45 percent in 2000 to 27 percent in 2010 and has only partly recovered, school enrollment rose from 68 to 77 percent, and the share of teens both enrolled and employed fell from 26 to 17 percent. Neumark and Shupe (2019) weigh the candidate explanations against one another in CPS data for 1986–2015 and conclude that higher minimum wages are the predominant factor, moving teens from being enrolled and employed to being enrolled only. Smith (2021) finds, for 1992–2012, that minimum wage increases lower high school dropout among teens from low-socioeconomic-status families and do nothing for other teens. I contribute to this literature by using the event design that the minimum wage employment literature adopted after Cengiz et al. (2019), on the largest increases in the modern era and with local minimums treated as the policies they are, to establish the causal effect of minimum wage changes on teenagers’ wages and on their division between school and work.</w:t>
       </w:r>
     </w:p>
     <w:p>
@@ -1864,7 +1888,7 @@
         <w:pStyle w:val="BodyText"/>
       </w:pPr>
       <w:r>
-        <w:t xml:space="preserve">I investigate the impact of minimum wage changes on teenagers’ school–work status and wages using the basic monthly files of the Current Population Survey from January 1994 to August 2026, which ask every 16–24 year old each month whether they attended school last week, record their employment and hours, and in the outgoing rotation groups record their hourly wage. The geographic unit is the jurisdiction whose wage floor a teenager faces: each of the 56 counties the CPS identifies that have their own minimum is a unit with its own wage series, the city’s rate applied to the county, and the remainder of each state is another. An event is a rise of at least 5 percent in a unit’s minimum, not caused by the federal floor, after 36 months without one, with the later steps of a schedule counted as part of the same event; there are 73 such events from January 2010 with CPS teens in the unit, in a period when the federal minimum did not change. Each event compares the treated unit with the units in other states that had no increase from three years before to four years after it, relative to the year before the event, which is the Callaway–Sant’Anna group-time comparison, and the events are aggregated by treated teen population. The design uses none of the comparisons between earlier- and later-treated units that bias two-way fixed effects estimates when effects vary, which is the concern with the regressions behind the earlier findings. Beside each event study I report the stacked difference-in-differences regression of Cengiz et al. (2019) on the same data, and the appendix reports the two-way fixed effects regression of the outcome on the log minimum wage that Neumark and Shupe (2019) and Smith (2021) use, so that the reader can see where the designs agree and where they part.</w:t>
+        <w:t xml:space="preserve">I investigate the impact of minimum wage changes on teenagers’ school–work status and wages using the basic monthly files of the Current Population Survey from January 2007 to August 2026, which ask every 16–24 year old each month whether they attended school last week, record their employment and hours, and in the outgoing rotation groups record their hourly wage. The geographic unit is the jurisdiction whose wage floor a teenager faces: each of the 56 counties the CPS identifies that have their own minimum is a unit with its own wage series, the city’s rate applied to the county, and the remainder of each state is another. An event is a rise of at least 5 percent in a unit’s minimum, not caused by the federal floor, after 36 months without one, with the later steps of a schedule counted as part of the same event; there are 73 such events from January 2010 with CPS teens in the unit, in a period when the federal minimum did not change. Each event compares the treated unit with the units in other states that had no increase from three years before to four years after it, relative to the year before the event, which is the Callaway–Sant’Anna group-time comparison, and the events are aggregated by treated teen population. The design uses none of the comparisons between earlier- and later-treated units that bias two-way fixed effects estimates when effects vary, which is the concern with the regressions behind the earlier findings. Beside each event study I report the stacked difference-in-differences regression of Cengiz et al. (2019) on the same data, and the appendix reports the two-way fixed effects regression of the outcome on the log minimum wage that Neumark and Shupe (2019) and Smith (2021) use, so that the reader can see where the designs agree and where they part.</w:t>
       </w:r>
     </w:p>
     <w:p>
@@ -3273,7 +3297,7 @@
         <w:pStyle w:val="FirstParagraph"/>
       </w:pPr>
       <w:r>
-        <w:t xml:space="preserve">The individual data are the basic monthly files of the Current Population Survey from January 1994, the first month of the redesigned questionnaire, to August 2026, from IPUMS-CPS (Flood et al., 2024). The basic monthly survey asks every person aged 16–24 whether they attended school or college in the previous week and whether full or part time, which is the enrollment measure used here; the March and October supplements ask enrollment of wider age ranges but only once a year. I keep all 16–24 year olds, 5.46 million person-months, about 6,600 aged 16–19 each month. Employment, labour force status and usual hours come from the standard labour force items. In the outgoing rotation groups, the fourth and eighth months a household is in the survey and a quarter of the sample, the survey records the hourly wage of workers paid by the hour and weekly earnings of all workers; these give the wage outcomes. Person weights are the monthly final weights, and the earnings weights for the outgoing rotation items. The household’s income category is recorded for every teen and is the measure of socioeconomic standing; parents’ education is not available in an extract of 16–24 year olds.</w:t>
+        <w:t xml:space="preserve">The individual data are the basic monthly files of the Current Population Survey from January 2007, three years before the first event, to August 2026, from IPUMS-CPS (Flood et al., 2024); every estimate, figure and table in the paper uses this window. The basic monthly survey asks every person aged 16–24 whether they attended school or college in the previous week and whether full or part time, which is the enrollment measure used here; the March and October supplements ask enrollment of wider age ranges but only once a year. I keep all 16–24 year olds, 3.08 million person-months, about 6,100 aged 16–19 each month. Employment, labour force status and usual hours come from the standard labour force items. In the outgoing rotation groups, the fourth and eighth months a household is in the survey and a quarter of the sample, the survey records the hourly wage of workers paid by the hour and weekly earnings of all workers; these give the wage outcomes. Person weights are the monthly final weights, and the earnings weights for the outgoing rotation items. The household’s income category is recorded for every teen and is the measure of socioeconomic standing; parents’ education is not available in an extract of 16–24 year olds.</w:t>
       </w:r>
     </w:p>
     <w:p>
@@ -3297,7 +3321,7 @@
         <w:pStyle w:val="BodyText"/>
       </w:pPr>
       <w:r>
-        <w:t xml:space="preserve">Figure 1 shows the aggregate series. Teen employment fell from 45 percent in 2000 to 27 percent in 2010, more than half of that at 16–17, and recovered to about 32 percent by 2019 and 2022–2025; enrollment rose from 68 to 77 percent; the share enrolled and employed fell from 26 to 17 percent while the share neither enrolled nor employed was flat at about 12 percent. Figure 2 shows the population-weighted effective minimum wage and the calendar of state events: a wave of state increases in 2005–2007, the federal increases of 2007–2009, and the wave of large state schedules from 2014. Table 1 gives the means in the year before the event for teens in the event states and in their clean controls, for the 39 state events from 2010. In event states, 85 percent of 16–17 year olds and 64 percent of 18–19 year olds are enrolled; 19 and 39 percent are employed; hourly-paid teens earn $9.61 and $10.69 an hour. The control states have slightly lower enrollment, slightly higher employment and lower wages, the differences one expects between jurisdictions that raise their minimum and jurisdictions that do not, and the design compares changes rather than levels.</w:t>
+        <w:t xml:space="preserve">Figure 1 shows the aggregate series over the window. Teen employment fell from 36 percent in 2007 to 27 percent in 2010, from 26 to 17 percent at 16–17 and from 48 to 38 percent at 18–19, and recovered to 32 percent by 2019 and 33 percent in 2022, where it has stayed; enrollment moved between 74 and 77 percent; the share enrolled and employed fell from 22 to 17 percent and recovered to 18 to 19 percent, while the share neither enrolled nor employed stayed between 11 and 13 percent. Figure 2 shows the population-weighted effective minimum wage and the calendar of state events: the federal increases of 2007–2009, no federal change since, and the wave of large state schedules from 2014. Table 1 gives the means in the year before the event for teens in the event states and in their clean controls, for the 39 state events from 2010. In event states, 85 percent of 16–17 year olds and 64 percent of 18–19 year olds are enrolled; 19 and 39 percent are employed; hourly-paid teens earn $9.61 and $10.69 an hour. The control states have slightly lower enrollment, slightly higher employment and lower wages, the differences one expects between jurisdictions that raise their minimum and jurisdictions that do not, and the design compares changes rather than levels.</w:t>
       </w:r>
     </w:p>
     <w:tbl>
@@ -3381,7 +3405,7 @@
         <w:pStyle w:val="ImageCaption"/>
       </w:pPr>
       <w:r>
-        <w:t xml:space="preserve">Figure 1: Employment, school enrollment and school–work status of 16–19 year olds, 1994–2025</w:t>
+        <w:t xml:space="preserve">Figure 1: Employment, school enrollment and school–work status of 16–19 year olds, 2007–2025</w:t>
       </w:r>
     </w:p>
     <w:tbl>
@@ -3465,7 +3489,7 @@
         <w:pStyle w:val="ImageCaption"/>
       </w:pPr>
       <w:r>
-        <w:t xml:space="preserve">Figure 2: The effective minimum wage and the calendar of state events, 1994–2025</w:t>
+        <w:t xml:space="preserve">Figure 2: The effective minimum wage and the calendar of state events, 2007–2025</w:t>
       </w:r>
     </w:p>
     <w:p>
@@ -4472,7 +4496,7 @@
         <w:t xml:space="preserve"> </w:t>
       </w:r>
       <w:r>
-        <w:t xml:space="preserve">if the unit’s effective minimum rises by at least 5 percent because of state or local law and there has been no such rise in the unit in the preceding 36 months. Later increases in the following 48 months, which in the modern schedules are the subsequent steps of the same law, are part of the same event, so a multi-year schedule is one event and its dose is the cumulative rise over the window. Increases caused by a change in the federal minimum are not events. This yields 258 unit events between 1994 and 2025, of which 101 fall from January 2010 on and 73 of those have CPS teens in the unit (Appendix Table 23): 39 in state remainders, 18 in counties where state and local rates rose together, and 16 driven by a local rise alone. The events raise the minimum by 5 to 86 percent over the window, 38 percent on average, in 62 cases through two or more steps.</w:t>
+        <w:t xml:space="preserve">if the unit’s effective minimum rises by at least 5 percent because of state or local law and there has been no such rise in the unit in the preceding 36 months. Later increases in the following 48 months, which in the modern schedules are the subsequent steps of the same law, are part of the same event, so a multi-year schedule is one event and its dose is the cumulative rise over the window. Increases caused by a change in the federal minimum are not events. This yields 101 unit events from January 2010, of which 73 have CPS teens in the unit (Appendix Table 23): 39 in state remainders, 18 in counties where state and local rates rose together, and 16 driven by a local rise alone. The events raise the minimum by 5 to 86 percent over the window, 38 percent on average, in 62 cases through two or more steps.</w:t>
       </w:r>
     </w:p>
     <w:p>
@@ -4480,7 +4504,7 @@
         <w:pStyle w:val="BodyText"/>
       </w:pPr>
       <w:r>
-        <w:t xml:space="preserve">The controls for an event are the units in other states that had no qualifying increase in the window from 36 months before the event to 47 months after it. For the events from 2010 on, the federal minimum did not change, so these units had no change in their minimum at all; each event has a median of 28 such controls. Before 2010 the federal increases of 1996–97 and 2007–09 raised the minimum in every unit at or near the floor, so the windows of events in those years contain federal-induced increases in the controls; those events are reported in the appendix.</w:t>
+        <w:t xml:space="preserve">The controls for an event are the units in other states that had no qualifying increase in the window from 36 months before the event to 47 months after it. For the events from 2010 on, the federal minimum did not change, so these units had no change in their minimum at all; each event has a median of 28 such controls. The windows of the four events of 2010–2013 begin before the federal increase of July 2009, which raised the minimum in treated and control units alike and is absorbed by the comparison with the year before the event. No events before 2010 are used, and no observations before January 2007 enter any estimate.</w:t>
       </w:r>
     </w:p>
     <w:bookmarkEnd w:id="31"/>
@@ -7033,7 +7057,7 @@
         <w:pStyle w:val="FirstParagraph"/>
       </w:pPr>
       <w:r>
-        <w:t xml:space="preserve">The theory of Section 2 and the evidence of Ehrenberg and Marcus (1982) and Smith (2021) put the schooling response, if there is one, among teens from poorer families: the opportunity-cost channel binds hardest where the alternative to school is a minimum wage job, and the liquidity channel operates only where the family cannot pay for school. Smith (2021) finds that a 10 percent rise in the state minimum lowers dropout by 0.5 to 1.0 points among teens whose parents lack a diploma and does nothing for the rest. The CPS basic monthly files identify the family’s income category, so I split teens by family income below versus at or above $50,000, close to the median for teen households over the period; Appendix D repeats the analysis with a split at the weighted median income category among teens in the same survey year, which removes the drift of a nominal threshold (60 percent of teens were below $50,000 in 1995, 28 percent in 2024). Smith (2021) reports his own estimates with income-percentile splits and finds the effect concentrated in the bottom of the distribution and shrinking as the threshold rises toward the median, so a median split is a test of the same claim at a coarser cut.</w:t>
+        <w:t xml:space="preserve">The theory of Section 2 and the evidence of Ehrenberg and Marcus (1982) and Smith (2021) put the schooling response, if there is one, among teens from poorer families: the opportunity-cost channel binds hardest where the alternative to school is a minimum wage job, and the liquidity channel operates only where the family cannot pay for school. Smith (2021) finds that a 10 percent rise in the state minimum lowers dropout by 0.5 to 1.0 points among teens whose parents lack a diploma and does nothing for the rest. The CPS basic monthly files identify the family’s income category, so I split teens by family income below versus at or above $50,000, close to the median for teen households over the period; Appendix D repeats the analysis with a split at the weighted median income category among teens in the same survey year, which removes the drift of a nominal threshold (45 percent of teens were below $50,000 in 2007, 28 percent in 2024). Smith (2021) reports his own estimates with income-percentile splits and finds the effect concentrated in the bottom of the distribution and shrinking as the threshold rises toward the median, so a median split is a test of the same claim at a coarser cut.</w:t>
       </w:r>
     </w:p>
     <w:p>
@@ -15665,84 +15689,7 @@
         <w:t xml:space="preserve"> </w:t>
       </w:r>
       <w:r>
-        <w:t xml:space="preserve">(1.0). Using all 134 unit events since 1994 gives</w:t>
-      </w:r>
-      <w:r>
-        <w:t xml:space="preserve"> </w:t>
-      </w:r>
-      <m:oMath>
-        <m:r>
-          <m:rPr>
-            <m:sty m:val="p"/>
-          </m:rPr>
-          <m:t>−</m:t>
-        </m:r>
-        <m:r>
-          <m:t>0.3</m:t>
-        </m:r>
-      </m:oMath>
-      <w:r>
-        <w:t xml:space="preserve"> </w:t>
-      </w:r>
-      <w:r>
-        <w:t xml:space="preserve">(s.e. 0.3) and</w:t>
-      </w:r>
-      <w:r>
-        <w:t xml:space="preserve"> </w:t>
-      </w:r>
-      <m:oMath>
-        <m:r>
-          <m:rPr>
-            <m:sty m:val="p"/>
-          </m:rPr>
-          <m:t>+</m:t>
-        </m:r>
-        <m:r>
-          <m:t>0.4</m:t>
-        </m:r>
-      </m:oMath>
-      <w:r>
-        <w:t xml:space="preserve"> </w:t>
-      </w:r>
-      <w:r>
-        <w:t xml:space="preserve">(s.e. 0.6); the 61 events before 2010, whose windows contain the federal increases, give</w:t>
-      </w:r>
-      <w:r>
-        <w:t xml:space="preserve"> </w:t>
-      </w:r>
-      <m:oMath>
-        <m:r>
-          <m:rPr>
-            <m:sty m:val="p"/>
-          </m:rPr>
-          <m:t>−</m:t>
-        </m:r>
-        <m:r>
-          <m:t>0.3</m:t>
-        </m:r>
-      </m:oMath>
-      <w:r>
-        <w:t xml:space="preserve"> </w:t>
-      </w:r>
-      <w:r>
-        <w:t xml:space="preserve">and</w:t>
-      </w:r>
-      <w:r>
-        <w:t xml:space="preserve"> </w:t>
-      </w:r>
-      <m:oMath>
-        <m:r>
-          <m:rPr>
-            <m:sty m:val="p"/>
-          </m:rPr>
-          <m:t>+</m:t>
-        </m:r>
-        <m:r>
-          <m:t>0.7</m:t>
-        </m:r>
-      </m:oMath>
-      <w:r>
-        <w:t xml:space="preserve">; the 62 events with a window rise of at least 20 percent give</w:t>
+        <w:t xml:space="preserve">(1.0). The 62 events with a window rise of at least 20 percent give</w:t>
       </w:r>
       <w:r>
         <w:t xml:space="preserve"> </w:t>
@@ -15836,47 +15783,7 @@
         </m:r>
       </m:oMath>
       <w:r>
-        <w:t xml:space="preserve">, because equal weights give the small county units, whose enrollment was already rising, the same weight as California. Employment of 16–17 year olds is</w:t>
-      </w:r>
-      <w:r>
-        <w:t xml:space="preserve"> </w:t>
-      </w:r>
-      <m:oMath>
-        <m:r>
-          <m:rPr>
-            <m:sty m:val="p"/>
-          </m:rPr>
-          <m:t>−</m:t>
-        </m:r>
-        <m:r>
-          <m:t>1.0</m:t>
-        </m:r>
-      </m:oMath>
-      <w:r>
-        <w:t xml:space="preserve"> </w:t>
-      </w:r>
-      <w:r>
-        <w:t xml:space="preserve">points (s.e. 0.7) in the pre-2010 set and</w:t>
-      </w:r>
-      <w:r>
-        <w:t xml:space="preserve"> </w:t>
-      </w:r>
-      <m:oMath>
-        <m:r>
-          <m:rPr>
-            <m:sty m:val="p"/>
-          </m:rPr>
-          <m:t>−</m:t>
-        </m:r>
-        <m:r>
-          <m:t>0.5</m:t>
-        </m:r>
-      </m:oMath>
-      <w:r>
-        <w:t xml:space="preserve"> </w:t>
-      </w:r>
-      <w:r>
-        <w:t xml:space="preserve">(0.4) across all events, the only estimates in the table that lean negative, and both are within two standard errors of zero and paired with zero enrollment effects. Ages 20–24 show</w:t>
+        <w:t xml:space="preserve">, because equal weights give the small county units, whose enrollment was already rising, the same weight as California. No employment estimate in the table is more than one standard error below zero. Ages 20–24 show</w:t>
       </w:r>
       <w:r>
         <w:t xml:space="preserve"> </w:t>
@@ -17172,414 +17079,6 @@
             <w:pPr>
               <w:pStyle w:val="Compact"/>
             </w:pPr>
-          </w:p>
-        </w:tc>
-        <w:tc>
-          <w:tcPr/>
-          <w:p>
-            <w:pPr>
-              <w:pStyle w:val="Compact"/>
-            </w:pPr>
-          </w:p>
-        </w:tc>
-        <w:tc>
-          <w:tcPr/>
-          <w:p>
-            <w:pPr>
-              <w:pStyle w:val="Compact"/>
-            </w:pPr>
-          </w:p>
-        </w:tc>
-      </w:tr>
-      <w:tr>
-        <w:tc>
-          <w:tcPr/>
-          <w:p>
-            <w:pPr>
-              <w:pStyle w:val="Compact"/>
-              <w:jc w:val="left"/>
-            </w:pPr>
-            <w:r>
-              <w:t xml:space="preserve">All events, 1994–2025</w:t>
-            </w:r>
-          </w:p>
-        </w:tc>
-        <w:tc>
-          <w:tcPr/>
-          <w:p>
-            <w:pPr>
-              <w:pStyle w:val="Compact"/>
-              <w:jc w:val="left"/>
-            </w:pPr>
-            <w:r>
-              <w:t xml:space="preserve">-0.003</w:t>
-            </w:r>
-          </w:p>
-        </w:tc>
-        <w:tc>
-          <w:tcPr/>
-          <w:p>
-            <w:pPr>
-              <w:pStyle w:val="Compact"/>
-              <w:jc w:val="left"/>
-            </w:pPr>
-            <w:r>
-              <w:t xml:space="preserve">0.004</w:t>
-            </w:r>
-          </w:p>
-        </w:tc>
-        <w:tc>
-          <w:tcPr/>
-          <w:p>
-            <w:pPr>
-              <w:pStyle w:val="Compact"/>
-              <w:jc w:val="left"/>
-            </w:pPr>
-            <w:r>
-              <w:t xml:space="preserve">-0.005</w:t>
-            </w:r>
-          </w:p>
-        </w:tc>
-        <w:tc>
-          <w:tcPr/>
-          <w:p>
-            <w:pPr>
-              <w:pStyle w:val="Compact"/>
-              <w:jc w:val="left"/>
-            </w:pPr>
-            <w:r>
-              <w:t xml:space="preserve">0.003</w:t>
-            </w:r>
-          </w:p>
-        </w:tc>
-        <w:tc>
-          <w:tcPr/>
-          <w:p>
-            <w:pPr>
-              <w:pStyle w:val="Compact"/>
-              <w:jc w:val="left"/>
-            </w:pPr>
-            <w:r>
-              <w:t xml:space="preserve">0.000</w:t>
-            </w:r>
-          </w:p>
-        </w:tc>
-        <w:tc>
-          <w:tcPr/>
-          <w:p>
-            <w:pPr>
-              <w:pStyle w:val="Compact"/>
-              <w:jc w:val="left"/>
-            </w:pPr>
-            <w:r>
-              <w:t xml:space="preserve">-0.005</w:t>
-            </w:r>
-          </w:p>
-        </w:tc>
-        <w:tc>
-          <w:tcPr/>
-          <w:p>
-            <w:pPr>
-              <w:pStyle w:val="Compact"/>
-              <w:jc w:val="left"/>
-            </w:pPr>
-            <w:r>
-              <w:t xml:space="preserve">134</w:t>
-            </w:r>
-          </w:p>
-        </w:tc>
-        <w:tc>
-          <w:tcPr/>
-          <w:p>
-            <w:pPr>
-              <w:pStyle w:val="Compact"/>
-            </w:pPr>
-          </w:p>
-        </w:tc>
-      </w:tr>
-      <w:tr>
-        <w:tc>
-          <w:tcPr/>
-          <w:p>
-            <w:pPr>
-              <w:pStyle w:val="Compact"/>
-            </w:pPr>
-          </w:p>
-        </w:tc>
-        <w:tc>
-          <w:tcPr/>
-          <w:p>
-            <w:pPr>
-              <w:pStyle w:val="Compact"/>
-              <w:jc w:val="left"/>
-            </w:pPr>
-            <w:r>
-              <w:t xml:space="preserve">(0.003)</w:t>
-            </w:r>
-          </w:p>
-        </w:tc>
-        <w:tc>
-          <w:tcPr/>
-          <w:p>
-            <w:pPr>
-              <w:pStyle w:val="Compact"/>
-              <w:jc w:val="left"/>
-            </w:pPr>
-            <w:r>
-              <w:t xml:space="preserve">(0.006)</w:t>
-            </w:r>
-          </w:p>
-        </w:tc>
-        <w:tc>
-          <w:tcPr/>
-          <w:p>
-            <w:pPr>
-              <w:pStyle w:val="Compact"/>
-              <w:jc w:val="left"/>
-            </w:pPr>
-            <w:r>
-              <w:t xml:space="preserve">(0.004)</w:t>
-            </w:r>
-          </w:p>
-        </w:tc>
-        <w:tc>
-          <w:tcPr/>
-          <w:p>
-            <w:pPr>
-              <w:pStyle w:val="Compact"/>
-              <w:jc w:val="left"/>
-            </w:pPr>
-            <w:r>
-              <w:t xml:space="preserve">(0.006)</w:t>
-            </w:r>
-          </w:p>
-        </w:tc>
-        <w:tc>
-          <w:tcPr/>
-          <w:p>
-            <w:pPr>
-              <w:pStyle w:val="Compact"/>
-              <w:jc w:val="left"/>
-            </w:pPr>
-            <w:r>
-              <w:t xml:space="preserve">(0.002)</w:t>
-            </w:r>
-          </w:p>
-        </w:tc>
-        <w:tc>
-          <w:tcPr/>
-          <w:p>
-            <w:pPr>
-              <w:pStyle w:val="Compact"/>
-              <w:jc w:val="left"/>
-            </w:pPr>
-            <w:r>
-              <w:t xml:space="preserve">(0.004)</w:t>
-            </w:r>
-          </w:p>
-        </w:tc>
-        <w:tc>
-          <w:tcPr/>
-          <w:p>
-            <w:pPr>
-              <w:pStyle w:val="Compact"/>
-            </w:pPr>
-          </w:p>
-        </w:tc>
-        <w:tc>
-          <w:tcPr/>
-          <w:p>
-            <w:pPr>
-              <w:pStyle w:val="Compact"/>
-            </w:pPr>
-          </w:p>
-        </w:tc>
-      </w:tr>
-      <w:tr>
-        <w:tc>
-          <w:tcPr/>
-          <w:p>
-            <w:pPr>
-              <w:pStyle w:val="Compact"/>
-              <w:jc w:val="left"/>
-            </w:pPr>
-            <w:r>
-              <w:t xml:space="preserve">Events before 2010</w:t>
-            </w:r>
-          </w:p>
-        </w:tc>
-        <w:tc>
-          <w:tcPr/>
-          <w:p>
-            <w:pPr>
-              <w:pStyle w:val="Compact"/>
-              <w:jc w:val="left"/>
-            </w:pPr>
-            <w:r>
-              <w:t xml:space="preserve">-0.002</w:t>
-            </w:r>
-          </w:p>
-        </w:tc>
-        <w:tc>
-          <w:tcPr/>
-          <w:p>
-            <w:pPr>
-              <w:pStyle w:val="Compact"/>
-              <w:jc w:val="left"/>
-            </w:pPr>
-            <w:r>
-              <w:t xml:space="preserve">0.007</w:t>
-            </w:r>
-          </w:p>
-        </w:tc>
-        <w:tc>
-          <w:tcPr/>
-          <w:p>
-            <w:pPr>
-              <w:pStyle w:val="Compact"/>
-              <w:jc w:val="left"/>
-            </w:pPr>
-            <w:r>
-              <w:t xml:space="preserve">-0.010</w:t>
-            </w:r>
-          </w:p>
-        </w:tc>
-        <w:tc>
-          <w:tcPr/>
-          <w:p>
-            <w:pPr>
-              <w:pStyle w:val="Compact"/>
-              <w:jc w:val="left"/>
-            </w:pPr>
-            <w:r>
-              <w:t xml:space="preserve">-0.004</w:t>
-            </w:r>
-          </w:p>
-        </w:tc>
-        <w:tc>
-          <w:tcPr/>
-          <w:p>
-            <w:pPr>
-              <w:pStyle w:val="Compact"/>
-              <w:jc w:val="left"/>
-            </w:pPr>
-            <w:r>
-              <w:t xml:space="preserve">0.000</w:t>
-            </w:r>
-          </w:p>
-        </w:tc>
-        <w:tc>
-          <w:tcPr/>
-          <w:p>
-            <w:pPr>
-              <w:pStyle w:val="Compact"/>
-              <w:jc w:val="left"/>
-            </w:pPr>
-            <w:r>
-              <w:t xml:space="preserve">-0.006</w:t>
-            </w:r>
-          </w:p>
-        </w:tc>
-        <w:tc>
-          <w:tcPr/>
-          <w:p>
-            <w:pPr>
-              <w:pStyle w:val="Compact"/>
-              <w:jc w:val="left"/>
-            </w:pPr>
-            <w:r>
-              <w:t xml:space="preserve">61</w:t>
-            </w:r>
-          </w:p>
-        </w:tc>
-        <w:tc>
-          <w:tcPr/>
-          <w:p>
-            <w:pPr>
-              <w:pStyle w:val="Compact"/>
-            </w:pPr>
-          </w:p>
-        </w:tc>
-      </w:tr>
-      <w:tr>
-        <w:tc>
-          <w:tcPr/>
-          <w:p>
-            <w:pPr>
-              <w:pStyle w:val="Compact"/>
-            </w:pPr>
-          </w:p>
-        </w:tc>
-        <w:tc>
-          <w:tcPr/>
-          <w:p>
-            <w:pPr>
-              <w:pStyle w:val="Compact"/>
-              <w:jc w:val="left"/>
-            </w:pPr>
-            <w:r>
-              <w:t xml:space="preserve">(0.005)</w:t>
-            </w:r>
-          </w:p>
-        </w:tc>
-        <w:tc>
-          <w:tcPr/>
-          <w:p>
-            <w:pPr>
-              <w:pStyle w:val="Compact"/>
-              <w:jc w:val="left"/>
-            </w:pPr>
-            <w:r>
-              <w:t xml:space="preserve">(0.007)</w:t>
-            </w:r>
-          </w:p>
-        </w:tc>
-        <w:tc>
-          <w:tcPr/>
-          <w:p>
-            <w:pPr>
-              <w:pStyle w:val="Compact"/>
-              <w:jc w:val="left"/>
-            </w:pPr>
-            <w:r>
-              <w:t xml:space="preserve">(0.007)</w:t>
-            </w:r>
-          </w:p>
-        </w:tc>
-        <w:tc>
-          <w:tcPr/>
-          <w:p>
-            <w:pPr>
-              <w:pStyle w:val="Compact"/>
-              <w:jc w:val="left"/>
-            </w:pPr>
-            <w:r>
-              <w:t xml:space="preserve">(0.010)</w:t>
-            </w:r>
-          </w:p>
-        </w:tc>
-        <w:tc>
-          <w:tcPr/>
-          <w:p>
-            <w:pPr>
-              <w:pStyle w:val="Compact"/>
-              <w:jc w:val="left"/>
-            </w:pPr>
-            <w:r>
-              <w:t xml:space="preserve">(0.003)</w:t>
-            </w:r>
-          </w:p>
-        </w:tc>
-        <w:tc>
-          <w:tcPr/>
-          <w:p>
-            <w:pPr>
-              <w:pStyle w:val="Compact"/>
-              <w:jc w:val="left"/>
-            </w:pPr>
-            <w:r>
-              <w:t xml:space="preserve">(0.006)</w:t>
-            </w:r>
           </w:p>
         </w:tc>
         <w:tc>
@@ -20466,7 +19965,7 @@
         <w:pStyle w:val="BodyText"/>
       </w:pPr>
       <w:r>
-        <w:t xml:space="preserve">The estimates also rule the minimum wage out as the cause of the decline in teen employment on two counts of timing and one of magnitude. Most of the decline happened between 2000 and 2010 (Figure 1), before the large state and local schedules that give the minimum wage its modern bite; the events of 1994–2009 were smaller, and the estimates for them (Section 6) are zero on employment at 18–19 and</w:t>
+        <w:t xml:space="preserve">The estimates also rule the minimum wage out as the cause of the decline in teen employment on two counts of timing and one of magnitude. Most of the decline happened before the period studied here, between 2000 and 2010 in the published CPS series, before the large state and local schedules that give the minimum wage its modern bite; within the window, the fall from 36 percent in 2007 to 27 percent in 2010 precedes all but four of the 73 events. The period of the largest increases, 2014–2025, is one in which teen employment rose, from 27 percent in 2010 to 33 percent in 2022. The main estimates imply no contribution at all, and even the most negative cell in Table 13,</w:t>
       </w:r>
       <w:r>
         <w:t xml:space="preserve"> </w:t>
@@ -20479,14 +19978,14 @@
           <m:t>−</m:t>
         </m:r>
         <m:r>
-          <m:t>1.0</m:t>
+          <m:t>4.7</m:t>
         </m:r>
       </m:oMath>
       <w:r>
         <w:t xml:space="preserve"> </w:t>
       </w:r>
       <w:r>
-        <w:t xml:space="preserve">points (s.e. 0.7) at 16–17. The period of the largest increases, 2014–2025, is one in which teen employment rose, from 28 to 33 percent. And even taking the most negative employment estimate in the appendix at face value and applying it to every teen exposed to an event, the minimum wage would account for about one point of an eighteen-point decline. The decline itself then needs another explanation, and the candidates in Neumark and Shupe (2019) and Smith (2011); Smith (2012) remain: the rising return to schooling and the intensification of college preparation, competition from adult and immigrant workers in the retail and food service jobs that teens held, and the two recessions of the period. This paper’s contribution is to remove one from the list.</w:t>
+        <w:t xml:space="preserve">points (s.e. 5.1) for 18–19 year olds in the 16 local-only county events, applied to every teen in the country, would account for a quarter of the eighteen-point fall, most of which happened before the increases. The decline itself then needs another explanation, and the candidates in Neumark and Shupe (2019) and Smith (2011); Smith (2012) remain: the rising return to schooling and the intensification of college preparation, competition from adult and immigrant workers in the retail and food service jobs that teens held, and the two recessions of the period. This paper’s contribution is to remove one from the list.</w:t>
       </w:r>
     </w:p>
     <w:p>
@@ -48884,7 +48383,7 @@
         <w:t xml:space="preserve"> </w:t>
       </w:r>
       <w:r>
-        <w:t xml:space="preserve">1994–2026;</w:t>
+        <w:t xml:space="preserve">2007–2026;</w:t>
       </w:r>
       <w:r>
         <w:t xml:space="preserve"> </w:t>

</xml_diff>

<commit_message>
minwage: stacked-DiD tables with individual controls (age, sex, race/ethnicity, family income) replace the cell-mean versions; text updated
Co-Authored-By: Claude Fable 5.1 <noreply@anthropic.com>
Claude-Session: https://claude.ai/code/session_01Rd74HvTpozFfpcfGubVirr
</commit_message>
<xml_diff>
--- a/minwage/paper/minwage_teens.docx
+++ b/minwage/paper/minwage_teens.docx
@@ -5415,20 +5415,13 @@
         <m:oMath>
           <m:sSub>
             <m:e>
-              <m:acc>
-                <m:accPr>
-                  <m:chr m:val="‾"/>
-                </m:accPr>
-                <m:e>
-                  <m:r>
-                    <m:t>y</m:t>
-                  </m:r>
-                </m:e>
-              </m:acc>
+              <m:r>
+                <m:t>y</m:t>
+              </m:r>
             </m:e>
             <m:sub>
               <m:r>
-                <m:t>e</m:t>
+                <m:t>i</m:t>
               </m:r>
               <m:r>
                 <m:rPr>
@@ -5437,7 +5430,7 @@
                 <m:t>,</m:t>
               </m:r>
               <m:r>
-                <m:t>u</m:t>
+                <m:t>e</m:t>
               </m:r>
               <m:r>
                 <m:rPr>
@@ -5568,8 +5561,48 @@
               <m:r>
                 <m:t>u</m:t>
               </m:r>
+              <m:d>
+                <m:dPr>
+                  <m:begChr m:val="("/>
+                  <m:endChr m:val=")"/>
+                  <m:sepChr m:val=""/>
+                  <m:grow/>
+                </m:dPr>
+                <m:e>
+                  <m:r>
+                    <m:t>i</m:t>
+                  </m:r>
+                </m:e>
+              </m:d>
             </m:sub>
           </m:sSub>
+          <m:r>
+            <m:rPr>
+              <m:sty m:val="p"/>
+            </m:rPr>
+            <m:t>+</m:t>
+          </m:r>
+          <m:sSub>
+            <m:e>
+              <m:r>
+                <m:t>X</m:t>
+              </m:r>
+            </m:e>
+            <m:sub>
+              <m:r>
+                <m:t>i</m:t>
+              </m:r>
+            </m:sub>
+          </m:sSub>
+          <m:r>
+            <m:rPr>
+              <m:sty m:val="p"/>
+            </m:rPr>
+            <m:t>′</m:t>
+          </m:r>
+          <m:r>
+            <m:t>γ</m:t>
+          </m:r>
           <m:r>
             <m:rPr>
               <m:sty m:val="p"/>
@@ -5595,6 +5628,19 @@
               <m:r>
                 <m:t>u</m:t>
               </m:r>
+              <m:d>
+                <m:dPr>
+                  <m:begChr m:val="("/>
+                  <m:endChr m:val=")"/>
+                  <m:sepChr m:val=""/>
+                  <m:grow/>
+                </m:dPr>
+                <m:e>
+                  <m:r>
+                    <m:t>i</m:t>
+                  </m:r>
+                </m:e>
+              </m:d>
             </m:sub>
           </m:sSub>
           <m:r>
@@ -5638,7 +5684,7 @@
             </m:e>
             <m:sub>
               <m:r>
-                <m:t>e</m:t>
+                <m:t>i</m:t>
               </m:r>
               <m:r>
                 <m:rPr>
@@ -5647,7 +5693,7 @@
                 <m:t>,</m:t>
               </m:r>
               <m:r>
-                <m:t>u</m:t>
+                <m:t>e</m:t>
               </m:r>
               <m:r>
                 <m:rPr>
@@ -5674,7 +5720,7 @@
         <w:pStyle w:val="FirstParagraph"/>
       </w:pPr>
       <w:r>
-        <w:t xml:space="preserve">estimated on unit-month cell means stacked over the 73 events, each event contributing its treated unit and its clean controls over the 84 months from</w:t>
+        <w:t xml:space="preserve">estimated on every teen observation in the 84 months from</w:t>
       </w:r>
       <w:r>
         <w:t xml:space="preserve"> </w:t>
@@ -5711,7 +5757,10 @@
         </m:r>
       </m:oMath>
       <w:r>
-        <w:t xml:space="preserve">, with event-by-unit and event-by-month fixed effects, cells weighted by their population, and standard errors clustered by state.</w:t>
+        <w:t xml:space="preserve"> </w:t>
+      </w:r>
+      <w:r>
+        <w:t xml:space="preserve">around each of the 73 events, the treated unit and its clean controls, with event-by-unit and event-by-month fixed effects, dummies for single year of age, sex, race and Hispanic origin (non-Hispanic white, Black, Hispanic, other) and the CPS family income category, survey weights, and standard errors clustered by state. The stacked file has 6.8 million observations at 16–17, 6.3 million at 18–19 and 13.1 million pooled, built from 620,000, 554,000 and 1.17 million teen-months, each control unit’s teens entering the blocks of every event for which the unit is a clean control.</w:t>
       </w:r>
       <w:r>
         <w:t xml:space="preserve"> </w:t>
@@ -5802,7 +5851,7 @@
         <w:t xml:space="preserve"> </w:t>
       </w:r>
       <w:r>
-        <w:t xml:space="preserve">as the base, and in weighting by cell population within the regression rather than by treated population across events, so the two need not coincide exactly. Appendix C reports the two-way fixed effects regression of the outcome on the log minimum wage, the specification of Neumark and Shupe (2019) and Smith (2021), and shows where it agrees with the event design and where it does not.</w:t>
+        <w:t xml:space="preserve">as the base, in weighting observations rather than events, and in the individual controls, so the two need not coincide exactly. Without the controls the regression is numerically the regression on unit-month cell means, and the controls move no school–work coefficient by more than a quarter of a point and no wage or earnings coefficient by more than about a point. Appendix C reports the two-way fixed effects regression of the outcome on the log minimum wage, the specification of Neumark and Shupe (2019) and Smith (2021), and shows where it agrees with the event design and where it does not.</w:t>
       </w:r>
     </w:p>
     <w:bookmarkEnd w:id="33"/>
@@ -6131,7 +6180,7 @@
           <m:t>−</m:t>
         </m:r>
         <m:r>
-          <m:t>0.0</m:t>
+          <m:t>0.1</m:t>
         </m:r>
       </m:oMath>
       <w:r>
@@ -6151,7 +6200,7 @@
           <m:t>−</m:t>
         </m:r>
         <m:r>
-          <m:t>0.6</m:t>
+          <m:t>0.7</m:t>
         </m:r>
       </m:oMath>
       <w:r>
@@ -6211,7 +6260,7 @@
           <m:t>−</m:t>
         </m:r>
         <m:r>
-          <m:t>0.2</m:t>
+          <m:t>0.1</m:t>
         </m:r>
       </m:oMath>
       <w:r>
@@ -6429,31 +6478,31 @@
               <w:jc w:val="left"/>
             </w:pPr>
             <w:r>
-              <w:t xml:space="preserve">-0.000</w:t>
-            </w:r>
-          </w:p>
-        </w:tc>
-        <w:tc>
-          <w:tcPr/>
-          <w:p>
-            <w:pPr>
-              <w:pStyle w:val="Compact"/>
-              <w:jc w:val="left"/>
-            </w:pPr>
-            <w:r>
-              <w:t xml:space="preserve">-0.006</w:t>
-            </w:r>
-          </w:p>
-        </w:tc>
-        <w:tc>
-          <w:tcPr/>
-          <w:p>
-            <w:pPr>
-              <w:pStyle w:val="Compact"/>
-              <w:jc w:val="left"/>
-            </w:pPr>
-            <w:r>
-              <w:t xml:space="preserve">-0.003</w:t>
+              <w:t xml:space="preserve">-0.001</w:t>
+            </w:r>
+          </w:p>
+        </w:tc>
+        <w:tc>
+          <w:tcPr/>
+          <w:p>
+            <w:pPr>
+              <w:pStyle w:val="Compact"/>
+              <w:jc w:val="left"/>
+            </w:pPr>
+            <w:r>
+              <w:t xml:space="preserve">-0.007</w:t>
+            </w:r>
+          </w:p>
+        </w:tc>
+        <w:tc>
+          <w:tcPr/>
+          <w:p>
+            <w:pPr>
+              <w:pStyle w:val="Compact"/>
+              <w:jc w:val="left"/>
+            </w:pPr>
+            <w:r>
+              <w:t xml:space="preserve">-0.004</w:t>
             </w:r>
           </w:p>
         </w:tc>
@@ -6621,7 +6670,7 @@
               <w:jc w:val="left"/>
             </w:pPr>
             <w:r>
-              <w:t xml:space="preserve">-0.002</w:t>
+              <w:t xml:space="preserve">-0.001</w:t>
             </w:r>
           </w:p>
         </w:tc>
@@ -6691,7 +6740,7 @@
               <w:jc w:val="left"/>
             </w:pPr>
             <w:r>
-              <w:t xml:space="preserve">(0.003)</w:t>
+              <w:t xml:space="preserve">(0.002)</w:t>
             </w:r>
           </w:p>
         </w:tc>
@@ -6717,7 +6766,7 @@
               <w:jc w:val="left"/>
             </w:pPr>
             <w:r>
-              <w:t xml:space="preserve">-0.001</w:t>
+              <w:t xml:space="preserve">-0.002</w:t>
             </w:r>
           </w:p>
         </w:tc>
@@ -6775,7 +6824,7 @@
               <w:jc w:val="left"/>
             </w:pPr>
             <w:r>
-              <w:t xml:space="preserve">(0.008)</w:t>
+              <w:t xml:space="preserve">(0.007)</w:t>
             </w:r>
           </w:p>
         </w:tc>
@@ -6911,7 +6960,7 @@
         <w:t xml:space="preserve"> </w:t>
       </w:r>
       <w:r>
-        <w:t xml:space="preserve">treated in regression (6): unit-month cells stacked over the 73 events with their clean controls, 36 months before to 47 months after the increase, event-by-unit and event-by-month fixed effects, population weights. Standard errors clustered by state in parentheses.</w:t>
+        <w:t xml:space="preserve">treated in regression (6): teen observations stacked over the 73 events with their clean controls, 36 months before to 47 months after the increase, event-by-unit and event-by-month fixed effects, dummies for age, sex, race and Hispanic origin and family income category, survey weights. Standard errors clustered by state in parentheses.</w:t>
       </w:r>
       <w:r>
         <w:t xml:space="preserve"> </w:t>
@@ -7433,7 +7482,7 @@
         <w:pStyle w:val="BodyText"/>
       </w:pPr>
       <w:r>
-        <w:t xml:space="preserve">The stacked coefficients in Table 3 repeat the pattern within each income group. No coefficient is significant at the 5 percent level; the largest is employed-only among high-income 16–17 year olds,</w:t>
+        <w:t xml:space="preserve">The stacked coefficients in Table 3 repeat the pattern within each income group. The only coefficient beyond two standard errors is employed-only among high-income 16–17 year olds,</w:t>
       </w:r>
       <w:r>
         <w:t xml:space="preserve"> </w:t>
@@ -7453,7 +7502,7 @@
         <w:t xml:space="preserve"> </w:t>
       </w:r>
       <w:r>
-        <w:t xml:space="preserve">points (s.e. 0.3), and the neither share changes by</w:t>
+        <w:t xml:space="preserve">points (s.e. 0.2), a rise; the neither share changes by</w:t>
       </w:r>
       <w:r>
         <w:t xml:space="preserve"> </w:t>
@@ -7486,7 +7535,7 @@
           <m:t>−</m:t>
         </m:r>
         <m:r>
-          <m:t>0.2</m:t>
+          <m:t>0.1</m:t>
         </m:r>
       </m:oMath>
       <w:r>
@@ -7676,6 +7725,30 @@
               <w:jc w:val="left"/>
             </w:pPr>
             <w:r>
+              <w:t xml:space="preserve">-0.000</w:t>
+            </w:r>
+          </w:p>
+        </w:tc>
+        <w:tc>
+          <w:tcPr/>
+          <w:p>
+            <w:pPr>
+              <w:pStyle w:val="Compact"/>
+              <w:jc w:val="left"/>
+            </w:pPr>
+            <w:r>
+              <w:t xml:space="preserve">-0.000</w:t>
+            </w:r>
+          </w:p>
+        </w:tc>
+        <w:tc>
+          <w:tcPr/>
+          <w:p>
+            <w:pPr>
+              <w:pStyle w:val="Compact"/>
+              <w:jc w:val="left"/>
+            </w:pPr>
+            <w:r>
               <w:t xml:space="preserve">-0.001</w:t>
             </w:r>
           </w:p>
@@ -7688,6 +7761,18 @@
               <w:jc w:val="left"/>
             </w:pPr>
             <w:r>
+              <w:t xml:space="preserve">0.008</w:t>
+            </w:r>
+          </w:p>
+        </w:tc>
+        <w:tc>
+          <w:tcPr/>
+          <w:p>
+            <w:pPr>
+              <w:pStyle w:val="Compact"/>
+              <w:jc w:val="left"/>
+            </w:pPr>
+            <w:r>
               <w:t xml:space="preserve">-0.000</w:t>
             </w:r>
           </w:p>
@@ -7700,43 +7785,7 @@
               <w:jc w:val="left"/>
             </w:pPr>
             <w:r>
-              <w:t xml:space="preserve">0.001</w:t>
-            </w:r>
-          </w:p>
-        </w:tc>
-        <w:tc>
-          <w:tcPr/>
-          <w:p>
-            <w:pPr>
-              <w:pStyle w:val="Compact"/>
-              <w:jc w:val="left"/>
-            </w:pPr>
-            <w:r>
-              <w:t xml:space="preserve">0.006</w:t>
-            </w:r>
-          </w:p>
-        </w:tc>
-        <w:tc>
-          <w:tcPr/>
-          <w:p>
-            <w:pPr>
-              <w:pStyle w:val="Compact"/>
-              <w:jc w:val="left"/>
-            </w:pPr>
-            <w:r>
-              <w:t xml:space="preserve">0.000</w:t>
-            </w:r>
-          </w:p>
-        </w:tc>
-        <w:tc>
-          <w:tcPr/>
-          <w:p>
-            <w:pPr>
-              <w:pStyle w:val="Compact"/>
-              <w:jc w:val="left"/>
-            </w:pPr>
-            <w:r>
-              <w:t xml:space="preserve">0.003</w:t>
+              <w:t xml:space="preserve">0.004</w:t>
             </w:r>
           </w:p>
         </w:tc>
@@ -7794,7 +7843,7 @@
               <w:jc w:val="left"/>
             </w:pPr>
             <w:r>
-              <w:t xml:space="preserve">(0.008)</w:t>
+              <w:t xml:space="preserve">(0.007)</w:t>
             </w:r>
           </w:p>
         </w:tc>
@@ -7844,30 +7893,6 @@
               <w:jc w:val="left"/>
             </w:pPr>
             <w:r>
-              <w:t xml:space="preserve">0.004</w:t>
-            </w:r>
-          </w:p>
-        </w:tc>
-        <w:tc>
-          <w:tcPr/>
-          <w:p>
-            <w:pPr>
-              <w:pStyle w:val="Compact"/>
-              <w:jc w:val="left"/>
-            </w:pPr>
-            <w:r>
-              <w:t xml:space="preserve">-0.002</w:t>
-            </w:r>
-          </w:p>
-        </w:tc>
-        <w:tc>
-          <w:tcPr/>
-          <w:p>
-            <w:pPr>
-              <w:pStyle w:val="Compact"/>
-              <w:jc w:val="left"/>
-            </w:pPr>
-            <w:r>
               <w:t xml:space="preserve">0.003</w:t>
             </w:r>
           </w:p>
@@ -7880,7 +7905,7 @@
               <w:jc w:val="left"/>
             </w:pPr>
             <w:r>
-              <w:t xml:space="preserve">-0.010</w:t>
+              <w:t xml:space="preserve">-0.003</w:t>
             </w:r>
           </w:p>
         </w:tc>
@@ -7904,7 +7929,31 @@
               <w:jc w:val="left"/>
             </w:pPr>
             <w:r>
-              <w:t xml:space="preserve">-0.006</w:t>
+              <w:t xml:space="preserve">-0.009</w:t>
+            </w:r>
+          </w:p>
+        </w:tc>
+        <w:tc>
+          <w:tcPr/>
+          <w:p>
+            <w:pPr>
+              <w:pStyle w:val="Compact"/>
+              <w:jc w:val="left"/>
+            </w:pPr>
+            <w:r>
+              <w:t xml:space="preserve">0.003</w:t>
+            </w:r>
+          </w:p>
+        </w:tc>
+        <w:tc>
+          <w:tcPr/>
+          <w:p>
+            <w:pPr>
+              <w:pStyle w:val="Compact"/>
+              <w:jc w:val="left"/>
+            </w:pPr>
+            <w:r>
+              <w:t xml:space="preserve">-0.007</w:t>
             </w:r>
           </w:p>
         </w:tc>
@@ -7926,6 +7975,42 @@
               <w:jc w:val="left"/>
             </w:pPr>
             <w:r>
+              <w:t xml:space="preserve">(0.007)</w:t>
+            </w:r>
+          </w:p>
+        </w:tc>
+        <w:tc>
+          <w:tcPr/>
+          <w:p>
+            <w:pPr>
+              <w:pStyle w:val="Compact"/>
+              <w:jc w:val="left"/>
+            </w:pPr>
+            <w:r>
+              <w:t xml:space="preserve">(0.004)</w:t>
+            </w:r>
+          </w:p>
+        </w:tc>
+        <w:tc>
+          <w:tcPr/>
+          <w:p>
+            <w:pPr>
+              <w:pStyle w:val="Compact"/>
+              <w:jc w:val="left"/>
+            </w:pPr>
+            <w:r>
+              <w:t xml:space="preserve">(0.009)</w:t>
+            </w:r>
+          </w:p>
+        </w:tc>
+        <w:tc>
+          <w:tcPr/>
+          <w:p>
+            <w:pPr>
+              <w:pStyle w:val="Compact"/>
+              <w:jc w:val="left"/>
+            </w:pPr>
+            <w:r>
               <w:t xml:space="preserve">(0.006)</w:t>
             </w:r>
           </w:p>
@@ -7938,43 +8023,7 @@
               <w:jc w:val="left"/>
             </w:pPr>
             <w:r>
-              <w:t xml:space="preserve">(0.005)</w:t>
-            </w:r>
-          </w:p>
-        </w:tc>
-        <w:tc>
-          <w:tcPr/>
-          <w:p>
-            <w:pPr>
-              <w:pStyle w:val="Compact"/>
-              <w:jc w:val="left"/>
-            </w:pPr>
-            <w:r>
-              <w:t xml:space="preserve">(0.009)</w:t>
-            </w:r>
-          </w:p>
-        </w:tc>
-        <w:tc>
-          <w:tcPr/>
-          <w:p>
-            <w:pPr>
-              <w:pStyle w:val="Compact"/>
-              <w:jc w:val="left"/>
-            </w:pPr>
-            <w:r>
               <w:t xml:space="preserve">(0.007)</w:t>
-            </w:r>
-          </w:p>
-        </w:tc>
-        <w:tc>
-          <w:tcPr/>
-          <w:p>
-            <w:pPr>
-              <w:pStyle w:val="Compact"/>
-              <w:jc w:val="left"/>
-            </w:pPr>
-            <w:r>
-              <w:t xml:space="preserve">(0.006)</w:t>
             </w:r>
           </w:p>
         </w:tc>
@@ -8024,13 +8073,37 @@
               <w:jc w:val="left"/>
             </w:pPr>
             <w:r>
-              <w:t xml:space="preserve">0.004</w:t>
+              <w:t xml:space="preserve">0.005</w:t>
             </w:r>
             <w:r>
               <w:rPr>
                 <w:vertAlign w:val="superscript"/>
               </w:rPr>
-              <w:t xml:space="preserve">*</w:t>
+              <w:t xml:space="preserve">**</w:t>
+            </w:r>
+          </w:p>
+        </w:tc>
+        <w:tc>
+          <w:tcPr/>
+          <w:p>
+            <w:pPr>
+              <w:pStyle w:val="Compact"/>
+              <w:jc w:val="left"/>
+            </w:pPr>
+            <w:r>
+              <w:t xml:space="preserve">0.002</w:t>
+            </w:r>
+          </w:p>
+        </w:tc>
+        <w:tc>
+          <w:tcPr/>
+          <w:p>
+            <w:pPr>
+              <w:pStyle w:val="Compact"/>
+              <w:jc w:val="left"/>
+            </w:pPr>
+            <w:r>
+              <w:t xml:space="preserve">0.005</w:t>
             </w:r>
           </w:p>
         </w:tc>
@@ -8054,31 +8127,7 @@
               <w:jc w:val="left"/>
             </w:pPr>
             <w:r>
-              <w:t xml:space="preserve">0.007</w:t>
-            </w:r>
-          </w:p>
-        </w:tc>
-        <w:tc>
-          <w:tcPr/>
-          <w:p>
-            <w:pPr>
-              <w:pStyle w:val="Compact"/>
-              <w:jc w:val="left"/>
-            </w:pPr>
-            <w:r>
-              <w:t xml:space="preserve">0.001</w:t>
-            </w:r>
-          </w:p>
-        </w:tc>
-        <w:tc>
-          <w:tcPr/>
-          <w:p>
-            <w:pPr>
-              <w:pStyle w:val="Compact"/>
-              <w:jc w:val="left"/>
-            </w:pPr>
-            <w:r>
-              <w:t xml:space="preserve">0.006</w:t>
+              <w:t xml:space="preserve">0.005</w:t>
             </w:r>
           </w:p>
         </w:tc>
@@ -8112,7 +8161,7 @@
               <w:jc w:val="left"/>
             </w:pPr>
             <w:r>
-              <w:t xml:space="preserve">(0.003)</w:t>
+              <w:t xml:space="preserve">(0.002)</w:t>
             </w:r>
           </w:p>
         </w:tc>
@@ -8198,7 +8247,7 @@
               <w:jc w:val="left"/>
             </w:pPr>
             <w:r>
-              <w:t xml:space="preserve">-0.002</w:t>
+              <w:t xml:space="preserve">-0.001</w:t>
             </w:r>
           </w:p>
         </w:tc>
@@ -8234,7 +8283,7 @@
               <w:jc w:val="left"/>
             </w:pPr>
             <w:r>
-              <w:t xml:space="preserve">-0.005</w:t>
+              <w:t xml:space="preserve">-0.004</w:t>
             </w:r>
           </w:p>
         </w:tc>
@@ -8772,7 +8821,7 @@
           <m:t>−</m:t>
         </m:r>
         <m:r>
-          <m:t>1.3</m:t>
+          <m:t>1.2</m:t>
         </m:r>
       </m:oMath>
       <w:r>
@@ -8792,7 +8841,7 @@
           <m:t>+</m:t>
         </m:r>
         <m:r>
-          <m:t>1.1</m:t>
+          <m:t>1.0</m:t>
         </m:r>
       </m:oMath>
       <w:r>
@@ -8812,7 +8861,7 @@
           <m:t>+</m:t>
         </m:r>
         <m:r>
-          <m:t>1.1</m:t>
+          <m:t>1.0</m:t>
         </m:r>
       </m:oMath>
       <w:r>
@@ -8820,6 +8869,200 @@
       </w:r>
       <w:r>
         <w:t xml:space="preserve">(0.6) and</w:t>
+      </w:r>
+      <w:r>
+        <w:t xml:space="preserve"> </w:t>
+      </w:r>
+      <m:oMath>
+        <m:r>
+          <m:rPr>
+            <m:sty m:val="p"/>
+          </m:rPr>
+          <m:t>−</m:t>
+        </m:r>
+        <m:r>
+          <m:t>1.2</m:t>
+        </m:r>
+      </m:oMath>
+      <w:r>
+        <w:t xml:space="preserve"> </w:t>
+      </w:r>
+      <w:r>
+        <w:t xml:space="preserve">(0.6). At 18–19 girls’ four shares change by</w:t>
+      </w:r>
+      <w:r>
+        <w:t xml:space="preserve"> </w:t>
+      </w:r>
+      <m:oMath>
+        <m:r>
+          <m:rPr>
+            <m:sty m:val="p"/>
+          </m:rPr>
+          <m:t>−</m:t>
+        </m:r>
+        <m:r>
+          <m:t>0.2</m:t>
+        </m:r>
+      </m:oMath>
+      <w:r>
+        <w:t xml:space="preserve"> </w:t>
+      </w:r>
+      <w:r>
+        <w:t xml:space="preserve">(0.6),</w:t>
+      </w:r>
+      <w:r>
+        <w:t xml:space="preserve"> </w:t>
+      </w:r>
+      <m:oMath>
+        <m:r>
+          <m:rPr>
+            <m:sty m:val="p"/>
+          </m:rPr>
+          <m:t>−</m:t>
+        </m:r>
+        <m:r>
+          <m:t>0.4</m:t>
+        </m:r>
+      </m:oMath>
+      <w:r>
+        <w:t xml:space="preserve"> </w:t>
+      </w:r>
+      <w:r>
+        <w:t xml:space="preserve">(0.8),</w:t>
+      </w:r>
+      <w:r>
+        <w:t xml:space="preserve"> </w:t>
+      </w:r>
+      <m:oMath>
+        <m:r>
+          <m:rPr>
+            <m:sty m:val="p"/>
+          </m:rPr>
+          <m:t>+</m:t>
+        </m:r>
+        <m:r>
+          <m:t>0.7</m:t>
+        </m:r>
+      </m:oMath>
+      <w:r>
+        <w:t xml:space="preserve"> </w:t>
+      </w:r>
+      <w:r>
+        <w:t xml:space="preserve">(0.7) and</w:t>
+      </w:r>
+      <w:r>
+        <w:t xml:space="preserve"> </w:t>
+      </w:r>
+      <m:oMath>
+        <m:r>
+          <m:rPr>
+            <m:sty m:val="p"/>
+          </m:rPr>
+          <m:t>−</m:t>
+        </m:r>
+        <m:r>
+          <m:t>0.1</m:t>
+        </m:r>
+      </m:oMath>
+      <w:r>
+        <w:t xml:space="preserve"> </w:t>
+      </w:r>
+      <w:r>
+        <w:t xml:space="preserve">(0.5), and boys’ by</w:t>
+      </w:r>
+      <w:r>
+        <w:t xml:space="preserve"> </w:t>
+      </w:r>
+      <m:oMath>
+        <m:r>
+          <m:rPr>
+            <m:sty m:val="p"/>
+          </m:rPr>
+          <m:t>+</m:t>
+        </m:r>
+        <m:r>
+          <m:t>1.0</m:t>
+        </m:r>
+      </m:oMath>
+      <w:r>
+        <w:t xml:space="preserve"> </w:t>
+      </w:r>
+      <w:r>
+        <w:t xml:space="preserve">(0.6),</w:t>
+      </w:r>
+      <w:r>
+        <w:t xml:space="preserve"> </w:t>
+      </w:r>
+      <m:oMath>
+        <m:r>
+          <m:rPr>
+            <m:sty m:val="p"/>
+          </m:rPr>
+          <m:t>−</m:t>
+        </m:r>
+        <m:r>
+          <m:t>0.9</m:t>
+        </m:r>
+      </m:oMath>
+      <w:r>
+        <w:t xml:space="preserve"> </w:t>
+      </w:r>
+      <w:r>
+        <w:t xml:space="preserve">(0.7),</w:t>
+      </w:r>
+      <w:r>
+        <w:t xml:space="preserve"> </w:t>
+      </w:r>
+      <m:oMath>
+        <m:r>
+          <m:rPr>
+            <m:sty m:val="p"/>
+          </m:rPr>
+          <m:t>+</m:t>
+        </m:r>
+        <m:r>
+          <m:t>0.3</m:t>
+        </m:r>
+      </m:oMath>
+      <w:r>
+        <w:t xml:space="preserve"> </w:t>
+      </w:r>
+      <w:r>
+        <w:t xml:space="preserve">(0.7) and</w:t>
+      </w:r>
+      <w:r>
+        <w:t xml:space="preserve"> </w:t>
+      </w:r>
+      <m:oMath>
+        <m:r>
+          <m:rPr>
+            <m:sty m:val="p"/>
+          </m:rPr>
+          <m:t>−</m:t>
+        </m:r>
+        <m:r>
+          <m:t>0.4</m:t>
+        </m:r>
+      </m:oMath>
+      <w:r>
+        <w:t xml:space="preserve"> </w:t>
+      </w:r>
+      <w:r>
+        <w:t xml:space="preserve">(0.5). Pooling the ages, boys shift about a point from enrolled-only to enrolled-and-employed (</w:t>
+      </w:r>
+      <m:oMath>
+        <m:r>
+          <m:rPr>
+            <m:sty m:val="p"/>
+          </m:rPr>
+          <m:t>+</m:t>
+        </m:r>
+        <m:r>
+          <m:t>1.0</m:t>
+        </m:r>
+      </m:oMath>
+      <w:r>
+        <w:t xml:space="preserve">, s.e. 0.5, and</w:t>
       </w:r>
       <w:r>
         <w:t xml:space="preserve"> </w:t>
@@ -8836,13 +9079,7 @@
         </m:r>
       </m:oMath>
       <w:r>
-        <w:t xml:space="preserve"> </w:t>
-      </w:r>
-      <w:r>
-        <w:t xml:space="preserve">(0.6). At 18–19 girls’ four shares change by</w:t>
-      </w:r>
-      <w:r>
-        <w:t xml:space="preserve"> </w:t>
+        <w:t xml:space="preserve">, 0.5) and girls about half a point the other way (</w:t>
       </w:r>
       <m:oMath>
         <m:r>
@@ -8852,195 +9089,7 @@
           <m:t>−</m:t>
         </m:r>
         <m:r>
-          <m:t>0.3</m:t>
-        </m:r>
-      </m:oMath>
-      <w:r>
-        <w:t xml:space="preserve"> </w:t>
-      </w:r>
-      <w:r>
-        <w:t xml:space="preserve">(0.6),</w:t>
-      </w:r>
-      <w:r>
-        <w:t xml:space="preserve"> </w:t>
-      </w:r>
-      <m:oMath>
-        <m:r>
-          <m:rPr>
-            <m:sty m:val="p"/>
-          </m:rPr>
-          <m:t>−</m:t>
-        </m:r>
-        <m:r>
-          <m:t>0.4</m:t>
-        </m:r>
-      </m:oMath>
-      <w:r>
-        <w:t xml:space="preserve"> </w:t>
-      </w:r>
-      <w:r>
-        <w:t xml:space="preserve">(0.8),</w:t>
-      </w:r>
-      <w:r>
-        <w:t xml:space="preserve"> </w:t>
-      </w:r>
-      <m:oMath>
-        <m:r>
-          <m:rPr>
-            <m:sty m:val="p"/>
-          </m:rPr>
-          <m:t>+</m:t>
-        </m:r>
-        <m:r>
-          <m:t>0.8</m:t>
-        </m:r>
-      </m:oMath>
-      <w:r>
-        <w:t xml:space="preserve"> </w:t>
-      </w:r>
-      <w:r>
-        <w:t xml:space="preserve">(0.7) and</w:t>
-      </w:r>
-      <w:r>
-        <w:t xml:space="preserve"> </w:t>
-      </w:r>
-      <m:oMath>
-        <m:r>
-          <m:rPr>
-            <m:sty m:val="p"/>
-          </m:rPr>
-          <m:t>+</m:t>
-        </m:r>
-        <m:r>
-          <m:t>0.0</m:t>
-        </m:r>
-      </m:oMath>
-      <w:r>
-        <w:t xml:space="preserve"> </w:t>
-      </w:r>
-      <w:r>
-        <w:t xml:space="preserve">(0.6), and boys’ by</w:t>
-      </w:r>
-      <w:r>
-        <w:t xml:space="preserve"> </w:t>
-      </w:r>
-      <m:oMath>
-        <m:r>
-          <m:rPr>
-            <m:sty m:val="p"/>
-          </m:rPr>
-          <m:t>+</m:t>
-        </m:r>
-        <m:r>
-          <m:t>1.1</m:t>
-        </m:r>
-      </m:oMath>
-      <w:r>
-        <w:t xml:space="preserve"> </w:t>
-      </w:r>
-      <w:r>
-        <w:t xml:space="preserve">(0.6),</w:t>
-      </w:r>
-      <w:r>
-        <w:t xml:space="preserve"> </w:t>
-      </w:r>
-      <m:oMath>
-        <m:r>
-          <m:rPr>
-            <m:sty m:val="p"/>
-          </m:rPr>
-          <m:t>−</m:t>
-        </m:r>
-        <m:r>
-          <m:t>0.8</m:t>
-        </m:r>
-      </m:oMath>
-      <w:r>
-        <w:t xml:space="preserve"> </w:t>
-      </w:r>
-      <w:r>
-        <w:t xml:space="preserve">(0.7),</w:t>
-      </w:r>
-      <w:r>
-        <w:t xml:space="preserve"> </w:t>
-      </w:r>
-      <m:oMath>
-        <m:r>
-          <m:rPr>
-            <m:sty m:val="p"/>
-          </m:rPr>
-          <m:t>+</m:t>
-        </m:r>
-        <m:r>
-          <m:t>0.2</m:t>
-        </m:r>
-      </m:oMath>
-      <w:r>
-        <w:t xml:space="preserve"> </w:t>
-      </w:r>
-      <w:r>
-        <w:t xml:space="preserve">(0.7) and</w:t>
-      </w:r>
-      <w:r>
-        <w:t xml:space="preserve"> </w:t>
-      </w:r>
-      <m:oMath>
-        <m:r>
-          <m:rPr>
-            <m:sty m:val="p"/>
-          </m:rPr>
-          <m:t>−</m:t>
-        </m:r>
-        <m:r>
-          <m:t>0.6</m:t>
-        </m:r>
-      </m:oMath>
-      <w:r>
-        <w:t xml:space="preserve"> </w:t>
-      </w:r>
-      <w:r>
-        <w:t xml:space="preserve">(0.6). Pooling the ages, boys shift about a point from enrolled-only to enrolled-and-employed (</w:t>
-      </w:r>
-      <m:oMath>
-        <m:r>
-          <m:rPr>
-            <m:sty m:val="p"/>
-          </m:rPr>
-          <m:t>+</m:t>
-        </m:r>
-        <m:r>
-          <m:t>1.1</m:t>
-        </m:r>
-      </m:oMath>
-      <w:r>
-        <w:t xml:space="preserve">, s.e. 0.5, and</w:t>
-      </w:r>
-      <w:r>
-        <w:t xml:space="preserve"> </w:t>
-      </w:r>
-      <m:oMath>
-        <m:r>
-          <m:rPr>
-            <m:sty m:val="p"/>
-          </m:rPr>
-          <m:t>−</m:t>
-        </m:r>
-        <m:r>
-          <m:t>1.0</m:t>
-        </m:r>
-      </m:oMath>
-      <w:r>
-        <w:t xml:space="preserve">, 0.4) and girls about half a point the other way (</w:t>
-      </w:r>
-      <m:oMath>
-        <m:r>
-          <m:rPr>
-            <m:sty m:val="p"/>
-          </m:rPr>
-          <m:t>−</m:t>
-        </m:r>
-        <m:r>
-          <m:t>0.8</m:t>
+          <m:t>0.7</m:t>
         </m:r>
       </m:oMath>
       <w:r>
@@ -9244,7 +9293,7 @@
               <w:jc w:val="left"/>
             </w:pPr>
             <w:r>
-              <w:t xml:space="preserve">-0.013</w:t>
+              <w:t xml:space="preserve">-0.012</w:t>
             </w:r>
             <w:r>
               <w:rPr>
@@ -9262,7 +9311,7 @@
               <w:jc w:val="left"/>
             </w:pPr>
             <w:r>
-              <w:t xml:space="preserve">0.011</w:t>
+              <w:t xml:space="preserve">0.010</w:t>
             </w:r>
             <w:r>
               <w:rPr>
@@ -9280,19 +9329,31 @@
               <w:jc w:val="left"/>
             </w:pPr>
             <w:r>
-              <w:t xml:space="preserve">-0.003</w:t>
-            </w:r>
-          </w:p>
-        </w:tc>
-        <w:tc>
-          <w:tcPr/>
-          <w:p>
-            <w:pPr>
-              <w:pStyle w:val="Compact"/>
-              <w:jc w:val="left"/>
-            </w:pPr>
-            <w:r>
-              <w:t xml:space="preserve">0.011</w:t>
+              <w:t xml:space="preserve">-0.002</w:t>
+            </w:r>
+          </w:p>
+        </w:tc>
+        <w:tc>
+          <w:tcPr/>
+          <w:p>
+            <w:pPr>
+              <w:pStyle w:val="Compact"/>
+              <w:jc w:val="left"/>
+            </w:pPr>
+            <w:r>
+              <w:t xml:space="preserve">0.010</w:t>
+            </w:r>
+          </w:p>
+        </w:tc>
+        <w:tc>
+          <w:tcPr/>
+          <w:p>
+            <w:pPr>
+              <w:pStyle w:val="Compact"/>
+              <w:jc w:val="left"/>
+            </w:pPr>
+            <w:r>
+              <w:t xml:space="preserve">-0.007</w:t>
             </w:r>
             <w:r>
               <w:rPr>
@@ -9310,25 +9371,7 @@
               <w:jc w:val="left"/>
             </w:pPr>
             <w:r>
-              <w:t xml:space="preserve">-0.008</w:t>
-            </w:r>
-            <w:r>
-              <w:rPr>
-                <w:vertAlign w:val="superscript"/>
-              </w:rPr>
-              <w:t xml:space="preserve">*</w:t>
-            </w:r>
-          </w:p>
-        </w:tc>
-        <w:tc>
-          <w:tcPr/>
-          <w:p>
-            <w:pPr>
-              <w:pStyle w:val="Compact"/>
-              <w:jc w:val="left"/>
-            </w:pPr>
-            <w:r>
-              <w:t xml:space="preserve">0.011</w:t>
+              <w:t xml:space="preserve">0.010</w:t>
             </w:r>
             <w:r>
               <w:rPr>
@@ -9442,73 +9485,19 @@
               <w:jc w:val="left"/>
             </w:pPr>
             <w:r>
-              <w:t xml:space="preserve">0.011</w:t>
-            </w:r>
-          </w:p>
-        </w:tc>
-        <w:tc>
-          <w:tcPr/>
-          <w:p>
-            <w:pPr>
-              <w:pStyle w:val="Compact"/>
-              <w:jc w:val="left"/>
-            </w:pPr>
-            <w:r>
-              <w:t xml:space="preserve">-0.011</w:t>
-            </w:r>
-            <w:r>
-              <w:rPr>
-                <w:vertAlign w:val="superscript"/>
-              </w:rPr>
-              <w:t xml:space="preserve">*</w:t>
-            </w:r>
-          </w:p>
-        </w:tc>
-        <w:tc>
-          <w:tcPr/>
-          <w:p>
-            <w:pPr>
-              <w:pStyle w:val="Compact"/>
-              <w:jc w:val="left"/>
-            </w:pPr>
-            <w:r>
-              <w:t xml:space="preserve">-0.004</w:t>
-            </w:r>
-          </w:p>
-        </w:tc>
-        <w:tc>
-          <w:tcPr/>
-          <w:p>
-            <w:pPr>
-              <w:pStyle w:val="Compact"/>
-              <w:jc w:val="left"/>
-            </w:pPr>
-            <w:r>
-              <w:t xml:space="preserve">-0.008</w:t>
-            </w:r>
-          </w:p>
-        </w:tc>
-        <w:tc>
-          <w:tcPr/>
-          <w:p>
-            <w:pPr>
-              <w:pStyle w:val="Compact"/>
-              <w:jc w:val="left"/>
-            </w:pPr>
-            <w:r>
-              <w:t xml:space="preserve">0.003</w:t>
-            </w:r>
-          </w:p>
-        </w:tc>
-        <w:tc>
-          <w:tcPr/>
-          <w:p>
-            <w:pPr>
-              <w:pStyle w:val="Compact"/>
-              <w:jc w:val="left"/>
-            </w:pPr>
-            <w:r>
-              <w:t xml:space="preserve">-0.010</w:t>
+              <w:t xml:space="preserve">0.010</w:t>
+            </w:r>
+          </w:p>
+        </w:tc>
+        <w:tc>
+          <w:tcPr/>
+          <w:p>
+            <w:pPr>
+              <w:pStyle w:val="Compact"/>
+              <w:jc w:val="left"/>
+            </w:pPr>
+            <w:r>
+              <w:t xml:space="preserve">-0.012</w:t>
             </w:r>
             <w:r>
               <w:rPr>
@@ -9518,177 +9507,57 @@
             </w:r>
           </w:p>
         </w:tc>
-      </w:tr>
-      <w:tr>
-        <w:tc>
-          <w:tcPr/>
-          <w:p>
-            <w:pPr>
-              <w:pStyle w:val="Compact"/>
-            </w:pPr>
-          </w:p>
-        </w:tc>
-        <w:tc>
-          <w:tcPr/>
-          <w:p>
-            <w:pPr>
-              <w:pStyle w:val="Compact"/>
-              <w:jc w:val="left"/>
-            </w:pPr>
-            <w:r>
-              <w:t xml:space="preserve">(0.007)</w:t>
-            </w:r>
-          </w:p>
-        </w:tc>
-        <w:tc>
-          <w:tcPr/>
-          <w:p>
-            <w:pPr>
-              <w:pStyle w:val="Compact"/>
-              <w:jc w:val="left"/>
-            </w:pPr>
-            <w:r>
-              <w:t xml:space="preserve">(0.006)</w:t>
-            </w:r>
-          </w:p>
-        </w:tc>
-        <w:tc>
-          <w:tcPr/>
-          <w:p>
-            <w:pPr>
-              <w:pStyle w:val="Compact"/>
-              <w:jc w:val="left"/>
-            </w:pPr>
-            <w:r>
-              <w:t xml:space="preserve">(0.008)</w:t>
-            </w:r>
-          </w:p>
-        </w:tc>
-        <w:tc>
-          <w:tcPr/>
-          <w:p>
-            <w:pPr>
-              <w:pStyle w:val="Compact"/>
-              <w:jc w:val="left"/>
-            </w:pPr>
-            <w:r>
-              <w:t xml:space="preserve">(0.007)</w:t>
-            </w:r>
-          </w:p>
-        </w:tc>
-        <w:tc>
-          <w:tcPr/>
-          <w:p>
-            <w:pPr>
-              <w:pStyle w:val="Compact"/>
-              <w:jc w:val="left"/>
-            </w:pPr>
-            <w:r>
-              <w:t xml:space="preserve">(0.007)</w:t>
-            </w:r>
-          </w:p>
-        </w:tc>
-        <w:tc>
-          <w:tcPr/>
-          <w:p>
-            <w:pPr>
-              <w:pStyle w:val="Compact"/>
-              <w:jc w:val="left"/>
-            </w:pPr>
-            <w:r>
-              <w:t xml:space="preserve">(0.004)</w:t>
-            </w:r>
-          </w:p>
-        </w:tc>
-      </w:tr>
-      <w:tr>
-        <w:tc>
-          <w:tcPr/>
-          <w:p>
-            <w:pPr>
-              <w:pStyle w:val="Compact"/>
-              <w:jc w:val="left"/>
-            </w:pPr>
-            <w:r>
-              <w:t xml:space="preserve">Employed only</w:t>
-            </w:r>
-          </w:p>
-        </w:tc>
-        <w:tc>
-          <w:tcPr/>
-          <w:p>
-            <w:pPr>
-              <w:pStyle w:val="Compact"/>
-              <w:jc w:val="left"/>
-            </w:pPr>
-            <w:r>
-              <w:t xml:space="preserve">0.000</w:t>
-            </w:r>
-          </w:p>
-        </w:tc>
-        <w:tc>
-          <w:tcPr/>
-          <w:p>
-            <w:pPr>
-              <w:pStyle w:val="Compact"/>
-              <w:jc w:val="left"/>
-            </w:pPr>
-            <w:r>
-              <w:t xml:space="preserve">0.005</w:t>
+        <w:tc>
+          <w:tcPr/>
+          <w:p>
+            <w:pPr>
+              <w:pStyle w:val="Compact"/>
+              <w:jc w:val="left"/>
+            </w:pPr>
+            <w:r>
+              <w:t xml:space="preserve">-0.004</w:t>
+            </w:r>
+          </w:p>
+        </w:tc>
+        <w:tc>
+          <w:tcPr/>
+          <w:p>
+            <w:pPr>
+              <w:pStyle w:val="Compact"/>
+              <w:jc w:val="left"/>
+            </w:pPr>
+            <w:r>
+              <w:t xml:space="preserve">-0.009</w:t>
+            </w:r>
+          </w:p>
+        </w:tc>
+        <w:tc>
+          <w:tcPr/>
+          <w:p>
+            <w:pPr>
+              <w:pStyle w:val="Compact"/>
+              <w:jc w:val="left"/>
+            </w:pPr>
+            <w:r>
+              <w:t xml:space="preserve">0.003</w:t>
+            </w:r>
+          </w:p>
+        </w:tc>
+        <w:tc>
+          <w:tcPr/>
+          <w:p>
+            <w:pPr>
+              <w:pStyle w:val="Compact"/>
+              <w:jc w:val="left"/>
+            </w:pPr>
+            <w:r>
+              <w:t xml:space="preserve">-0.011</w:t>
             </w:r>
             <w:r>
               <w:rPr>
                 <w:vertAlign w:val="superscript"/>
               </w:rPr>
-              <w:t xml:space="preserve">*</w:t>
-            </w:r>
-          </w:p>
-        </w:tc>
-        <w:tc>
-          <w:tcPr/>
-          <w:p>
-            <w:pPr>
-              <w:pStyle w:val="Compact"/>
-              <w:jc w:val="left"/>
-            </w:pPr>
-            <w:r>
-              <w:t xml:space="preserve">0.008</w:t>
-            </w:r>
-          </w:p>
-        </w:tc>
-        <w:tc>
-          <w:tcPr/>
-          <w:p>
-            <w:pPr>
-              <w:pStyle w:val="Compact"/>
-              <w:jc w:val="left"/>
-            </w:pPr>
-            <w:r>
-              <w:t xml:space="preserve">0.002</w:t>
-            </w:r>
-          </w:p>
-        </w:tc>
-        <w:tc>
-          <w:tcPr/>
-          <w:p>
-            <w:pPr>
-              <w:pStyle w:val="Compact"/>
-              <w:jc w:val="left"/>
-            </w:pPr>
-            <w:r>
-              <w:t xml:space="preserve">0.004</w:t>
-            </w:r>
-          </w:p>
-        </w:tc>
-        <w:tc>
-          <w:tcPr/>
-          <w:p>
-            <w:pPr>
-              <w:pStyle w:val="Compact"/>
-              <w:jc w:val="left"/>
-            </w:pPr>
-            <w:r>
-              <w:t xml:space="preserve">0.004</w:t>
+              <w:t xml:space="preserve">**</w:t>
             </w:r>
           </w:p>
         </w:tc>
@@ -9710,30 +9579,6 @@
               <w:jc w:val="left"/>
             </w:pPr>
             <w:r>
-              <w:t xml:space="preserve">(0.003)</w:t>
-            </w:r>
-          </w:p>
-        </w:tc>
-        <w:tc>
-          <w:tcPr/>
-          <w:p>
-            <w:pPr>
-              <w:pStyle w:val="Compact"/>
-              <w:jc w:val="left"/>
-            </w:pPr>
-            <w:r>
-              <w:t xml:space="preserve">(0.003)</w:t>
-            </w:r>
-          </w:p>
-        </w:tc>
-        <w:tc>
-          <w:tcPr/>
-          <w:p>
-            <w:pPr>
-              <w:pStyle w:val="Compact"/>
-              <w:jc w:val="left"/>
-            </w:pPr>
-            <w:r>
               <w:t xml:space="preserve">(0.007)</w:t>
             </w:r>
           </w:p>
@@ -9746,6 +9591,30 @@
               <w:jc w:val="left"/>
             </w:pPr>
             <w:r>
+              <w:t xml:space="preserve">(0.006)</w:t>
+            </w:r>
+          </w:p>
+        </w:tc>
+        <w:tc>
+          <w:tcPr/>
+          <w:p>
+            <w:pPr>
+              <w:pStyle w:val="Compact"/>
+              <w:jc w:val="left"/>
+            </w:pPr>
+            <w:r>
+              <w:t xml:space="preserve">(0.008)</w:t>
+            </w:r>
+          </w:p>
+        </w:tc>
+        <w:tc>
+          <w:tcPr/>
+          <w:p>
+            <w:pPr>
+              <w:pStyle w:val="Compact"/>
+              <w:jc w:val="left"/>
+            </w:pPr>
+            <w:r>
               <w:t xml:space="preserve">(0.007)</w:t>
             </w:r>
           </w:p>
@@ -9758,19 +9627,19 @@
               <w:jc w:val="left"/>
             </w:pPr>
             <w:r>
-              <w:t xml:space="preserve">(0.004)</w:t>
-            </w:r>
-          </w:p>
-        </w:tc>
-        <w:tc>
-          <w:tcPr/>
-          <w:p>
-            <w:pPr>
-              <w:pStyle w:val="Compact"/>
-              <w:jc w:val="left"/>
-            </w:pPr>
-            <w:r>
-              <w:t xml:space="preserve">(0.004)</w:t>
+              <w:t xml:space="preserve">(0.007)</w:t>
+            </w:r>
+          </w:p>
+        </w:tc>
+        <w:tc>
+          <w:tcPr/>
+          <w:p>
+            <w:pPr>
+              <w:pStyle w:val="Compact"/>
+              <w:jc w:val="left"/>
+            </w:pPr>
+            <w:r>
+              <w:t xml:space="preserve">(0.005)</w:t>
             </w:r>
           </w:p>
         </w:tc>
@@ -9784,31 +9653,7 @@
               <w:jc w:val="left"/>
             </w:pPr>
             <w:r>
-              <w:t xml:space="preserve">Neither enrolled nor employed</w:t>
-            </w:r>
-          </w:p>
-        </w:tc>
-        <w:tc>
-          <w:tcPr/>
-          <w:p>
-            <w:pPr>
-              <w:pStyle w:val="Compact"/>
-              <w:jc w:val="left"/>
-            </w:pPr>
-            <w:r>
-              <w:t xml:space="preserve">0.001</w:t>
-            </w:r>
-          </w:p>
-        </w:tc>
-        <w:tc>
-          <w:tcPr/>
-          <w:p>
-            <w:pPr>
-              <w:pStyle w:val="Compact"/>
-              <w:jc w:val="left"/>
-            </w:pPr>
-            <w:r>
-              <w:t xml:space="preserve">-0.005</w:t>
+              <w:t xml:space="preserve">Employed only</w:t>
             </w:r>
           </w:p>
         </w:tc>
@@ -9832,31 +9677,61 @@
               <w:jc w:val="left"/>
             </w:pPr>
             <w:r>
-              <w:t xml:space="preserve">-0.006</w:t>
-            </w:r>
-          </w:p>
-        </w:tc>
-        <w:tc>
-          <w:tcPr/>
-          <w:p>
-            <w:pPr>
-              <w:pStyle w:val="Compact"/>
-              <w:jc w:val="left"/>
-            </w:pPr>
-            <w:r>
-              <w:t xml:space="preserve">0.000</w:t>
-            </w:r>
-          </w:p>
-        </w:tc>
-        <w:tc>
-          <w:tcPr/>
-          <w:p>
-            <w:pPr>
-              <w:pStyle w:val="Compact"/>
-              <w:jc w:val="left"/>
-            </w:pPr>
-            <w:r>
-              <w:t xml:space="preserve">-0.005</w:t>
+              <w:t xml:space="preserve">0.006</w:t>
+            </w:r>
+            <w:r>
+              <w:rPr>
+                <w:vertAlign w:val="superscript"/>
+              </w:rPr>
+              <w:t xml:space="preserve">**</w:t>
+            </w:r>
+          </w:p>
+        </w:tc>
+        <w:tc>
+          <w:tcPr/>
+          <w:p>
+            <w:pPr>
+              <w:pStyle w:val="Compact"/>
+              <w:jc w:val="left"/>
+            </w:pPr>
+            <w:r>
+              <w:t xml:space="preserve">0.007</w:t>
+            </w:r>
+          </w:p>
+        </w:tc>
+        <w:tc>
+          <w:tcPr/>
+          <w:p>
+            <w:pPr>
+              <w:pStyle w:val="Compact"/>
+              <w:jc w:val="left"/>
+            </w:pPr>
+            <w:r>
+              <w:t xml:space="preserve">0.003</w:t>
+            </w:r>
+          </w:p>
+        </w:tc>
+        <w:tc>
+          <w:tcPr/>
+          <w:p>
+            <w:pPr>
+              <w:pStyle w:val="Compact"/>
+              <w:jc w:val="left"/>
+            </w:pPr>
+            <w:r>
+              <w:t xml:space="preserve">0.004</w:t>
+            </w:r>
+          </w:p>
+        </w:tc>
+        <w:tc>
+          <w:tcPr/>
+          <w:p>
+            <w:pPr>
+              <w:pStyle w:val="Compact"/>
+              <w:jc w:val="left"/>
+            </w:pPr>
+            <w:r>
+              <w:t xml:space="preserve">0.005</w:t>
             </w:r>
           </w:p>
         </w:tc>
@@ -9878,6 +9753,54 @@
               <w:jc w:val="left"/>
             </w:pPr>
             <w:r>
+              <w:t xml:space="preserve">(0.003)</w:t>
+            </w:r>
+          </w:p>
+        </w:tc>
+        <w:tc>
+          <w:tcPr/>
+          <w:p>
+            <w:pPr>
+              <w:pStyle w:val="Compact"/>
+              <w:jc w:val="left"/>
+            </w:pPr>
+            <w:r>
+              <w:t xml:space="preserve">(0.003)</w:t>
+            </w:r>
+          </w:p>
+        </w:tc>
+        <w:tc>
+          <w:tcPr/>
+          <w:p>
+            <w:pPr>
+              <w:pStyle w:val="Compact"/>
+              <w:jc w:val="left"/>
+            </w:pPr>
+            <w:r>
+              <w:t xml:space="preserve">(0.007)</w:t>
+            </w:r>
+          </w:p>
+        </w:tc>
+        <w:tc>
+          <w:tcPr/>
+          <w:p>
+            <w:pPr>
+              <w:pStyle w:val="Compact"/>
+              <w:jc w:val="left"/>
+            </w:pPr>
+            <w:r>
+              <w:t xml:space="preserve">(0.007)</w:t>
+            </w:r>
+          </w:p>
+        </w:tc>
+        <w:tc>
+          <w:tcPr/>
+          <w:p>
+            <w:pPr>
+              <w:pStyle w:val="Compact"/>
+              <w:jc w:val="left"/>
+            </w:pPr>
+            <w:r>
               <w:t xml:space="preserve">(0.004)</w:t>
             </w:r>
           </w:p>
@@ -9894,27 +9817,111 @@
             </w:r>
           </w:p>
         </w:tc>
-        <w:tc>
-          <w:tcPr/>
-          <w:p>
-            <w:pPr>
-              <w:pStyle w:val="Compact"/>
-              <w:jc w:val="left"/>
-            </w:pPr>
-            <w:r>
-              <w:t xml:space="preserve">(0.006)</w:t>
-            </w:r>
-          </w:p>
-        </w:tc>
-        <w:tc>
-          <w:tcPr/>
-          <w:p>
-            <w:pPr>
-              <w:pStyle w:val="Compact"/>
-              <w:jc w:val="left"/>
-            </w:pPr>
-            <w:r>
-              <w:t xml:space="preserve">(0.006)</w:t>
+      </w:tr>
+      <w:tr>
+        <w:tc>
+          <w:tcPr/>
+          <w:p>
+            <w:pPr>
+              <w:pStyle w:val="Compact"/>
+              <w:jc w:val="left"/>
+            </w:pPr>
+            <w:r>
+              <w:t xml:space="preserve">Neither enrolled nor employed</w:t>
+            </w:r>
+          </w:p>
+        </w:tc>
+        <w:tc>
+          <w:tcPr/>
+          <w:p>
+            <w:pPr>
+              <w:pStyle w:val="Compact"/>
+              <w:jc w:val="left"/>
+            </w:pPr>
+            <w:r>
+              <w:t xml:space="preserve">0.002</w:t>
+            </w:r>
+          </w:p>
+        </w:tc>
+        <w:tc>
+          <w:tcPr/>
+          <w:p>
+            <w:pPr>
+              <w:pStyle w:val="Compact"/>
+              <w:jc w:val="left"/>
+            </w:pPr>
+            <w:r>
+              <w:t xml:space="preserve">-0.004</w:t>
+            </w:r>
+          </w:p>
+        </w:tc>
+        <w:tc>
+          <w:tcPr/>
+          <w:p>
+            <w:pPr>
+              <w:pStyle w:val="Compact"/>
+              <w:jc w:val="left"/>
+            </w:pPr>
+            <w:r>
+              <w:t xml:space="preserve">-0.001</w:t>
+            </w:r>
+          </w:p>
+        </w:tc>
+        <w:tc>
+          <w:tcPr/>
+          <w:p>
+            <w:pPr>
+              <w:pStyle w:val="Compact"/>
+              <w:jc w:val="left"/>
+            </w:pPr>
+            <w:r>
+              <w:t xml:space="preserve">-0.004</w:t>
+            </w:r>
+          </w:p>
+        </w:tc>
+        <w:tc>
+          <w:tcPr/>
+          <w:p>
+            <w:pPr>
+              <w:pStyle w:val="Compact"/>
+              <w:jc w:val="left"/>
+            </w:pPr>
+            <w:r>
+              <w:t xml:space="preserve">0.000</w:t>
+            </w:r>
+          </w:p>
+        </w:tc>
+        <w:tc>
+          <w:tcPr/>
+          <w:p>
+            <w:pPr>
+              <w:pStyle w:val="Compact"/>
+              <w:jc w:val="left"/>
+            </w:pPr>
+            <w:r>
+              <w:t xml:space="preserve">-0.004</w:t>
+            </w:r>
+          </w:p>
+        </w:tc>
+      </w:tr>
+      <w:tr>
+        <w:tc>
+          <w:tcPr/>
+          <w:p>
+            <w:pPr>
+              <w:pStyle w:val="Compact"/>
+            </w:pPr>
+          </w:p>
+        </w:tc>
+        <w:tc>
+          <w:tcPr/>
+          <w:p>
+            <w:pPr>
+              <w:pStyle w:val="Compact"/>
+              <w:jc w:val="left"/>
+            </w:pPr>
+            <w:r>
+              <w:t xml:space="preserve">(0.004)</w:t>
             </w:r>
           </w:p>
         </w:tc>
@@ -9938,7 +9945,43 @@
               <w:jc w:val="left"/>
             </w:pPr>
             <w:r>
-              <w:t xml:space="preserve">(0.004)</w:t>
+              <w:t xml:space="preserve">(0.005)</w:t>
+            </w:r>
+          </w:p>
+        </w:tc>
+        <w:tc>
+          <w:tcPr/>
+          <w:p>
+            <w:pPr>
+              <w:pStyle w:val="Compact"/>
+              <w:jc w:val="left"/>
+            </w:pPr>
+            <w:r>
+              <w:t xml:space="preserve">(0.005)</w:t>
+            </w:r>
+          </w:p>
+        </w:tc>
+        <w:tc>
+          <w:tcPr/>
+          <w:p>
+            <w:pPr>
+              <w:pStyle w:val="Compact"/>
+              <w:jc w:val="left"/>
+            </w:pPr>
+            <w:r>
+              <w:t xml:space="preserve">(0.003)</w:t>
+            </w:r>
+          </w:p>
+        </w:tc>
+        <w:tc>
+          <w:tcPr/>
+          <w:p>
+            <w:pPr>
+              <w:pStyle w:val="Compact"/>
+              <w:jc w:val="left"/>
+            </w:pPr>
+            <w:r>
+              <w:t xml:space="preserve">(0.003)</w:t>
             </w:r>
           </w:p>
         </w:tc>
@@ -10480,14 +10523,14 @@
           <m:t>+</m:t>
         </m:r>
         <m:r>
-          <m:t>0.3</m:t>
+          <m:t>0.4</m:t>
         </m:r>
       </m:oMath>
       <w:r>
         <w:t xml:space="preserve"> </w:t>
       </w:r>
       <w:r>
-        <w:t xml:space="preserve">(s.e. 0.6),</w:t>
+        <w:t xml:space="preserve">(s.e. 0.5),</w:t>
       </w:r>
       <w:r>
         <w:t xml:space="preserve"> </w:t>
@@ -10500,7 +10543,7 @@
           <m:t>−</m:t>
         </m:r>
         <m:r>
-          <m:t>0.4</m:t>
+          <m:t>0.7</m:t>
         </m:r>
       </m:oMath>
       <w:r>
@@ -10520,7 +10563,7 @@
           <m:t>+</m:t>
         </m:r>
         <m:r>
-          <m:t>0.2</m:t>
+          <m:t>0.3</m:t>
         </m:r>
       </m:oMath>
       <w:r>
@@ -10540,7 +10583,7 @@
           <m:t>−</m:t>
         </m:r>
         <m:r>
-          <m:t>0.1</m:t>
+          <m:t>0.0</m:t>
         </m:r>
       </m:oMath>
       <w:r>
@@ -10567,7 +10610,7 @@
         <w:t xml:space="preserve"> </w:t>
       </w:r>
       <w:r>
-        <w:t xml:space="preserve">(0.6),</w:t>
+        <w:t xml:space="preserve">(0.5),</w:t>
       </w:r>
       <w:r>
         <w:t xml:space="preserve"> </w:t>
@@ -10607,7 +10650,7 @@
         <w:t xml:space="preserve"> </w:t>
       </w:r>
       <w:r>
-        <w:t xml:space="preserve">(0.4) and</w:t>
+        <w:t xml:space="preserve">(0.3) and</w:t>
       </w:r>
       <w:r>
         <w:t xml:space="preserve"> </w:t>
@@ -10627,7 +10670,7 @@
         <w:t xml:space="preserve"> </w:t>
       </w:r>
       <w:r>
-        <w:t xml:space="preserve">(0.3). The one coefficient beyond two standard errors is non-white enrolled-and-employed at 18–19,</w:t>
+        <w:t xml:space="preserve">(0.4). The one coefficient beyond two standard errors is non-white enrolled-and-employed at 18–19,</w:t>
       </w:r>
       <w:r>
         <w:t xml:space="preserve"> </w:t>
@@ -10640,14 +10683,14 @@
           <m:t>+</m:t>
         </m:r>
         <m:r>
-          <m:t>1.4</m:t>
+          <m:t>1.6</m:t>
         </m:r>
       </m:oMath>
       <w:r>
         <w:t xml:space="preserve"> </w:t>
       </w:r>
       <w:r>
-        <w:t xml:space="preserve">(0.4), a rise, beside</w:t>
+        <w:t xml:space="preserve">(0.3), a rise, beside</w:t>
       </w:r>
       <w:r>
         <w:t xml:space="preserve"> </w:t>
@@ -10660,7 +10703,7 @@
           <m:t>−</m:t>
         </m:r>
         <m:r>
-          <m:t>0.8</m:t>
+          <m:t>0.7</m:t>
         </m:r>
       </m:oMath>
       <w:r>
@@ -10850,7 +10893,7 @@
               <w:jc w:val="left"/>
             </w:pPr>
             <w:r>
-              <w:t xml:space="preserve">0.003</w:t>
+              <w:t xml:space="preserve">0.004</w:t>
             </w:r>
           </w:p>
         </w:tc>
@@ -10874,19 +10917,19 @@
               <w:jc w:val="left"/>
             </w:pPr>
             <w:r>
-              <w:t xml:space="preserve">-0.008</w:t>
-            </w:r>
-          </w:p>
-        </w:tc>
-        <w:tc>
-          <w:tcPr/>
-          <w:p>
-            <w:pPr>
-              <w:pStyle w:val="Compact"/>
-              <w:jc w:val="left"/>
-            </w:pPr>
-            <w:r>
-              <w:t xml:space="preserve">0.014</w:t>
+              <w:t xml:space="preserve">-0.007</w:t>
+            </w:r>
+          </w:p>
+        </w:tc>
+        <w:tc>
+          <w:tcPr/>
+          <w:p>
+            <w:pPr>
+              <w:pStyle w:val="Compact"/>
+              <w:jc w:val="left"/>
+            </w:pPr>
+            <w:r>
+              <w:t xml:space="preserve">0.016</w:t>
             </w:r>
             <w:r>
               <w:rPr>
@@ -10904,7 +10947,7 @@
               <w:jc w:val="left"/>
             </w:pPr>
             <w:r>
-              <w:t xml:space="preserve">-0.003</w:t>
+              <w:t xml:space="preserve">-0.002</w:t>
             </w:r>
           </w:p>
         </w:tc>
@@ -10938,19 +10981,19 @@
               <w:jc w:val="left"/>
             </w:pPr>
             <w:r>
-              <w:t xml:space="preserve">(0.006)</w:t>
-            </w:r>
-          </w:p>
-        </w:tc>
-        <w:tc>
-          <w:tcPr/>
-          <w:p>
-            <w:pPr>
-              <w:pStyle w:val="Compact"/>
-              <w:jc w:val="left"/>
-            </w:pPr>
-            <w:r>
-              <w:t xml:space="preserve">(0.006)</w:t>
+              <w:t xml:space="preserve">(0.005)</w:t>
+            </w:r>
+          </w:p>
+        </w:tc>
+        <w:tc>
+          <w:tcPr/>
+          <w:p>
+            <w:pPr>
+              <w:pStyle w:val="Compact"/>
+              <w:jc w:val="left"/>
+            </w:pPr>
+            <w:r>
+              <w:t xml:space="preserve">(0.005)</w:t>
             </w:r>
           </w:p>
         </w:tc>
@@ -10974,6 +11017,18 @@
               <w:jc w:val="left"/>
             </w:pPr>
             <w:r>
+              <w:t xml:space="preserve">(0.003)</w:t>
+            </w:r>
+          </w:p>
+        </w:tc>
+        <w:tc>
+          <w:tcPr/>
+          <w:p>
+            <w:pPr>
+              <w:pStyle w:val="Compact"/>
+              <w:jc w:val="left"/>
+            </w:pPr>
+            <w:r>
               <w:t xml:space="preserve">(0.004)</w:t>
             </w:r>
           </w:p>
@@ -10986,19 +11041,7 @@
               <w:jc w:val="left"/>
             </w:pPr>
             <w:r>
-              <w:t xml:space="preserve">(0.005)</w:t>
-            </w:r>
-          </w:p>
-        </w:tc>
-        <w:tc>
-          <w:tcPr/>
-          <w:p>
-            <w:pPr>
-              <w:pStyle w:val="Compact"/>
-              <w:jc w:val="left"/>
-            </w:pPr>
-            <w:r>
-              <w:t xml:space="preserve">(0.004)</w:t>
+              <w:t xml:space="preserve">(0.003)</w:t>
             </w:r>
           </w:p>
         </w:tc>
@@ -11024,6 +11067,30 @@
               <w:jc w:val="left"/>
             </w:pPr>
             <w:r>
+              <w:t xml:space="preserve">-0.007</w:t>
+            </w:r>
+          </w:p>
+        </w:tc>
+        <w:tc>
+          <w:tcPr/>
+          <w:p>
+            <w:pPr>
+              <w:pStyle w:val="Compact"/>
+              <w:jc w:val="left"/>
+            </w:pPr>
+            <w:r>
+              <w:t xml:space="preserve">0.006</w:t>
+            </w:r>
+          </w:p>
+        </w:tc>
+        <w:tc>
+          <w:tcPr/>
+          <w:p>
+            <w:pPr>
+              <w:pStyle w:val="Compact"/>
+              <w:jc w:val="left"/>
+            </w:pPr>
+            <w:r>
               <w:t xml:space="preserve">-0.004</w:t>
             </w:r>
           </w:p>
@@ -11036,18 +11103,6 @@
               <w:jc w:val="left"/>
             </w:pPr>
             <w:r>
-              <w:t xml:space="preserve">0.006</w:t>
-            </w:r>
-          </w:p>
-        </w:tc>
-        <w:tc>
-          <w:tcPr/>
-          <w:p>
-            <w:pPr>
-              <w:pStyle w:val="Compact"/>
-              <w:jc w:val="left"/>
-            </w:pPr>
-            <w:r>
               <w:t xml:space="preserve">-0.005</w:t>
             </w:r>
           </w:p>
@@ -11060,19 +11115,7 @@
               <w:jc w:val="left"/>
             </w:pPr>
             <w:r>
-              <w:t xml:space="preserve">-0.003</w:t>
-            </w:r>
-          </w:p>
-        </w:tc>
-        <w:tc>
-          <w:tcPr/>
-          <w:p>
-            <w:pPr>
-              <w:pStyle w:val="Compact"/>
-              <w:jc w:val="left"/>
-            </w:pPr>
-            <w:r>
-              <w:t xml:space="preserve">-0.005</w:t>
+              <w:t xml:space="preserve">-0.006</w:t>
             </w:r>
           </w:p>
         </w:tc>
@@ -11192,18 +11235,6 @@
               <w:jc w:val="left"/>
             </w:pPr>
             <w:r>
-              <w:t xml:space="preserve">0.002</w:t>
-            </w:r>
-          </w:p>
-        </w:tc>
-        <w:tc>
-          <w:tcPr/>
-          <w:p>
-            <w:pPr>
-              <w:pStyle w:val="Compact"/>
-              <w:jc w:val="left"/>
-            </w:pPr>
-            <w:r>
               <w:t xml:space="preserve">0.003</w:t>
             </w:r>
           </w:p>
@@ -11216,19 +11247,31 @@
               <w:jc w:val="left"/>
             </w:pPr>
             <w:r>
-              <w:t xml:space="preserve">0.011</w:t>
-            </w:r>
-          </w:p>
-        </w:tc>
-        <w:tc>
-          <w:tcPr/>
-          <w:p>
-            <w:pPr>
-              <w:pStyle w:val="Compact"/>
-              <w:jc w:val="left"/>
-            </w:pPr>
-            <w:r>
-              <w:t xml:space="preserve">-0.005</w:t>
+              <w:t xml:space="preserve">0.003</w:t>
+            </w:r>
+          </w:p>
+        </w:tc>
+        <w:tc>
+          <w:tcPr/>
+          <w:p>
+            <w:pPr>
+              <w:pStyle w:val="Compact"/>
+              <w:jc w:val="left"/>
+            </w:pPr>
+            <w:r>
+              <w:t xml:space="preserve">0.010</w:t>
+            </w:r>
+          </w:p>
+        </w:tc>
+        <w:tc>
+          <w:tcPr/>
+          <w:p>
+            <w:pPr>
+              <w:pStyle w:val="Compact"/>
+              <w:jc w:val="left"/>
+            </w:pPr>
+            <w:r>
+              <w:t xml:space="preserve">-0.004</w:t>
             </w:r>
           </w:p>
         </w:tc>
@@ -11241,6 +11284,12 @@
             </w:pPr>
             <w:r>
               <w:t xml:space="preserve">0.007</w:t>
+            </w:r>
+            <w:r>
+              <w:rPr>
+                <w:vertAlign w:val="superscript"/>
+              </w:rPr>
+              <w:t xml:space="preserve">*</w:t>
             </w:r>
           </w:p>
         </w:tc>
@@ -11286,6 +11335,42 @@
               <w:jc w:val="left"/>
             </w:pPr>
             <w:r>
+              <w:t xml:space="preserve">(0.003)</w:t>
+            </w:r>
+          </w:p>
+        </w:tc>
+        <w:tc>
+          <w:tcPr/>
+          <w:p>
+            <w:pPr>
+              <w:pStyle w:val="Compact"/>
+              <w:jc w:val="left"/>
+            </w:pPr>
+            <w:r>
+              <w:t xml:space="preserve">(0.007)</w:t>
+            </w:r>
+          </w:p>
+        </w:tc>
+        <w:tc>
+          <w:tcPr/>
+          <w:p>
+            <w:pPr>
+              <w:pStyle w:val="Compact"/>
+              <w:jc w:val="left"/>
+            </w:pPr>
+            <w:r>
+              <w:t xml:space="preserve">(0.008)</w:t>
+            </w:r>
+          </w:p>
+        </w:tc>
+        <w:tc>
+          <w:tcPr/>
+          <w:p>
+            <w:pPr>
+              <w:pStyle w:val="Compact"/>
+              <w:jc w:val="left"/>
+            </w:pPr>
+            <w:r>
               <w:t xml:space="preserve">(0.004)</w:t>
             </w:r>
           </w:p>
@@ -11298,43 +11383,7 @@
               <w:jc w:val="left"/>
             </w:pPr>
             <w:r>
-              <w:t xml:space="preserve">(0.008)</w:t>
-            </w:r>
-          </w:p>
-        </w:tc>
-        <w:tc>
-          <w:tcPr/>
-          <w:p>
-            <w:pPr>
-              <w:pStyle w:val="Compact"/>
-              <w:jc w:val="left"/>
-            </w:pPr>
-            <w:r>
-              <w:t xml:space="preserve">(0.008)</w:t>
-            </w:r>
-          </w:p>
-        </w:tc>
-        <w:tc>
-          <w:tcPr/>
-          <w:p>
-            <w:pPr>
-              <w:pStyle w:val="Compact"/>
-              <w:jc w:val="left"/>
-            </w:pPr>
-            <w:r>
-              <w:t xml:space="preserve">(0.005)</w:t>
-            </w:r>
-          </w:p>
-        </w:tc>
-        <w:tc>
-          <w:tcPr/>
-          <w:p>
-            <w:pPr>
-              <w:pStyle w:val="Compact"/>
-              <w:jc w:val="left"/>
-            </w:pPr>
-            <w:r>
-              <w:t xml:space="preserve">(0.005)</w:t>
+              <w:t xml:space="preserve">(0.004)</w:t>
             </w:r>
           </w:p>
         </w:tc>
@@ -11360,7 +11409,7 @@
               <w:jc w:val="left"/>
             </w:pPr>
             <w:r>
-              <w:t xml:space="preserve">-0.001</w:t>
+              <w:t xml:space="preserve">-0.000</w:t>
             </w:r>
           </w:p>
         </w:tc>
@@ -11384,7 +11433,7 @@
               <w:jc w:val="left"/>
             </w:pPr>
             <w:r>
-              <w:t xml:space="preserve">0.002</w:t>
+              <w:t xml:space="preserve">0.001</w:t>
             </w:r>
           </w:p>
         </w:tc>
@@ -11408,7 +11457,7 @@
               <w:jc w:val="left"/>
             </w:pPr>
             <w:r>
-              <w:t xml:space="preserve">0.000</w:t>
+              <w:t xml:space="preserve">0.001</w:t>
             </w:r>
           </w:p>
         </w:tc>
@@ -11454,43 +11503,43 @@
               <w:jc w:val="left"/>
             </w:pPr>
             <w:r>
+              <w:t xml:space="preserve">(0.004)</w:t>
+            </w:r>
+          </w:p>
+        </w:tc>
+        <w:tc>
+          <w:tcPr/>
+          <w:p>
+            <w:pPr>
+              <w:pStyle w:val="Compact"/>
+              <w:jc w:val="left"/>
+            </w:pPr>
+            <w:r>
+              <w:t xml:space="preserve">(0.005)</w:t>
+            </w:r>
+          </w:p>
+        </w:tc>
+        <w:tc>
+          <w:tcPr/>
+          <w:p>
+            <w:pPr>
+              <w:pStyle w:val="Compact"/>
+              <w:jc w:val="left"/>
+            </w:pPr>
+            <w:r>
+              <w:t xml:space="preserve">(0.005)</w:t>
+            </w:r>
+          </w:p>
+        </w:tc>
+        <w:tc>
+          <w:tcPr/>
+          <w:p>
+            <w:pPr>
+              <w:pStyle w:val="Compact"/>
+              <w:jc w:val="left"/>
+            </w:pPr>
+            <w:r>
               <w:t xml:space="preserve">(0.003)</w:t>
-            </w:r>
-          </w:p>
-        </w:tc>
-        <w:tc>
-          <w:tcPr/>
-          <w:p>
-            <w:pPr>
-              <w:pStyle w:val="Compact"/>
-              <w:jc w:val="left"/>
-            </w:pPr>
-            <w:r>
-              <w:t xml:space="preserve">(0.006)</w:t>
-            </w:r>
-          </w:p>
-        </w:tc>
-        <w:tc>
-          <w:tcPr/>
-          <w:p>
-            <w:pPr>
-              <w:pStyle w:val="Compact"/>
-              <w:jc w:val="left"/>
-            </w:pPr>
-            <w:r>
-              <w:t xml:space="preserve">(0.005)</w:t>
-            </w:r>
-          </w:p>
-        </w:tc>
-        <w:tc>
-          <w:tcPr/>
-          <w:p>
-            <w:pPr>
-              <w:pStyle w:val="Compact"/>
-              <w:jc w:val="left"/>
-            </w:pPr>
-            <w:r>
-              <w:t xml:space="preserve">(0.004)</w:t>
             </w:r>
           </w:p>
         </w:tc>
@@ -11602,7 +11651,7 @@
         <w:pStyle w:val="BodyText"/>
       </w:pPr>
       <w:r>
-        <w:t xml:space="preserve">The stacked coefficients for the wage (Table 6) are 5.0 percent (s.e. 0.8) at 16–17, 3.2 (0.8) at 18–19 and 4.0 (0.7) pooled, next to the event-study averages of 5.3, 3.0 and 3.8; for weekly earnings they are 5.4 (2.5), 4.8 (1.5) and 5.5 (1.5). The two-way fixed effects elasticity of the teen wage with respect to the minimum, in Appendix C, is about 0.2 at every age, which for the average event implies gains of 5 to 7 percent. Where the treatment has a real effect the designs agree in sign and roughly in size.</w:t>
+        <w:t xml:space="preserve">The stacked coefficients for the wage (Table 6) are 5.1 percent (s.e. 0.8) at 16–17, 3.0 (0.8) at 18–19 and 3.8 (0.7) pooled, next to the event-study averages of 5.3, 3.0 and 3.8; for weekly earnings they are 5.2 (2.4), 4.4 (1.4) and 4.8 (1.7). The two-way fixed effects elasticity of the teen wage with respect to the minimum, in Appendix C, is about 0.2 at every age, which for the average event implies gains of 5 to 7 percent. Where the treatment has a real effect the designs agree in sign and roughly in size.</w:t>
       </w:r>
     </w:p>
     <w:p>
@@ -11697,7 +11746,7 @@
               <w:jc w:val="left"/>
             </w:pPr>
             <w:r>
-              <w:t xml:space="preserve">0.050</w:t>
+              <w:t xml:space="preserve">0.051</w:t>
             </w:r>
             <w:r>
               <w:rPr>
@@ -11715,7 +11764,7 @@
               <w:jc w:val="left"/>
             </w:pPr>
             <w:r>
-              <w:t xml:space="preserve">0.032</w:t>
+              <w:t xml:space="preserve">0.030</w:t>
             </w:r>
             <w:r>
               <w:rPr>
@@ -11733,7 +11782,7 @@
               <w:jc w:val="left"/>
             </w:pPr>
             <w:r>
-              <w:t xml:space="preserve">0.040</w:t>
+              <w:t xml:space="preserve">0.038</w:t>
             </w:r>
             <w:r>
               <w:rPr>
@@ -11811,7 +11860,7 @@
               <w:jc w:val="left"/>
             </w:pPr>
             <w:r>
-              <w:t xml:space="preserve">0.054</w:t>
+              <w:t xml:space="preserve">0.052</w:t>
             </w:r>
             <w:r>
               <w:rPr>
@@ -11829,7 +11878,7 @@
               <w:jc w:val="left"/>
             </w:pPr>
             <w:r>
-              <w:t xml:space="preserve">0.048</w:t>
+              <w:t xml:space="preserve">0.044</w:t>
             </w:r>
             <w:r>
               <w:rPr>
@@ -11847,7 +11896,7 @@
               <w:jc w:val="left"/>
             </w:pPr>
             <w:r>
-              <w:t xml:space="preserve">0.055</w:t>
+              <w:t xml:space="preserve">0.048</w:t>
             </w:r>
             <w:r>
               <w:rPr>
@@ -11875,31 +11924,31 @@
               <w:jc w:val="left"/>
             </w:pPr>
             <w:r>
-              <w:t xml:space="preserve">(0.025)</w:t>
-            </w:r>
-          </w:p>
-        </w:tc>
-        <w:tc>
-          <w:tcPr/>
-          <w:p>
-            <w:pPr>
-              <w:pStyle w:val="Compact"/>
-              <w:jc w:val="left"/>
-            </w:pPr>
-            <w:r>
-              <w:t xml:space="preserve">(0.015)</w:t>
-            </w:r>
-          </w:p>
-        </w:tc>
-        <w:tc>
-          <w:tcPr/>
-          <w:p>
-            <w:pPr>
-              <w:pStyle w:val="Compact"/>
-              <w:jc w:val="left"/>
-            </w:pPr>
-            <w:r>
-              <w:t xml:space="preserve">(0.015)</w:t>
+              <w:t xml:space="preserve">(0.024)</w:t>
+            </w:r>
+          </w:p>
+        </w:tc>
+        <w:tc>
+          <w:tcPr/>
+          <w:p>
+            <w:pPr>
+              <w:pStyle w:val="Compact"/>
+              <w:jc w:val="left"/>
+            </w:pPr>
+            <w:r>
+              <w:t xml:space="preserve">(0.014)</w:t>
+            </w:r>
+          </w:p>
+        </w:tc>
+        <w:tc>
+          <w:tcPr/>
+          <w:p>
+            <w:pPr>
+              <w:pStyle w:val="Compact"/>
+              <w:jc w:val="left"/>
+            </w:pPr>
+            <w:r>
+              <w:t xml:space="preserve">(0.017)</w:t>
             </w:r>
           </w:p>
         </w:tc>
@@ -12477,7 +12526,7 @@
         <w:pStyle w:val="BodyText"/>
       </w:pPr>
       <w:r>
-        <w:t xml:space="preserve">The stacked coefficients by income (Table 8) confirm that the gain reached both groups and was somewhat larger for the poorer one. Because the stacked regression pools the base period over 36 months, it is more precise than the event-study average for the thin low-income 16–17 cell: it gives 7.3 percent (s.e. 1.4) for low-income against 4.4 (0.9) for high-income teens at 16–17, 4.1 (1.1) against 2.6 (0.9) at 18–19, and 5.2 (1.1) against 3.5 (0.7) pooled.</w:t>
+        <w:t xml:space="preserve">The stacked coefficients by income (Table 8) confirm that the gain reached both groups and was somewhat larger for the poorer one. Because the stacked regression pools the base period over 36 months, it is more precise than the event-study average for the thin low-income 16–17 cell: it gives 7.7 percent (s.e. 1.3) for low-income against 4.4 (0.9) for high-income teens at 16–17, 4.1 (1.1) against 2.3 (0.9) at 18–19, and 5.1 (1.1) against 3.2 (0.8) pooled.</w:t>
       </w:r>
     </w:p>
     <w:p>
@@ -12660,7 +12709,7 @@
               <w:jc w:val="left"/>
             </w:pPr>
             <w:r>
-              <w:t xml:space="preserve">0.073</w:t>
+              <w:t xml:space="preserve">0.077</w:t>
             </w:r>
             <w:r>
               <w:rPr>
@@ -12714,7 +12763,25 @@
               <w:jc w:val="left"/>
             </w:pPr>
             <w:r>
-              <w:t xml:space="preserve">0.026</w:t>
+              <w:t xml:space="preserve">0.023</w:t>
+            </w:r>
+            <w:r>
+              <w:rPr>
+                <w:vertAlign w:val="superscript"/>
+              </w:rPr>
+              <w:t xml:space="preserve">**</w:t>
+            </w:r>
+          </w:p>
+        </w:tc>
+        <w:tc>
+          <w:tcPr/>
+          <w:p>
+            <w:pPr>
+              <w:pStyle w:val="Compact"/>
+              <w:jc w:val="left"/>
+            </w:pPr>
+            <w:r>
+              <w:t xml:space="preserve">0.051</w:t>
             </w:r>
             <w:r>
               <w:rPr>
@@ -12732,7 +12799,7 @@
               <w:jc w:val="left"/>
             </w:pPr>
             <w:r>
-              <w:t xml:space="preserve">0.052</w:t>
+              <w:t xml:space="preserve">0.032</w:t>
             </w:r>
             <w:r>
               <w:rPr>
@@ -12742,6 +12809,150 @@
             </w:r>
           </w:p>
         </w:tc>
+      </w:tr>
+      <w:tr>
+        <w:tc>
+          <w:tcPr/>
+          <w:p>
+            <w:pPr>
+              <w:pStyle w:val="Compact"/>
+            </w:pPr>
+          </w:p>
+        </w:tc>
+        <w:tc>
+          <w:tcPr/>
+          <w:p>
+            <w:pPr>
+              <w:pStyle w:val="Compact"/>
+              <w:jc w:val="left"/>
+            </w:pPr>
+            <w:r>
+              <w:t xml:space="preserve">(0.013)</w:t>
+            </w:r>
+          </w:p>
+        </w:tc>
+        <w:tc>
+          <w:tcPr/>
+          <w:p>
+            <w:pPr>
+              <w:pStyle w:val="Compact"/>
+              <w:jc w:val="left"/>
+            </w:pPr>
+            <w:r>
+              <w:t xml:space="preserve">(0.009)</w:t>
+            </w:r>
+          </w:p>
+        </w:tc>
+        <w:tc>
+          <w:tcPr/>
+          <w:p>
+            <w:pPr>
+              <w:pStyle w:val="Compact"/>
+              <w:jc w:val="left"/>
+            </w:pPr>
+            <w:r>
+              <w:t xml:space="preserve">(0.011)</w:t>
+            </w:r>
+          </w:p>
+        </w:tc>
+        <w:tc>
+          <w:tcPr/>
+          <w:p>
+            <w:pPr>
+              <w:pStyle w:val="Compact"/>
+              <w:jc w:val="left"/>
+            </w:pPr>
+            <w:r>
+              <w:t xml:space="preserve">(0.009)</w:t>
+            </w:r>
+          </w:p>
+        </w:tc>
+        <w:tc>
+          <w:tcPr/>
+          <w:p>
+            <w:pPr>
+              <w:pStyle w:val="Compact"/>
+              <w:jc w:val="left"/>
+            </w:pPr>
+            <w:r>
+              <w:t xml:space="preserve">(0.011)</w:t>
+            </w:r>
+          </w:p>
+        </w:tc>
+        <w:tc>
+          <w:tcPr/>
+          <w:p>
+            <w:pPr>
+              <w:pStyle w:val="Compact"/>
+              <w:jc w:val="left"/>
+            </w:pPr>
+            <w:r>
+              <w:t xml:space="preserve">(0.008)</w:t>
+            </w:r>
+          </w:p>
+        </w:tc>
+      </w:tr>
+      <w:tr>
+        <w:tc>
+          <w:tcPr/>
+          <w:p>
+            <w:pPr>
+              <w:pStyle w:val="Compact"/>
+              <w:jc w:val="left"/>
+            </w:pPr>
+            <w:r>
+              <w:t xml:space="preserve">Log weekly earnings</w:t>
+            </w:r>
+          </w:p>
+        </w:tc>
+        <w:tc>
+          <w:tcPr/>
+          <w:p>
+            <w:pPr>
+              <w:pStyle w:val="Compact"/>
+              <w:jc w:val="left"/>
+            </w:pPr>
+            <w:r>
+              <w:t xml:space="preserve">0.064</w:t>
+            </w:r>
+            <w:r>
+              <w:rPr>
+                <w:vertAlign w:val="superscript"/>
+              </w:rPr>
+              <w:t xml:space="preserve">*</w:t>
+            </w:r>
+          </w:p>
+        </w:tc>
+        <w:tc>
+          <w:tcPr/>
+          <w:p>
+            <w:pPr>
+              <w:pStyle w:val="Compact"/>
+              <w:jc w:val="left"/>
+            </w:pPr>
+            <w:r>
+              <w:t xml:space="preserve">0.060</w:t>
+            </w:r>
+            <w:r>
+              <w:rPr>
+                <w:vertAlign w:val="superscript"/>
+              </w:rPr>
+              <w:t xml:space="preserve">**</w:t>
+            </w:r>
+          </w:p>
+        </w:tc>
+        <w:tc>
+          <w:tcPr/>
+          <w:p>
+            <w:pPr>
+              <w:pStyle w:val="Compact"/>
+              <w:jc w:val="left"/>
+            </w:pPr>
+            <w:r>
+              <w:t xml:space="preserve">0.045</w:t>
+            </w:r>
+          </w:p>
+        </w:tc>
         <w:tc>
           <w:tcPr/>
           <w:p>
@@ -12751,6 +12962,42 @@
             </w:pPr>
             <w:r>
               <w:t xml:space="preserve">0.035</w:t>
+            </w:r>
+            <w:r>
+              <w:rPr>
+                <w:vertAlign w:val="superscript"/>
+              </w:rPr>
+              <w:t xml:space="preserve">**</w:t>
+            </w:r>
+          </w:p>
+        </w:tc>
+        <w:tc>
+          <w:tcPr/>
+          <w:p>
+            <w:pPr>
+              <w:pStyle w:val="Compact"/>
+              <w:jc w:val="left"/>
+            </w:pPr>
+            <w:r>
+              <w:t xml:space="preserve">0.051</w:t>
+            </w:r>
+            <w:r>
+              <w:rPr>
+                <w:vertAlign w:val="superscript"/>
+              </w:rPr>
+              <w:t xml:space="preserve">**</w:t>
+            </w:r>
+          </w:p>
+        </w:tc>
+        <w:tc>
+          <w:tcPr/>
+          <w:p>
+            <w:pPr>
+              <w:pStyle w:val="Compact"/>
+              <w:jc w:val="left"/>
+            </w:pPr>
+            <w:r>
+              <w:t xml:space="preserve">0.045</w:t>
             </w:r>
             <w:r>
               <w:rPr>
@@ -12778,241 +13025,43 @@
               <w:jc w:val="left"/>
             </w:pPr>
             <w:r>
-              <w:t xml:space="preserve">(0.014)</w:t>
-            </w:r>
-          </w:p>
-        </w:tc>
-        <w:tc>
-          <w:tcPr/>
-          <w:p>
-            <w:pPr>
-              <w:pStyle w:val="Compact"/>
-              <w:jc w:val="left"/>
-            </w:pPr>
-            <w:r>
-              <w:t xml:space="preserve">(0.009)</w:t>
-            </w:r>
-          </w:p>
-        </w:tc>
-        <w:tc>
-          <w:tcPr/>
-          <w:p>
-            <w:pPr>
-              <w:pStyle w:val="Compact"/>
-              <w:jc w:val="left"/>
-            </w:pPr>
-            <w:r>
-              <w:t xml:space="preserve">(0.011)</w:t>
-            </w:r>
-          </w:p>
-        </w:tc>
-        <w:tc>
-          <w:tcPr/>
-          <w:p>
-            <w:pPr>
-              <w:pStyle w:val="Compact"/>
-              <w:jc w:val="left"/>
-            </w:pPr>
-            <w:r>
-              <w:t xml:space="preserve">(0.009)</w:t>
-            </w:r>
-          </w:p>
-        </w:tc>
-        <w:tc>
-          <w:tcPr/>
-          <w:p>
-            <w:pPr>
-              <w:pStyle w:val="Compact"/>
-              <w:jc w:val="left"/>
-            </w:pPr>
-            <w:r>
-              <w:t xml:space="preserve">(0.011)</w:t>
-            </w:r>
-          </w:p>
-        </w:tc>
-        <w:tc>
-          <w:tcPr/>
-          <w:p>
-            <w:pPr>
-              <w:pStyle w:val="Compact"/>
-              <w:jc w:val="left"/>
-            </w:pPr>
-            <w:r>
-              <w:t xml:space="preserve">(0.007)</w:t>
-            </w:r>
-          </w:p>
-        </w:tc>
-      </w:tr>
-      <w:tr>
-        <w:tc>
-          <w:tcPr/>
-          <w:p>
-            <w:pPr>
-              <w:pStyle w:val="Compact"/>
-              <w:jc w:val="left"/>
-            </w:pPr>
-            <w:r>
-              <w:t xml:space="preserve">Log weekly earnings</w:t>
-            </w:r>
-          </w:p>
-        </w:tc>
-        <w:tc>
-          <w:tcPr/>
-          <w:p>
-            <w:pPr>
-              <w:pStyle w:val="Compact"/>
-              <w:jc w:val="left"/>
-            </w:pPr>
-            <w:r>
-              <w:t xml:space="preserve">0.076</w:t>
-            </w:r>
-            <w:r>
-              <w:rPr>
-                <w:vertAlign w:val="superscript"/>
-              </w:rPr>
-              <w:t xml:space="preserve">**</w:t>
-            </w:r>
-          </w:p>
-        </w:tc>
-        <w:tc>
-          <w:tcPr/>
-          <w:p>
-            <w:pPr>
-              <w:pStyle w:val="Compact"/>
-              <w:jc w:val="left"/>
-            </w:pPr>
-            <w:r>
-              <w:t xml:space="preserve">0.059</w:t>
-            </w:r>
-            <w:r>
-              <w:rPr>
-                <w:vertAlign w:val="superscript"/>
-              </w:rPr>
-              <w:t xml:space="preserve">**</w:t>
-            </w:r>
-          </w:p>
-        </w:tc>
-        <w:tc>
-          <w:tcPr/>
-          <w:p>
-            <w:pPr>
-              <w:pStyle w:val="Compact"/>
-              <w:jc w:val="left"/>
-            </w:pPr>
-            <w:r>
-              <w:t xml:space="preserve">0.046</w:t>
-            </w:r>
-          </w:p>
-        </w:tc>
-        <w:tc>
-          <w:tcPr/>
-          <w:p>
-            <w:pPr>
-              <w:pStyle w:val="Compact"/>
-              <w:jc w:val="left"/>
-            </w:pPr>
-            <w:r>
-              <w:t xml:space="preserve">0.043</w:t>
-            </w:r>
-            <w:r>
-              <w:rPr>
-                <w:vertAlign w:val="superscript"/>
-              </w:rPr>
-              <w:t xml:space="preserve">***</w:t>
-            </w:r>
-          </w:p>
-        </w:tc>
-        <w:tc>
-          <w:tcPr/>
-          <w:p>
-            <w:pPr>
-              <w:pStyle w:val="Compact"/>
-              <w:jc w:val="left"/>
-            </w:pPr>
-            <w:r>
-              <w:t xml:space="preserve">0.058</w:t>
-            </w:r>
-            <w:r>
-              <w:rPr>
-                <w:vertAlign w:val="superscript"/>
-              </w:rPr>
-              <w:t xml:space="preserve">**</w:t>
-            </w:r>
-          </w:p>
-        </w:tc>
-        <w:tc>
-          <w:tcPr/>
-          <w:p>
-            <w:pPr>
-              <w:pStyle w:val="Compact"/>
-              <w:jc w:val="left"/>
-            </w:pPr>
-            <w:r>
-              <w:t xml:space="preserve">0.054</w:t>
-            </w:r>
-            <w:r>
-              <w:rPr>
-                <w:vertAlign w:val="superscript"/>
-              </w:rPr>
-              <w:t xml:space="preserve">***</w:t>
-            </w:r>
-          </w:p>
-        </w:tc>
-      </w:tr>
-      <w:tr>
-        <w:tc>
-          <w:tcPr/>
-          <w:p>
-            <w:pPr>
-              <w:pStyle w:val="Compact"/>
-            </w:pPr>
-          </w:p>
-        </w:tc>
-        <w:tc>
-          <w:tcPr/>
-          <w:p>
-            <w:pPr>
-              <w:pStyle w:val="Compact"/>
-              <w:jc w:val="left"/>
-            </w:pPr>
-            <w:r>
-              <w:t xml:space="preserve">(0.033)</w:t>
-            </w:r>
-          </w:p>
-        </w:tc>
-        <w:tc>
-          <w:tcPr/>
-          <w:p>
-            <w:pPr>
-              <w:pStyle w:val="Compact"/>
-              <w:jc w:val="left"/>
-            </w:pPr>
-            <w:r>
-              <w:t xml:space="preserve">(0.027)</w:t>
-            </w:r>
-          </w:p>
-        </w:tc>
-        <w:tc>
-          <w:tcPr/>
-          <w:p>
-            <w:pPr>
-              <w:pStyle w:val="Compact"/>
-              <w:jc w:val="left"/>
-            </w:pPr>
-            <w:r>
-              <w:t xml:space="preserve">(0.030)</w:t>
-            </w:r>
-          </w:p>
-        </w:tc>
-        <w:tc>
-          <w:tcPr/>
-          <w:p>
-            <w:pPr>
-              <w:pStyle w:val="Compact"/>
-              <w:jc w:val="left"/>
-            </w:pPr>
-            <w:r>
-              <w:t xml:space="preserve">(0.014)</w:t>
+              <w:t xml:space="preserve">(0.036)</w:t>
+            </w:r>
+          </w:p>
+        </w:tc>
+        <w:tc>
+          <w:tcPr/>
+          <w:p>
+            <w:pPr>
+              <w:pStyle w:val="Compact"/>
+              <w:jc w:val="left"/>
+            </w:pPr>
+            <w:r>
+              <w:t xml:space="preserve">(0.025)</w:t>
+            </w:r>
+          </w:p>
+        </w:tc>
+        <w:tc>
+          <w:tcPr/>
+          <w:p>
+            <w:pPr>
+              <w:pStyle w:val="Compact"/>
+              <w:jc w:val="left"/>
+            </w:pPr>
+            <w:r>
+              <w:t xml:space="preserve">(0.029)</w:t>
+            </w:r>
+          </w:p>
+        </w:tc>
+        <w:tc>
+          <w:tcPr/>
+          <w:p>
+            <w:pPr>
+              <w:pStyle w:val="Compact"/>
+              <w:jc w:val="left"/>
+            </w:pPr>
+            <w:r>
+              <w:t xml:space="preserve">(0.015)</w:t>
             </w:r>
           </w:p>
         </w:tc>
@@ -13036,7 +13085,7 @@
               <w:jc w:val="left"/>
             </w:pPr>
             <w:r>
-              <w:t xml:space="preserve">(0.015)</w:t>
+              <w:t xml:space="preserve">(0.017)</w:t>
             </w:r>
           </w:p>
         </w:tc>
@@ -13120,7 +13169,7 @@
         <w:pStyle w:val="FirstParagraph"/>
       </w:pPr>
       <w:r>
-        <w:t xml:space="preserve">Table 9 and Figure 9 split the wage effect by sex. The gain reaches both. Girls’ hourly wage rises 5.4 percent (s.e. 1.9) at 16–17, 3.4 (0.9) at 18–19 and 4.1 (1.0) pooled; boys’ 4.7 (1.7), 2.5 (1.4) and 3.5 (1.2). The girls’ gain is larger at every age, as their lower starting wage implies, but by less than a standard error, and by the third year after the increase both are at about 6 percent. Weekly earnings rise 5.5 (3.2) at 16–17 and 4.5 (2.6) at 18–19 for girls and 5.4 (4.8) and 3.7 (3.4) for boys, so hours did not fall for either. The employment estimate for girls at 16–17 in Section 5.3 therefore does not come with a smaller wage gain or a fall in the earnings of those who work. The stacked coefficients (Table 10) are 5.3 percent (s.e. 1.2), 2.6 (0.8) and 3.8 (0.8) for girls and 4.4 (0.9), 3.5 (1.0) and 4.0 (0.9) for boys.</w:t>
+        <w:t xml:space="preserve">Table 9 and Figure 9 split the wage effect by sex. The gain reaches both. Girls’ hourly wage rises 5.4 percent (s.e. 1.9) at 16–17, 3.4 (0.9) at 18–19 and 4.1 (1.0) pooled; boys’ 4.7 (1.7), 2.5 (1.4) and 3.5 (1.2). The girls’ gain is larger at every age, as their lower starting wage implies, but by less than a standard error, and by the third year after the increase both are at about 6 percent. Weekly earnings rise 5.5 (3.2) at 16–17 and 4.5 (2.6) at 18–19 for girls and 5.4 (4.8) and 3.7 (3.4) for boys, so hours did not fall for either. The employment estimate for girls at 16–17 in Section 5.3 therefore does not come with a smaller wage gain or a fall in the earnings of those who work. The stacked coefficients (Table 10) are 5.5 percent (s.e. 1.2), 2.6 (0.8) and 3.8 (0.8) for girls and 4.8 (0.9), 3.5 (1.0) and 4.1 (0.8) for boys.</w:t>
       </w:r>
     </w:p>
     <w:p>
@@ -13861,7 +13910,7 @@
               <w:jc w:val="left"/>
             </w:pPr>
             <w:r>
-              <w:t xml:space="preserve">0.053</w:t>
+              <w:t xml:space="preserve">0.055</w:t>
             </w:r>
             <w:r>
               <w:rPr>
@@ -13879,7 +13928,7 @@
               <w:jc w:val="left"/>
             </w:pPr>
             <w:r>
-              <w:t xml:space="preserve">0.044</w:t>
+              <w:t xml:space="preserve">0.048</w:t>
             </w:r>
             <w:r>
               <w:rPr>
@@ -13951,7 +14000,7 @@
               <w:jc w:val="left"/>
             </w:pPr>
             <w:r>
-              <w:t xml:space="preserve">0.040</w:t>
+              <w:t xml:space="preserve">0.041</w:t>
             </w:r>
             <w:r>
               <w:rPr>
@@ -14039,7 +14088,7 @@
               <w:jc w:val="left"/>
             </w:pPr>
             <w:r>
-              <w:t xml:space="preserve">(0.009)</w:t>
+              <w:t xml:space="preserve">(0.008)</w:t>
             </w:r>
           </w:p>
         </w:tc>
@@ -14065,19 +14114,19 @@
               <w:jc w:val="left"/>
             </w:pPr>
             <w:r>
-              <w:t xml:space="preserve">0.044</w:t>
-            </w:r>
-          </w:p>
-        </w:tc>
-        <w:tc>
-          <w:tcPr/>
-          <w:p>
-            <w:pPr>
-              <w:pStyle w:val="Compact"/>
-              <w:jc w:val="left"/>
-            </w:pPr>
-            <w:r>
-              <w:t xml:space="preserve">0.054</w:t>
+              <w:t xml:space="preserve">0.047</w:t>
+            </w:r>
+          </w:p>
+        </w:tc>
+        <w:tc>
+          <w:tcPr/>
+          <w:p>
+            <w:pPr>
+              <w:pStyle w:val="Compact"/>
+              <w:jc w:val="left"/>
+            </w:pPr>
+            <w:r>
+              <w:t xml:space="preserve">0.056</w:t>
             </w:r>
             <w:r>
               <w:rPr>
@@ -14095,7 +14144,7 @@
               <w:jc w:val="left"/>
             </w:pPr>
             <w:r>
-              <w:t xml:space="preserve">0.055</w:t>
+              <w:t xml:space="preserve">0.050</w:t>
             </w:r>
             <w:r>
               <w:rPr>
@@ -14113,7 +14162,7 @@
               <w:jc w:val="left"/>
             </w:pPr>
             <w:r>
-              <w:t xml:space="preserve">0.035</w:t>
+              <w:t xml:space="preserve">0.042</w:t>
             </w:r>
             <w:r>
               <w:rPr>
@@ -14131,25 +14180,7 @@
               <w:jc w:val="left"/>
             </w:pPr>
             <w:r>
-              <w:t xml:space="preserve">0.058</w:t>
-            </w:r>
-            <w:r>
-              <w:rPr>
-                <w:vertAlign w:val="superscript"/>
-              </w:rPr>
-              <w:t xml:space="preserve">***</w:t>
-            </w:r>
-          </w:p>
-        </w:tc>
-        <w:tc>
-          <w:tcPr/>
-          <w:p>
-            <w:pPr>
-              <w:pStyle w:val="Compact"/>
-              <w:jc w:val="left"/>
-            </w:pPr>
-            <w:r>
-              <w:t xml:space="preserve">0.045</w:t>
+              <w:t xml:space="preserve">0.050</w:t>
             </w:r>
             <w:r>
               <w:rPr>
@@ -14159,6 +14190,24 @@
             </w:r>
           </w:p>
         </w:tc>
+        <w:tc>
+          <w:tcPr/>
+          <w:p>
+            <w:pPr>
+              <w:pStyle w:val="Compact"/>
+              <w:jc w:val="left"/>
+            </w:pPr>
+            <w:r>
+              <w:t xml:space="preserve">0.051</w:t>
+            </w:r>
+            <w:r>
+              <w:rPr>
+                <w:vertAlign w:val="superscript"/>
+              </w:rPr>
+              <w:t xml:space="preserve">**</w:t>
+            </w:r>
+          </w:p>
+        </w:tc>
       </w:tr>
       <w:tr>
         <w:tc>
@@ -14177,6 +14226,18 @@
               <w:jc w:val="left"/>
             </w:pPr>
             <w:r>
+              <w:t xml:space="preserve">(0.031)</w:t>
+            </w:r>
+          </w:p>
+        </w:tc>
+        <w:tc>
+          <w:tcPr/>
+          <w:p>
+            <w:pPr>
+              <w:pStyle w:val="Compact"/>
+              <w:jc w:val="left"/>
+            </w:pPr>
+            <w:r>
               <w:t xml:space="preserve">(0.032)</w:t>
             </w:r>
           </w:p>
@@ -14189,30 +14250,6 @@
               <w:jc w:val="left"/>
             </w:pPr>
             <w:r>
-              <w:t xml:space="preserve">(0.032)</w:t>
-            </w:r>
-          </w:p>
-        </w:tc>
-        <w:tc>
-          <w:tcPr/>
-          <w:p>
-            <w:pPr>
-              <w:pStyle w:val="Compact"/>
-              <w:jc w:val="left"/>
-            </w:pPr>
-            <w:r>
-              <w:t xml:space="preserve">(0.017)</w:t>
-            </w:r>
-          </w:p>
-        </w:tc>
-        <w:tc>
-          <w:tcPr/>
-          <w:p>
-            <w:pPr>
-              <w:pStyle w:val="Compact"/>
-              <w:jc w:val="left"/>
-            </w:pPr>
-            <w:r>
               <w:t xml:space="preserve">(0.018)</w:t>
             </w:r>
           </w:p>
@@ -14225,19 +14262,31 @@
               <w:jc w:val="left"/>
             </w:pPr>
             <w:r>
-              <w:t xml:space="preserve">(0.017)</w:t>
-            </w:r>
-          </w:p>
-        </w:tc>
-        <w:tc>
-          <w:tcPr/>
-          <w:p>
-            <w:pPr>
-              <w:pStyle w:val="Compact"/>
-              <w:jc w:val="left"/>
-            </w:pPr>
-            <w:r>
-              <w:t xml:space="preserve">(0.022)</w:t>
+              <w:t xml:space="preserve">(0.018)</w:t>
+            </w:r>
+          </w:p>
+        </w:tc>
+        <w:tc>
+          <w:tcPr/>
+          <w:p>
+            <w:pPr>
+              <w:pStyle w:val="Compact"/>
+              <w:jc w:val="left"/>
+            </w:pPr>
+            <w:r>
+              <w:t xml:space="preserve">(0.020)</w:t>
+            </w:r>
+          </w:p>
+        </w:tc>
+        <w:tc>
+          <w:tcPr/>
+          <w:p>
+            <w:pPr>
+              <w:pStyle w:val="Compact"/>
+              <w:jc w:val="left"/>
+            </w:pPr>
+            <w:r>
+              <w:t xml:space="preserve">(0.020)</w:t>
             </w:r>
           </w:p>
         </w:tc>
@@ -14401,7 +14450,7 @@
         <w:t xml:space="preserve"> </w:t>
       </w:r>
       <w:r>
-        <w:t xml:space="preserve">(3.1) for white teens. The first stage is present, and larger, for the group whose families have lower incomes, and Section 5.4 shows that their time allocation did not respond to it. The stacked coefficients (Table 12) are 4.8 percent (s.e. 1.0), 2.6 (1.2) and 3.6 (0.9) for white teens and 5.7 (1.2), 4.2 (1.0) and 4.8 (0.9) for non-white teens.</w:t>
+        <w:t xml:space="preserve">(3.1) for white teens. The first stage is present, and larger, for the group whose families have lower incomes, and Section 5.4 shows that their time allocation did not respond to it. The stacked coefficients (Table 12) are 4.8 percent (s.e. 1.1), 2.5 (1.2) and 3.5 (0.9) for white teens and 6.1 (1.2), 3.8 (1.1) and 4.5 (0.9) for non-white teens.</w:t>
       </w:r>
     </w:p>
     <w:p>
@@ -15160,7 +15209,7 @@
               <w:jc w:val="left"/>
             </w:pPr>
             <w:r>
-              <w:t xml:space="preserve">0.057</w:t>
+              <w:t xml:space="preserve">0.061</w:t>
             </w:r>
             <w:r>
               <w:rPr>
@@ -15178,7 +15227,7 @@
               <w:jc w:val="left"/>
             </w:pPr>
             <w:r>
-              <w:t xml:space="preserve">0.026</w:t>
+              <w:t xml:space="preserve">0.025</w:t>
             </w:r>
             <w:r>
               <w:rPr>
@@ -15196,7 +15245,7 @@
               <w:jc w:val="left"/>
             </w:pPr>
             <w:r>
-              <w:t xml:space="preserve">0.042</w:t>
+              <w:t xml:space="preserve">0.038</w:t>
             </w:r>
             <w:r>
               <w:rPr>
@@ -15214,7 +15263,7 @@
               <w:jc w:val="left"/>
             </w:pPr>
             <w:r>
-              <w:t xml:space="preserve">0.036</w:t>
+              <w:t xml:space="preserve">0.035</w:t>
             </w:r>
             <w:r>
               <w:rPr>
@@ -15232,7 +15281,7 @@
               <w:jc w:val="left"/>
             </w:pPr>
             <w:r>
-              <w:t xml:space="preserve">0.048</w:t>
+              <w:t xml:space="preserve">0.045</w:t>
             </w:r>
             <w:r>
               <w:rPr>
@@ -15260,7 +15309,7 @@
               <w:jc w:val="left"/>
             </w:pPr>
             <w:r>
-              <w:t xml:space="preserve">(0.010)</w:t>
+              <w:t xml:space="preserve">(0.011)</w:t>
             </w:r>
           </w:p>
         </w:tc>
@@ -15296,7 +15345,7 @@
               <w:jc w:val="left"/>
             </w:pPr>
             <w:r>
-              <w:t xml:space="preserve">(0.010)</w:t>
+              <w:t xml:space="preserve">(0.011)</w:t>
             </w:r>
           </w:p>
         </w:tc>
@@ -15346,7 +15395,7 @@
               <w:jc w:val="left"/>
             </w:pPr>
             <w:r>
-              <w:t xml:space="preserve">0.053</w:t>
+              <w:t xml:space="preserve">0.050</w:t>
             </w:r>
             <w:r>
               <w:rPr>
@@ -15364,7 +15413,7 @@
               <w:jc w:val="left"/>
             </w:pPr>
             <w:r>
-              <w:t xml:space="preserve">0.072</w:t>
+              <w:t xml:space="preserve">0.070</w:t>
             </w:r>
             <w:r>
               <w:rPr>
@@ -15382,7 +15431,7 @@
               <w:jc w:val="left"/>
             </w:pPr>
             <w:r>
-              <w:t xml:space="preserve">0.054</w:t>
+              <w:t xml:space="preserve">0.051</w:t>
             </w:r>
             <w:r>
               <w:rPr>
@@ -15400,25 +15449,19 @@
               <w:jc w:val="left"/>
             </w:pPr>
             <w:r>
-              <w:t xml:space="preserve">0.043</w:t>
-            </w:r>
-            <w:r>
-              <w:rPr>
-                <w:vertAlign w:val="superscript"/>
-              </w:rPr>
-              <w:t xml:space="preserve">**</w:t>
-            </w:r>
-          </w:p>
-        </w:tc>
-        <w:tc>
-          <w:tcPr/>
-          <w:p>
-            <w:pPr>
-              <w:pStyle w:val="Compact"/>
-              <w:jc w:val="left"/>
-            </w:pPr>
-            <w:r>
-              <w:t xml:space="preserve">0.057</w:t>
+              <w:t xml:space="preserve">0.035</w:t>
+            </w:r>
+          </w:p>
+        </w:tc>
+        <w:tc>
+          <w:tcPr/>
+          <w:p>
+            <w:pPr>
+              <w:pStyle w:val="Compact"/>
+              <w:jc w:val="left"/>
+            </w:pPr>
+            <w:r>
+              <w:t xml:space="preserve">0.052</w:t>
             </w:r>
             <w:r>
               <w:rPr>
@@ -15436,13 +15479,13 @@
               <w:jc w:val="left"/>
             </w:pPr>
             <w:r>
-              <w:t xml:space="preserve">0.049</w:t>
+              <w:t xml:space="preserve">0.041</w:t>
             </w:r>
             <w:r>
               <w:rPr>
                 <w:vertAlign w:val="superscript"/>
               </w:rPr>
-              <w:t xml:space="preserve">**</w:t>
+              <w:t xml:space="preserve">*</w:t>
             </w:r>
           </w:p>
         </w:tc>
@@ -15476,55 +15519,55 @@
               <w:jc w:val="left"/>
             </w:pPr>
             <w:r>
-              <w:t xml:space="preserve">(0.039)</w:t>
-            </w:r>
-          </w:p>
-        </w:tc>
-        <w:tc>
-          <w:tcPr/>
-          <w:p>
-            <w:pPr>
-              <w:pStyle w:val="Compact"/>
-              <w:jc w:val="left"/>
-            </w:pPr>
-            <w:r>
-              <w:t xml:space="preserve">(0.021)</w:t>
-            </w:r>
-          </w:p>
-        </w:tc>
-        <w:tc>
-          <w:tcPr/>
-          <w:p>
-            <w:pPr>
-              <w:pStyle w:val="Compact"/>
-              <w:jc w:val="left"/>
-            </w:pPr>
-            <w:r>
-              <w:t xml:space="preserve">(0.021)</w:t>
-            </w:r>
-          </w:p>
-        </w:tc>
-        <w:tc>
-          <w:tcPr/>
-          <w:p>
-            <w:pPr>
-              <w:pStyle w:val="Compact"/>
-              <w:jc w:val="left"/>
-            </w:pPr>
-            <w:r>
-              <w:t xml:space="preserve">(0.017)</w:t>
-            </w:r>
-          </w:p>
-        </w:tc>
-        <w:tc>
-          <w:tcPr/>
-          <w:p>
-            <w:pPr>
-              <w:pStyle w:val="Compact"/>
-              <w:jc w:val="left"/>
-            </w:pPr>
-            <w:r>
-              <w:t xml:space="preserve">(0.022)</w:t>
+              <w:t xml:space="preserve">(0.037)</w:t>
+            </w:r>
+          </w:p>
+        </w:tc>
+        <w:tc>
+          <w:tcPr/>
+          <w:p>
+            <w:pPr>
+              <w:pStyle w:val="Compact"/>
+              <w:jc w:val="left"/>
+            </w:pPr>
+            <w:r>
+              <w:t xml:space="preserve">(0.020)</w:t>
+            </w:r>
+          </w:p>
+        </w:tc>
+        <w:tc>
+          <w:tcPr/>
+          <w:p>
+            <w:pPr>
+              <w:pStyle w:val="Compact"/>
+              <w:jc w:val="left"/>
+            </w:pPr>
+            <w:r>
+              <w:t xml:space="preserve">(0.024)</w:t>
+            </w:r>
+          </w:p>
+        </w:tc>
+        <w:tc>
+          <w:tcPr/>
+          <w:p>
+            <w:pPr>
+              <w:pStyle w:val="Compact"/>
+              <w:jc w:val="left"/>
+            </w:pPr>
+            <w:r>
+              <w:t xml:space="preserve">(0.018)</w:t>
+            </w:r>
+          </w:p>
+        </w:tc>
+        <w:tc>
+          <w:tcPr/>
+          <w:p>
+            <w:pPr>
+              <w:pStyle w:val="Compact"/>
+              <w:jc w:val="left"/>
+            </w:pPr>
+            <w:r>
+              <w:t xml:space="preserve">(0.024)</w:t>
             </w:r>
           </w:p>
         </w:tc>

</xml_diff>

<commit_message>
minwage: footnote deriving the monopsony wage condition, with Robinson (1933) and Card and Krueger (1995) references
Co-Authored-By: Claude Fable 5.1 <noreply@anthropic.com>
Claude-Session: https://claude.ai/code/session_01Rd74HvTpozFfpcfGubVirr
</commit_message>
<xml_diff>
--- a/minwage/paper/minwage_teens.docx
+++ b/minwage/paper/minwage_teens.docx
@@ -2068,7 +2068,7 @@
       </w:r>
     </w:p>
     <w:bookmarkEnd w:id="21"/>
-    <w:bookmarkStart w:id="22" w:name="theoretical-foundation"/>
+    <w:bookmarkStart w:id="23" w:name="theoretical-foundation"/>
     <w:p>
       <w:pPr>
         <w:pStyle w:val="Heading1"/>
@@ -3107,7 +3107,19 @@
         <w:pStyle w:val="FirstParagraph"/>
       </w:pPr>
       <w:r>
-        <w:t xml:space="preserve">and employment is below the competitive level. A minimum wage in the interval</w:t>
+        <w:t xml:space="preserve">and employment is below the competitive level.</w:t>
+      </w:r>
+      <w:r>
+        <w:rPr>
+          <w:rStyle w:val="FootnoteReference"/>
+        </w:rPr>
+        <w:footnoteReference w:id="22"/>
+      </w:r>
+      <w:r>
+        <w:t xml:space="preserve"> </w:t>
+      </w:r>
+      <w:r>
+        <w:t xml:space="preserve">A minimum wage in the interval</w:t>
       </w:r>
       <w:r>
         <w:t xml:space="preserve"> </w:t>
@@ -3282,8 +3294,8 @@
         <w:t xml:space="preserve">. For 16–17 year olds, compulsory schooling makes the decision largely inframarginal in any case, and for teens from families with limited resources a higher wage relaxes the constraint on paying for school, which pushes enrollment the other way (Ehrenberg and Marcus, 1982; Smith, 2021). The model therefore delivers three predictions. The wage of teens who work rises with the minimum. Employment and hours fall if the market is competitive and do not fall if employers set wages; earnings of teen workers rise in proportion to the wage in the second case and by less in the first. Enrollment and the combinations of school and work move by amounts that are small relative to a percentage point under either market structure. A finding that the wage rises, employment and earnings do not fall, and the allocation of time is unchanged is what the non-competitive case predicts.</w:t>
       </w:r>
     </w:p>
-    <w:bookmarkEnd w:id="22"/>
-    <w:bookmarkStart w:id="29" w:name="data-and-descriptive-statistics"/>
+    <w:bookmarkEnd w:id="23"/>
+    <w:bookmarkStart w:id="30" w:name="data-and-descriptive-statistics"/>
     <w:p>
       <w:pPr>
         <w:pStyle w:val="Heading1"/>
@@ -3348,18 +3360,18 @@
                 <wp:inline>
                   <wp:extent cx="2667000" cy="1018309"/>
                   <wp:effectExtent b="0" l="0" r="0" t="0"/>
-                  <wp:docPr descr="" title="" id="24" name="Picture"/>
+                  <wp:docPr descr="" title="" id="25" name="Picture"/>
                   <a:graphic>
                     <a:graphicData uri="http://schemas.openxmlformats.org/drawingml/2006/picture">
                       <pic:pic>
                         <pic:nvPicPr>
-                          <pic:cNvPr descr="figures/fig1_trends.png" id="25" name="Picture"/>
+                          <pic:cNvPr descr="figures/fig1_trends.png" id="26" name="Picture"/>
                           <pic:cNvPicPr>
                             <a:picLocks noChangeArrowheads="1" noChangeAspect="1"/>
                           </pic:cNvPicPr>
                         </pic:nvPicPr>
                         <pic:blipFill>
-                          <a:blip r:embed="rId23"/>
+                          <a:blip r:embed="rId24"/>
                           <a:stretch>
                             <a:fillRect/>
                           </a:stretch>
@@ -3432,18 +3444,18 @@
                 <wp:inline>
                   <wp:extent cx="2266740" cy="1208927"/>
                   <wp:effectExtent b="0" l="0" r="0" t="0"/>
-                  <wp:docPr descr="" title="" id="27" name="Picture"/>
+                  <wp:docPr descr="" title="" id="28" name="Picture"/>
                   <a:graphic>
                     <a:graphicData uri="http://schemas.openxmlformats.org/drawingml/2006/picture">
                       <pic:pic>
                         <pic:nvPicPr>
-                          <pic:cNvPr descr="figures/fig2_minwage.png" id="28" name="Picture"/>
+                          <pic:cNvPr descr="figures/fig2_minwage.png" id="29" name="Picture"/>
                           <pic:cNvPicPr>
                             <a:picLocks noChangeArrowheads="1" noChangeAspect="1"/>
                           </pic:cNvPicPr>
                         </pic:nvPicPr>
                         <pic:blipFill>
-                          <a:blip r:embed="rId26"/>
+                          <a:blip r:embed="rId27"/>
                           <a:stretch>
                             <a:fillRect/>
                           </a:stretch>
@@ -4426,8 +4438,8 @@
         <w:t xml:space="preserve">Notes: Weighted means over the twelve months before each event, pooled across events. Hourly wage among hourly-paid workers in the outgoing rotation groups, earnings-weighted.</w:t>
       </w:r>
     </w:p>
-    <w:bookmarkEnd w:id="29"/>
-    <w:bookmarkStart w:id="34" w:name="empirical-strategy"/>
+    <w:bookmarkEnd w:id="30"/>
+    <w:bookmarkStart w:id="35" w:name="empirical-strategy"/>
     <w:p>
       <w:pPr>
         <w:pStyle w:val="Heading1"/>
@@ -4436,7 +4448,7 @@
         <w:t xml:space="preserve">4 Empirical Strategy</w:t>
       </w:r>
     </w:p>
-    <w:bookmarkStart w:id="30" w:name="units"/>
+    <w:bookmarkStart w:id="31" w:name="units"/>
     <w:p>
       <w:pPr>
         <w:pStyle w:val="Heading2"/>
@@ -4453,8 +4465,8 @@
         <w:t xml:space="preserve">The minimum wage a teenager faces is set by the state and, in a growing number of places, by the city or county. Sixty cities and counties set minimums above their state’s between 2004 and 2025, from San Francisco and Santa Fe in 2004 to Seattle, Chicago, Los Angeles and the Minneapolis–St. Paul cities in the following decade. The geographic units of the analysis are therefore the jurisdictions whose wage floor a teen faces: each identified county with a local minimum is a unit with its own effective minimum wage series, the local rate applied to the whole county, and the remainder of each state, its teens outside those counties, is a unit at the state rate. There are 107 units, 56 of them counties in 13 states, and the effective minimum of a unit in a month is the larger of its own rate and the federal minimum. A Seattle teen is at Seattle’s minimum, a teen elsewhere in Washington at the state’s, and when Seattle raises its minimum King County has an event of its own.</w:t>
       </w:r>
     </w:p>
-    <w:bookmarkEnd w:id="30"/>
-    <w:bookmarkStart w:id="31" w:name="events-and-clean-controls"/>
+    <w:bookmarkEnd w:id="31"/>
+    <w:bookmarkStart w:id="32" w:name="events-and-clean-controls"/>
     <w:p>
       <w:pPr>
         <w:pStyle w:val="Heading2"/>
@@ -4507,8 +4519,8 @@
         <w:t xml:space="preserve">The controls for an event are the units in other states that had no qualifying increase in the window from 36 months before the event to 47 months after it. For the events from 2010 on, the federal minimum did not change, so these units had no change in their minimum at all; each event has a median of 28 such controls. The windows of the four events of 2010–2013 begin before the federal increase of July 2009, which raised the minimum in treated and control units alike and is absorbed by the comparison with the year before the event. No events before 2010 are used, and no observations before January 2007 enter any estimate.</w:t>
       </w:r>
     </w:p>
-    <w:bookmarkEnd w:id="31"/>
-    <w:bookmarkStart w:id="32" w:name="estimator"/>
+    <w:bookmarkEnd w:id="32"/>
+    <w:bookmarkStart w:id="33" w:name="estimator"/>
     <w:p>
       <w:pPr>
         <w:pStyle w:val="Heading2"/>
@@ -5386,8 +5398,8 @@
         <w:t xml:space="preserve">Identification requires that, absent the increase, teens in the treated unit would have followed the same path as teens in the control units over the seven-year window. The three pre-event coefficients test the assumption directly. Because the events are laws passed by legislatures, councils and ballot measures, and treated jurisdictions are on average richer and more urban than federal-floor states, the assumption is about trends rather than levels, and Section 6 shows the results with control sets that vary from all clean units to federal-floor states only, with equal weights, without the pandemic years, in school months only, and with states rather than counties as the units.</w:t>
       </w:r>
     </w:p>
-    <w:bookmarkEnd w:id="32"/>
-    <w:bookmarkStart w:id="33" w:name="regression-counterpart"/>
+    <w:bookmarkEnd w:id="33"/>
+    <w:bookmarkStart w:id="34" w:name="regression-counterpart"/>
     <w:p>
       <w:pPr>
         <w:pStyle w:val="Heading2"/>
@@ -5854,9 +5866,9 @@
         <w:t xml:space="preserve">as the base, in weighting observations rather than events, and in the individual controls, so the two need not coincide exactly. Without the controls the regression is numerically the regression on unit-month cell means, and the controls move no school–work coefficient by more than a quarter of a point and no wage or earnings coefficient by more than about a point. Appendix C reports the two-way fixed effects regression of the outcome on the log minimum wage, the specification of Neumark and Shupe (2019) and Smith (2021), and shows where it agrees with the event design and where it does not.</w:t>
       </w:r>
     </w:p>
-    <w:bookmarkEnd w:id="33"/>
     <w:bookmarkEnd w:id="34"/>
-    <w:bookmarkStart w:id="67" w:name="results"/>
+    <w:bookmarkEnd w:id="35"/>
+    <w:bookmarkStart w:id="68" w:name="results"/>
     <w:p>
       <w:pPr>
         <w:pStyle w:val="Heading1"/>
@@ -5865,7 +5877,7 @@
         <w:t xml:space="preserve">5 Results</w:t>
       </w:r>
     </w:p>
-    <w:bookmarkStart w:id="38" w:name="school-and-work"/>
+    <w:bookmarkStart w:id="39" w:name="school-and-work"/>
     <w:p>
       <w:pPr>
         <w:pStyle w:val="Heading2"/>
@@ -7031,18 +7043,18 @@
                 <wp:inline>
                   <wp:extent cx="2667000" cy="2051538"/>
                   <wp:effectExtent b="0" l="0" r="0" t="0"/>
-                  <wp:docPr descr="" title="" id="36" name="Picture"/>
+                  <wp:docPr descr="" title="" id="37" name="Picture"/>
                   <a:graphic>
                     <a:graphicData uri="http://schemas.openxmlformats.org/drawingml/2006/picture">
                       <pic:pic>
                         <pic:nvPicPr>
-                          <pic:cNvPr descr="figures/figR1_groups.png" id="37" name="Picture"/>
+                          <pic:cNvPr descr="figures/figR1_groups.png" id="38" name="Picture"/>
                           <pic:cNvPicPr>
                             <a:picLocks noChangeArrowheads="1" noChangeAspect="1"/>
                           </pic:cNvPicPr>
                         </pic:nvPicPr>
                         <pic:blipFill>
-                          <a:blip r:embed="rId35"/>
+                          <a:blip r:embed="rId36"/>
                           <a:stretch>
                             <a:fillRect/>
                           </a:stretch>
@@ -7091,8 +7103,8 @@
         <w:t xml:space="preserve">Figure 3: Event-time effects on the four school–work shares, by age, 73 events from 2010</w:t>
       </w:r>
     </w:p>
-    <w:bookmarkEnd w:id="38"/>
-    <w:bookmarkStart w:id="42" w:name="X01e4a4e9b7909117db9798cdab50a84efadf01e"/>
+    <w:bookmarkEnd w:id="39"/>
+    <w:bookmarkStart w:id="43" w:name="X01e4a4e9b7909117db9798cdab50a84efadf01e"/>
     <w:p>
       <w:pPr>
         <w:pStyle w:val="Heading2"/>
@@ -8400,18 +8412,18 @@
           <wp:inline>
             <wp:extent cx="5334000" cy="4103076"/>
             <wp:effectExtent b="0" l="0" r="0" t="0"/>
-            <wp:docPr descr="" title="" id="40" name="Picture"/>
+            <wp:docPr descr="" title="" id="41" name="Picture"/>
             <a:graphic>
               <a:graphicData uri="http://schemas.openxmlformats.org/drawingml/2006/picture">
                 <pic:pic>
                   <pic:nvPicPr>
-                    <pic:cNvPr descr="figures/figR2_groups_ses.png" id="41" name="Picture"/>
+                    <pic:cNvPr descr="figures/figR2_groups_ses.png" id="42" name="Picture"/>
                     <pic:cNvPicPr>
                       <a:picLocks noChangeArrowheads="1" noChangeAspect="1"/>
                     </pic:cNvPicPr>
                   </pic:nvPicPr>
                   <pic:blipFill>
-                    <a:blip r:embed="rId39"/>
+                    <a:blip r:embed="rId40"/>
                     <a:stretch>
                       <a:fillRect/>
                     </a:stretch>
@@ -8446,8 +8458,8 @@
         <w:t xml:space="preserve">Figure 4: Event-time effects on the four school–work shares by family income, ages 16–19</w:t>
       </w:r>
     </w:p>
-    <w:bookmarkEnd w:id="42"/>
-    <w:bookmarkStart w:id="46" w:name="school-and-work-by-sex"/>
+    <w:bookmarkEnd w:id="43"/>
+    <w:bookmarkStart w:id="47" w:name="school-and-work-by-sex"/>
     <w:p>
       <w:pPr>
         <w:pStyle w:val="Heading2"/>
@@ -10004,18 +10016,18 @@
           <wp:inline>
             <wp:extent cx="5334000" cy="4103076"/>
             <wp:effectExtent b="0" l="0" r="0" t="0"/>
-            <wp:docPr descr="" title="" id="44" name="Picture"/>
+            <wp:docPr descr="" title="" id="45" name="Picture"/>
             <a:graphic>
               <a:graphicData uri="http://schemas.openxmlformats.org/drawingml/2006/picture">
                 <pic:pic>
                   <pic:nvPicPr>
-                    <pic:cNvPr descr="figures/figR2_groups_sex.png" id="45" name="Picture"/>
+                    <pic:cNvPr descr="figures/figR2_groups_sex.png" id="46" name="Picture"/>
                     <pic:cNvPicPr>
                       <a:picLocks noChangeArrowheads="1" noChangeAspect="1"/>
                     </pic:cNvPicPr>
                   </pic:nvPicPr>
                   <pic:blipFill>
-                    <a:blip r:embed="rId43"/>
+                    <a:blip r:embed="rId44"/>
                     <a:stretch>
                       <a:fillRect/>
                     </a:stretch>
@@ -10050,8 +10062,8 @@
         <w:t xml:space="preserve">Figure 5: Event-time effects on the four school–work shares by sex, ages 16–19</w:t>
       </w:r>
     </w:p>
-    <w:bookmarkEnd w:id="46"/>
-    <w:bookmarkStart w:id="50" w:name="school-and-work-by-race"/>
+    <w:bookmarkEnd w:id="47"/>
+    <w:bookmarkStart w:id="51" w:name="school-and-work-by-race"/>
     <w:p>
       <w:pPr>
         <w:pStyle w:val="Heading2"/>
@@ -11574,18 +11586,18 @@
           <wp:inline>
             <wp:extent cx="5334000" cy="4103076"/>
             <wp:effectExtent b="0" l="0" r="0" t="0"/>
-            <wp:docPr descr="" title="" id="48" name="Picture"/>
+            <wp:docPr descr="" title="" id="49" name="Picture"/>
             <a:graphic>
               <a:graphicData uri="http://schemas.openxmlformats.org/drawingml/2006/picture">
                 <pic:pic>
                   <pic:nvPicPr>
-                    <pic:cNvPr descr="figures/figR2_groups_race.png" id="49" name="Picture"/>
+                    <pic:cNvPr descr="figures/figR2_groups_race.png" id="50" name="Picture"/>
                     <pic:cNvPicPr>
                       <a:picLocks noChangeArrowheads="1" noChangeAspect="1"/>
                     </pic:cNvPicPr>
                   </pic:nvPicPr>
                   <pic:blipFill>
-                    <a:blip r:embed="rId47"/>
+                    <a:blip r:embed="rId48"/>
                     <a:stretch>
                       <a:fillRect/>
                     </a:stretch>
@@ -11620,8 +11632,8 @@
         <w:t xml:space="preserve">Figure 6: Event-time effects on the four school–work shares by race, ages 16–19</w:t>
       </w:r>
     </w:p>
-    <w:bookmarkEnd w:id="50"/>
-    <w:bookmarkStart w:id="54" w:name="wages"/>
+    <w:bookmarkEnd w:id="51"/>
+    <w:bookmarkStart w:id="55" w:name="wages"/>
     <w:p>
       <w:pPr>
         <w:pStyle w:val="Heading2"/>
@@ -11971,18 +11983,18 @@
           <wp:inline>
             <wp:extent cx="4533900" cy="3487615"/>
             <wp:effectExtent b="0" l="0" r="0" t="0"/>
-            <wp:docPr descr="" title="" id="52" name="Picture"/>
+            <wp:docPr descr="" title="" id="53" name="Picture"/>
             <a:graphic>
               <a:graphicData uri="http://schemas.openxmlformats.org/drawingml/2006/picture">
                 <pic:pic>
                   <pic:nvPicPr>
-                    <pic:cNvPr descr="figures/figR3_wage.png" id="53" name="Picture"/>
+                    <pic:cNvPr descr="figures/figR3_wage.png" id="54" name="Picture"/>
                     <pic:cNvPicPr>
                       <a:picLocks noChangeArrowheads="1" noChangeAspect="1"/>
                     </pic:cNvPicPr>
                   </pic:nvPicPr>
                   <pic:blipFill>
-                    <a:blip r:embed="rId51"/>
+                    <a:blip r:embed="rId52"/>
                     <a:stretch>
                       <a:fillRect/>
                     </a:stretch>
@@ -12017,8 +12029,8 @@
         <w:t xml:space="preserve">Figure 7: Event-time effects on the log hourly wage of hourly-paid teens, by age</w:t>
       </w:r>
     </w:p>
-    <w:bookmarkEnd w:id="54"/>
-    <w:bookmarkStart w:id="58" w:name="wages-by-socioeconomic-standing"/>
+    <w:bookmarkEnd w:id="55"/>
+    <w:bookmarkStart w:id="59" w:name="wages-by-socioeconomic-standing"/>
     <w:p>
       <w:pPr>
         <w:pStyle w:val="Heading2"/>
@@ -13108,18 +13120,18 @@
           <wp:inline>
             <wp:extent cx="5334000" cy="1493520"/>
             <wp:effectExtent b="0" l="0" r="0" t="0"/>
-            <wp:docPr descr="" title="" id="56" name="Picture"/>
+            <wp:docPr descr="" title="" id="57" name="Picture"/>
             <a:graphic>
               <a:graphicData uri="http://schemas.openxmlformats.org/drawingml/2006/picture">
                 <pic:pic>
                   <pic:nvPicPr>
-                    <pic:cNvPr descr="figures/figR4_wage_ses.png" id="57" name="Picture"/>
+                    <pic:cNvPr descr="figures/figR4_wage_ses.png" id="58" name="Picture"/>
                     <pic:cNvPicPr>
                       <a:picLocks noChangeArrowheads="1" noChangeAspect="1"/>
                     </pic:cNvPicPr>
                   </pic:nvPicPr>
                   <pic:blipFill>
-                    <a:blip r:embed="rId55"/>
+                    <a:blip r:embed="rId56"/>
                     <a:stretch>
                       <a:fillRect/>
                     </a:stretch>
@@ -13154,8 +13166,8 @@
         <w:t xml:space="preserve">Figure 8: Event-time effects on the log hourly wage by family income and age</w:t>
       </w:r>
     </w:p>
-    <w:bookmarkEnd w:id="58"/>
-    <w:bookmarkStart w:id="62" w:name="wages-by-sex"/>
+    <w:bookmarkEnd w:id="59"/>
+    <w:bookmarkStart w:id="63" w:name="wages-by-sex"/>
     <w:p>
       <w:pPr>
         <w:pStyle w:val="Heading2"/>
@@ -14309,18 +14321,18 @@
           <wp:inline>
             <wp:extent cx="5334000" cy="1493520"/>
             <wp:effectExtent b="0" l="0" r="0" t="0"/>
-            <wp:docPr descr="" title="" id="60" name="Picture"/>
+            <wp:docPr descr="" title="" id="61" name="Picture"/>
             <a:graphic>
               <a:graphicData uri="http://schemas.openxmlformats.org/drawingml/2006/picture">
                 <pic:pic>
                   <pic:nvPicPr>
-                    <pic:cNvPr descr="figures/figR4_wage_sex.png" id="61" name="Picture"/>
+                    <pic:cNvPr descr="figures/figR4_wage_sex.png" id="62" name="Picture"/>
                     <pic:cNvPicPr>
                       <a:picLocks noChangeArrowheads="1" noChangeAspect="1"/>
                     </pic:cNvPicPr>
                   </pic:nvPicPr>
                   <pic:blipFill>
-                    <a:blip r:embed="rId59"/>
+                    <a:blip r:embed="rId60"/>
                     <a:stretch>
                       <a:fillRect/>
                     </a:stretch>
@@ -14355,8 +14367,8 @@
         <w:t xml:space="preserve">Figure 9: Event-time effects on the log hourly wage by sex and age</w:t>
       </w:r>
     </w:p>
-    <w:bookmarkEnd w:id="62"/>
-    <w:bookmarkStart w:id="66" w:name="wages-by-race"/>
+    <w:bookmarkEnd w:id="63"/>
+    <w:bookmarkStart w:id="67" w:name="wages-by-race"/>
     <w:p>
       <w:pPr>
         <w:pStyle w:val="Heading2"/>
@@ -15590,18 +15602,18 @@
           <wp:inline>
             <wp:extent cx="5334000" cy="1493520"/>
             <wp:effectExtent b="0" l="0" r="0" t="0"/>
-            <wp:docPr descr="" title="" id="64" name="Picture"/>
+            <wp:docPr descr="" title="" id="65" name="Picture"/>
             <a:graphic>
               <a:graphicData uri="http://schemas.openxmlformats.org/drawingml/2006/picture">
                 <pic:pic>
                   <pic:nvPicPr>
-                    <pic:cNvPr descr="figures/figR4_wage_race.png" id="65" name="Picture"/>
+                    <pic:cNvPr descr="figures/figR4_wage_race.png" id="66" name="Picture"/>
                     <pic:cNvPicPr>
                       <a:picLocks noChangeArrowheads="1" noChangeAspect="1"/>
                     </pic:cNvPicPr>
                   </pic:nvPicPr>
                   <pic:blipFill>
-                    <a:blip r:embed="rId63"/>
+                    <a:blip r:embed="rId64"/>
                     <a:stretch>
                       <a:fillRect/>
                     </a:stretch>
@@ -15636,9 +15648,9 @@
         <w:t xml:space="preserve">Figure 10: Event-time effects on the log hourly wage by race and age</w:t>
       </w:r>
     </w:p>
-    <w:bookmarkEnd w:id="66"/>
     <w:bookmarkEnd w:id="67"/>
-    <w:bookmarkStart w:id="77" w:name="robustness"/>
+    <w:bookmarkEnd w:id="68"/>
+    <w:bookmarkStart w:id="78" w:name="robustness"/>
     <w:p>
       <w:pPr>
         <w:pStyle w:val="Heading1"/>
@@ -19800,18 +19812,18 @@
           <wp:inline>
             <wp:extent cx="4533900" cy="2493645"/>
             <wp:effectExtent b="0" l="0" r="0" t="0"/>
-            <wp:docPr descr="" title="" id="69" name="Picture"/>
+            <wp:docPr descr="" title="" id="70" name="Picture"/>
             <a:graphic>
               <a:graphicData uri="http://schemas.openxmlformats.org/drawingml/2006/picture">
                 <pic:pic>
                   <pic:nvPicPr>
-                    <pic:cNvPr descr="figures/figA1_state_first_stage.png" id="70" name="Picture"/>
+                    <pic:cNvPr descr="figures/figA1_state_first_stage.png" id="71" name="Picture"/>
                     <pic:cNvPicPr>
                       <a:picLocks noChangeArrowheads="1" noChangeAspect="1"/>
                     </pic:cNvPicPr>
                   </pic:nvPicPr>
                   <pic:blipFill>
-                    <a:blip r:embed="rId68"/>
+                    <a:blip r:embed="rId69"/>
                     <a:stretch>
                       <a:fillRect/>
                     </a:stretch>
@@ -19855,18 +19867,18 @@
           <wp:inline>
             <wp:extent cx="5334000" cy="2036618"/>
             <wp:effectExtent b="0" l="0" r="0" t="0"/>
-            <wp:docPr descr="" title="" id="72" name="Picture"/>
+            <wp:docPr descr="" title="" id="73" name="Picture"/>
             <a:graphic>
               <a:graphicData uri="http://schemas.openxmlformats.org/drawingml/2006/picture">
                 <pic:pic>
                   <pic:nvPicPr>
-                    <pic:cNvPr descr="figures/figA2_state_event_main.png" id="73" name="Picture"/>
+                    <pic:cNvPr descr="figures/figA2_state_event_main.png" id="74" name="Picture"/>
                     <pic:cNvPicPr>
                       <a:picLocks noChangeArrowheads="1" noChangeAspect="1"/>
                     </pic:cNvPicPr>
                   </pic:nvPicPr>
                   <pic:blipFill>
-                    <a:blip r:embed="rId71"/>
+                    <a:blip r:embed="rId72"/>
                     <a:stretch>
                       <a:fillRect/>
                     </a:stretch>
@@ -19925,18 +19937,18 @@
                 <wp:inline>
                   <wp:extent cx="2266740" cy="5216524"/>
                   <wp:effectExtent b="0" l="0" r="0" t="0"/>
-                  <wp:docPr descr="" title="" id="75" name="Picture"/>
+                  <wp:docPr descr="" title="" id="76" name="Picture"/>
                   <a:graphic>
                     <a:graphicData uri="http://schemas.openxmlformats.org/drawingml/2006/picture">
                       <pic:pic>
                         <pic:nvPicPr>
-                          <pic:cNvPr descr="figures/fig6_byevent.png" id="76" name="Picture"/>
+                          <pic:cNvPr descr="figures/fig6_byevent.png" id="77" name="Picture"/>
                           <pic:cNvPicPr>
                             <a:picLocks noChangeArrowheads="1" noChangeAspect="1"/>
                           </pic:cNvPicPr>
                         </pic:nvPicPr>
                         <pic:blipFill>
-                          <a:blip r:embed="rId74"/>
+                          <a:blip r:embed="rId75"/>
                           <a:stretch>
                             <a:fillRect/>
                           </a:stretch>
@@ -19985,8 +19997,8 @@
         <w:t xml:space="preserve">Figure 13: Event-by-event post-event averages, enrollment of 18–19 year olds</w:t>
       </w:r>
     </w:p>
-    <w:bookmarkEnd w:id="77"/>
-    <w:bookmarkStart w:id="78" w:name="discussion"/>
+    <w:bookmarkEnd w:id="78"/>
+    <w:bookmarkStart w:id="79" w:name="discussion"/>
     <w:p>
       <w:pPr>
         <w:pStyle w:val="Heading1"/>
@@ -20047,8 +20059,8 @@
         <w:t xml:space="preserve">Three limits should be stated. The enrollment measure is attendance last week; it cannot see grade progression or completion, so the null does not rule out effects on attainment measured years later. The 2023–2025 minimum wage changes and index adjustments are compiled from state sources and are less thoroughly vetted than the Vaghul and Zipperer (2016) list; they determine which units are clean controls after 2022 and should be verified before the event list is treated as final. Local minimums are carried at their end-2022 levels thereafter, and a city’s rate is applied to its whole county, so a Seattle rate treats all of King County; the county samples are small and the county events are best read alongside the state remainders. Standard errors are from a 99-draw block bootstrap; the wild cluster bootstrap in the Stata replication is the inference to report.</w:t>
       </w:r>
     </w:p>
-    <w:bookmarkEnd w:id="78"/>
-    <w:bookmarkStart w:id="79" w:name="conclusion"/>
+    <w:bookmarkEnd w:id="79"/>
+    <w:bookmarkStart w:id="80" w:name="conclusion"/>
     <w:p>
       <w:pPr>
         <w:pStyle w:val="Heading1"/>
@@ -20065,8 +20077,8 @@
         <w:t xml:space="preserve">This paper estimates the effect of minimum wage increases on the wages and the time allocation of 16–19 year olds, using the event design the minimum wage employment literature adopted after 2019, with every county that sets its own minimum treated as a jurisdiction of its own, on the 73 large increases since 2010. The increases raised the hourly wages of working teens by 3 to 7 percent, for teens from low- and high-income families alike, and changed nothing else: not the share enrolled and employed, enrolled only, employed only, or neither, at either age or in either income group, and not hours or weekly earnings. The estimates are precise enough to rule out changes larger than a point or two in any share, and they are stable across units, event sets, control groups, weights, the pandemic years and subgroups. A two-period schooling model shows that this is the expected outcome when the wage gain is small relative to the skilled premium and employers set teen wages below the competitive level: the minimum wage raises pay without reducing the probability of a job, and a few hundred dollars a year does not move a decision worth several hundred thousand. The minimum wage is not the culprit in the fall of teen employment, and in the modern period it functioned as a transfer to teenagers who work, with no offsetting cost in their schooling or their jobs.</w:t>
       </w:r>
     </w:p>
-    <w:bookmarkEnd w:id="79"/>
-    <w:bookmarkStart w:id="80" w:name="references"/>
+    <w:bookmarkEnd w:id="80"/>
+    <w:bookmarkStart w:id="81" w:name="references"/>
     <w:p>
       <w:pPr>
         <w:pStyle w:val="Heading1"/>
@@ -20294,6 +20306,27 @@
         <w:pStyle w:val="BodyText"/>
       </w:pPr>
       <w:r>
+        <w:t xml:space="preserve">Card, David, and Alan B. Krueger. 1995.</w:t>
+      </w:r>
+      <w:r>
+        <w:t xml:space="preserve"> </w:t>
+      </w:r>
+      <w:r>
+        <w:rPr>
+          <w:iCs/>
+          <w:i/>
+        </w:rPr>
+        <w:t xml:space="preserve">Myth and Measurement: The New Economics of the Minimum Wage</w:t>
+      </w:r>
+      <w:r>
+        <w:t xml:space="preserve">. Princeton: Princeton University Press.</w:t>
+      </w:r>
+    </w:p>
+    <w:p>
+      <w:pPr>
+        <w:pStyle w:val="BodyText"/>
+      </w:pPr>
+      <w:r>
         <w:t xml:space="preserve">Cengiz, Doruk, Arindrajit Dube, Attila Lindner, and Ben Zipperer. 2019.</w:t>
       </w:r>
       <w:r>
@@ -20911,25 +20944,20 @@
         <w:pStyle w:val="BodyText"/>
       </w:pPr>
       <w:r>
-        <w:t xml:space="preserve">Smith, Christopher L. 2011.</w:t>
-      </w:r>
-      <w:r>
-        <w:t xml:space="preserve"> </w:t>
-      </w:r>
-      <w:r>
-        <w:t xml:space="preserve">“</w:t>
-      </w:r>
-      <w:r>
-        <w:t xml:space="preserve">Polarization, Immigration, Education: What’s Behind the Dramatic Decline in Youth Employment?</w:t>
-      </w:r>
-      <w:r>
-        <w:t xml:space="preserve">”</w:t>
-      </w:r>
-      <w:r>
-        <w:t xml:space="preserve"> </w:t>
-      </w:r>
-      <w:r>
-        <w:t xml:space="preserve">Finance and Economics Discussion Series 2011-41, Federal Reserve Board.</w:t>
+        <w:t xml:space="preserve">Robinson, Joan. 1933.</w:t>
+      </w:r>
+      <w:r>
+        <w:t xml:space="preserve"> </w:t>
+      </w:r>
+      <w:r>
+        <w:rPr>
+          <w:iCs/>
+          <w:i/>
+        </w:rPr>
+        <w:t xml:space="preserve">The Economics of Imperfect Competition</w:t>
+      </w:r>
+      <w:r>
+        <w:t xml:space="preserve">. London: Macmillan.</w:t>
       </w:r>
     </w:p>
     <w:p>
@@ -20937,6 +20965,32 @@
         <w:pStyle w:val="BodyText"/>
       </w:pPr>
       <w:r>
+        <w:t xml:space="preserve">Smith, Christopher L. 2011.</w:t>
+      </w:r>
+      <w:r>
+        <w:t xml:space="preserve"> </w:t>
+      </w:r>
+      <w:r>
+        <w:t xml:space="preserve">“</w:t>
+      </w:r>
+      <w:r>
+        <w:t xml:space="preserve">Polarization, Immigration, Education: What’s Behind the Dramatic Decline in Youth Employment?</w:t>
+      </w:r>
+      <w:r>
+        <w:t xml:space="preserve">”</w:t>
+      </w:r>
+      <w:r>
+        <w:t xml:space="preserve"> </w:t>
+      </w:r>
+      <w:r>
+        <w:t xml:space="preserve">Finance and Economics Discussion Series 2011-41, Federal Reserve Board.</w:t>
+      </w:r>
+    </w:p>
+    <w:p>
+      <w:pPr>
+        <w:pStyle w:val="BodyText"/>
+      </w:pPr>
+      <w:r>
         <w:t xml:space="preserve">Smith, Christopher L. 2012.</w:t>
       </w:r>
       <w:r>
@@ -21138,8 +21192,8 @@
         <w:t xml:space="preserve">88 (3): 1379–1392.</w:t>
       </w:r>
     </w:p>
-    <w:bookmarkEnd w:id="80"/>
-    <w:bookmarkStart w:id="81" w:name="a-post-event-average-tables"/>
+    <w:bookmarkEnd w:id="81"/>
+    <w:bookmarkStart w:id="82" w:name="a-post-event-average-tables"/>
     <w:p>
       <w:pPr>
         <w:pStyle w:val="Heading1"/>
@@ -29532,8 +29586,8 @@
         <w:t xml:space="preserve">Notes: Post, Pre and standard errors as in Table 15.</w:t>
       </w:r>
     </w:p>
-    <w:bookmarkEnd w:id="81"/>
-    <w:bookmarkStart w:id="82" w:name="b-the-events"/>
+    <w:bookmarkEnd w:id="82"/>
+    <w:bookmarkStart w:id="83" w:name="b-the-events"/>
     <w:p>
       <w:pPr>
         <w:pStyle w:val="Heading1"/>
@@ -37721,8 +37775,8 @@
         <w:t xml:space="preserve">Notes: Units: state remainders (the state outside its counties with a local minimum) and counties with their own minimum. Source: whether the rise came from the state rate, the local rate, or both in the same month. Before: effective minimum in the month before the event. First step: minimum in the event month. End of window: minimum 47 months after the event. Rise: end of window relative to before. Steps: number of increases of 5 percent or more in the window. Controls: units in other states with no increase of 5 percent or more from 36 months before to 47 months after the event. County rates are the county-wide rate where one exists and otherwise the largest city’s, applied to the whole county. Alaska 2024 and Michigan 2025 rest on the post-2022 additions to the change list. Source: Vaghul and Zipperer (2016), extended by the author.</w:t>
       </w:r>
     </w:p>
-    <w:bookmarkEnd w:id="82"/>
-    <w:bookmarkStart w:id="83" w:name="c-two-way-fixed-effects-estimates"/>
+    <w:bookmarkEnd w:id="83"/>
+    <w:bookmarkStart w:id="84" w:name="c-two-way-fixed-effects-estimates"/>
     <w:p>
       <w:pPr>
         <w:pStyle w:val="Heading1"/>
@@ -45526,8 +45580,8 @@
         <w:t xml:space="preserve">: significant at 10, 5 and 1 percent.</w:t>
       </w:r>
     </w:p>
-    <w:bookmarkEnd w:id="83"/>
-    <w:bookmarkStart w:id="87" w:name="Xe215b0c998fad8d12685ef88fdc35d7a038316a"/>
+    <w:bookmarkEnd w:id="84"/>
+    <w:bookmarkStart w:id="88" w:name="Xe215b0c998fad8d12685ef88fdc35d7a038316a"/>
     <w:p>
       <w:pPr>
         <w:pStyle w:val="Heading1"/>
@@ -47212,18 +47266,18 @@
           <wp:inline>
             <wp:extent cx="5334000" cy="4103076"/>
             <wp:effectExtent b="0" l="0" r="0" t="0"/>
-            <wp:docPr descr="" title="" id="85" name="Picture"/>
+            <wp:docPr descr="" title="" id="86" name="Picture"/>
             <a:graphic>
               <a:graphicData uri="http://schemas.openxmlformats.org/drawingml/2006/picture">
                 <pic:pic>
                   <pic:nvPicPr>
-                    <pic:cNvPr descr="figures/figA_groups_sesrel.png" id="86" name="Picture"/>
+                    <pic:cNvPr descr="figures/figA_groups_sesrel.png" id="87" name="Picture"/>
                     <pic:cNvPicPr>
                       <a:picLocks noChangeArrowheads="1" noChangeAspect="1"/>
                     </pic:cNvPicPr>
                   </pic:nvPicPr>
                   <pic:blipFill>
-                    <a:blip r:embed="rId84"/>
+                    <a:blip r:embed="rId85"/>
                     <a:stretch>
                       <a:fillRect/>
                     </a:stretch>
@@ -47258,8 +47312,8 @@
         <w:t xml:space="preserve">Figure 14: Event-time effects on the four school–work shares by family income, within-year median split, ages 16–19</w:t>
       </w:r>
     </w:p>
-    <w:bookmarkEnd w:id="87"/>
-    <w:bookmarkStart w:id="88" w:name="e-high-school-dropout"/>
+    <w:bookmarkEnd w:id="88"/>
+    <w:bookmarkStart w:id="89" w:name="e-high-school-dropout"/>
     <w:p>
       <w:pPr>
         <w:pStyle w:val="Heading1"/>
@@ -48337,7 +48391,7 @@
         <w:t xml:space="preserve">Notes: School months are September to May; the last column uses all months, in which summer non-attendance inflates the measure. Family income splits as in the main text and Appendix D. Block-bootstrap standard errors in parentheses.</w:t>
       </w:r>
     </w:p>
-    <w:bookmarkEnd w:id="88"/>
+    <w:bookmarkEnd w:id="89"/>
     <w:sectPr/>
   </w:body>
 </w:document>
@@ -48577,6 +48631,369 @@
       </w:r>
       <w:r>
         <w:t xml:space="preserve">welcome.</w:t>
+      </w:r>
+    </w:p>
+  </w:footnote>
+  <w:footnote w:id="22">
+    <w:p>
+      <w:pPr>
+        <w:pStyle w:val="FootnoteText"/>
+      </w:pPr>
+      <w:r>
+        <w:rPr>
+          <w:rStyle w:val="FootnoteReference"/>
+        </w:rPr>
+        <w:footnoteRef/>
+      </w:r>
+      <w:r>
+        <w:t xml:space="preserve"> </w:t>
+      </w:r>
+      <w:r>
+        <w:t xml:space="preserve">Equation (4) is the wage-setting condition of a single employer facing an upward-sloping labour supply curve</w:t>
+      </w:r>
+      <w:r>
+        <w:t xml:space="preserve"> </w:t>
+      </w:r>
+      <m:oMath>
+        <m:r>
+          <m:t>L</m:t>
+        </m:r>
+        <m:d>
+          <m:dPr>
+            <m:begChr m:val="("/>
+            <m:endChr m:val=")"/>
+            <m:sepChr m:val=""/>
+            <m:grow/>
+          </m:dPr>
+          <m:e>
+            <m:r>
+              <m:t>w</m:t>
+            </m:r>
+          </m:e>
+        </m:d>
+      </m:oMath>
+      <w:r>
+        <w:t xml:space="preserve"> </w:t>
+      </w:r>
+      <w:r>
+        <w:t xml:space="preserve">and unable to pay different wages to identical workers. The employer chooses</w:t>
+      </w:r>
+      <w:r>
+        <w:t xml:space="preserve"> </w:t>
+      </w:r>
+      <m:oMath>
+        <m:r>
+          <m:t>w</m:t>
+        </m:r>
+      </m:oMath>
+      <w:r>
+        <w:t xml:space="preserve"> </w:t>
+      </w:r>
+      <w:r>
+        <w:t xml:space="preserve">to maximise</w:t>
+      </w:r>
+      <w:r>
+        <w:t xml:space="preserve"> </w:t>
+      </w:r>
+      <m:oMath>
+        <m:d>
+          <m:dPr>
+            <m:begChr m:val="("/>
+            <m:endChr m:val=")"/>
+            <m:sepChr m:val=""/>
+            <m:grow/>
+          </m:dPr>
+          <m:e>
+            <m:r>
+              <m:rPr>
+                <m:nor/>
+                <m:sty m:val="p"/>
+              </m:rPr>
+              <m:t>MRP</m:t>
+            </m:r>
+            <m:r>
+              <m:rPr>
+                <m:sty m:val="p"/>
+              </m:rPr>
+              <m:t>−</m:t>
+            </m:r>
+            <m:r>
+              <m:t>w</m:t>
+            </m:r>
+          </m:e>
+        </m:d>
+        <m:r>
+          <m:t>L</m:t>
+        </m:r>
+        <m:d>
+          <m:dPr>
+            <m:begChr m:val="("/>
+            <m:endChr m:val=")"/>
+            <m:sepChr m:val=""/>
+            <m:grow/>
+          </m:dPr>
+          <m:e>
+            <m:r>
+              <m:t>w</m:t>
+            </m:r>
+          </m:e>
+        </m:d>
+      </m:oMath>
+      <w:r>
+        <w:t xml:space="preserve">; the first-order condition equates the marginal cost of a hire, the wage plus the raise paid to the existing workforce, to the marginal revenue product,</w:t>
+      </w:r>
+      <w:r>
+        <w:t xml:space="preserve"> </w:t>
+      </w:r>
+      <m:oMath>
+        <m:r>
+          <m:rPr>
+            <m:nor/>
+            <m:sty m:val="p"/>
+          </m:rPr>
+          <m:t>MRP</m:t>
+        </m:r>
+        <m:r>
+          <m:rPr>
+            <m:sty m:val="p"/>
+          </m:rPr>
+          <m:t>=</m:t>
+        </m:r>
+        <m:r>
+          <m:t>w</m:t>
+        </m:r>
+        <m:r>
+          <m:rPr>
+            <m:sty m:val="p"/>
+          </m:rPr>
+          <m:t>+</m:t>
+        </m:r>
+        <m:r>
+          <m:t>L</m:t>
+        </m:r>
+        <m:r>
+          <m:t> </m:t>
+        </m:r>
+        <m:r>
+          <m:t>d</m:t>
+        </m:r>
+        <m:r>
+          <m:t>w</m:t>
+        </m:r>
+        <m:r>
+          <m:rPr>
+            <m:sty m:val="p"/>
+          </m:rPr>
+          <m:t>/</m:t>
+        </m:r>
+        <m:r>
+          <m:t>d</m:t>
+        </m:r>
+        <m:r>
+          <m:t>L</m:t>
+        </m:r>
+        <m:r>
+          <m:rPr>
+            <m:sty m:val="p"/>
+          </m:rPr>
+          <m:t>=</m:t>
+        </m:r>
+        <m:r>
+          <m:t>w</m:t>
+        </m:r>
+        <m:d>
+          <m:dPr>
+            <m:begChr m:val="("/>
+            <m:endChr m:val=")"/>
+            <m:sepChr m:val=""/>
+            <m:grow/>
+          </m:dPr>
+          <m:e>
+            <m:r>
+              <m:t>1</m:t>
+            </m:r>
+            <m:r>
+              <m:rPr>
+                <m:sty m:val="p"/>
+              </m:rPr>
+              <m:t>+</m:t>
+            </m:r>
+            <m:r>
+              <m:t>1</m:t>
+            </m:r>
+            <m:r>
+              <m:rPr>
+                <m:sty m:val="p"/>
+              </m:rPr>
+              <m:t>/</m:t>
+            </m:r>
+            <m:r>
+              <m:t>ε</m:t>
+            </m:r>
+          </m:e>
+        </m:d>
+      </m:oMath>
+      <w:r>
+        <w:t xml:space="preserve">, where</w:t>
+      </w:r>
+      <w:r>
+        <w:t xml:space="preserve"> </w:t>
+      </w:r>
+      <m:oMath>
+        <m:r>
+          <m:t>ε</m:t>
+        </m:r>
+        <m:r>
+          <m:rPr>
+            <m:sty m:val="p"/>
+          </m:rPr>
+          <m:t>=</m:t>
+        </m:r>
+        <m:d>
+          <m:dPr>
+            <m:begChr m:val="("/>
+            <m:endChr m:val=")"/>
+            <m:sepChr m:val=""/>
+            <m:grow/>
+          </m:dPr>
+          <m:e>
+            <m:r>
+              <m:t>d</m:t>
+            </m:r>
+            <m:r>
+              <m:t>L</m:t>
+            </m:r>
+            <m:r>
+              <m:rPr>
+                <m:sty m:val="p"/>
+              </m:rPr>
+              <m:t>/</m:t>
+            </m:r>
+            <m:r>
+              <m:t>d</m:t>
+            </m:r>
+            <m:r>
+              <m:t>w</m:t>
+            </m:r>
+          </m:e>
+        </m:d>
+        <m:d>
+          <m:dPr>
+            <m:begChr m:val="("/>
+            <m:endChr m:val=")"/>
+            <m:sepChr m:val=""/>
+            <m:grow/>
+          </m:dPr>
+          <m:e>
+            <m:r>
+              <m:t>w</m:t>
+            </m:r>
+            <m:r>
+              <m:rPr>
+                <m:sty m:val="p"/>
+              </m:rPr>
+              <m:t>/</m:t>
+            </m:r>
+            <m:r>
+              <m:t>L</m:t>
+            </m:r>
+          </m:e>
+        </m:d>
+      </m:oMath>
+      <w:r>
+        <w:t xml:space="preserve"> </w:t>
+      </w:r>
+      <w:r>
+        <w:t xml:space="preserve">is the elasticity of labour supply to the firm. Solving for</w:t>
+      </w:r>
+      <w:r>
+        <w:t xml:space="preserve"> </w:t>
+      </w:r>
+      <m:oMath>
+        <m:r>
+          <m:t>w</m:t>
+        </m:r>
+      </m:oMath>
+      <w:r>
+        <w:t xml:space="preserve"> </w:t>
+      </w:r>
+      <w:r>
+        <w:t xml:space="preserve">gives (4); the proportional gap between the marginal product and the wage is</w:t>
+      </w:r>
+      <w:r>
+        <w:t xml:space="preserve"> </w:t>
+      </w:r>
+      <m:oMath>
+        <m:r>
+          <m:t>1</m:t>
+        </m:r>
+        <m:r>
+          <m:rPr>
+            <m:sty m:val="p"/>
+          </m:rPr>
+          <m:t>/</m:t>
+        </m:r>
+        <m:r>
+          <m:t>ε</m:t>
+        </m:r>
+      </m:oMath>
+      <w:r>
+        <w:t xml:space="preserve">, and it vanishes as</w:t>
+      </w:r>
+      <w:r>
+        <w:t xml:space="preserve"> </w:t>
+      </w:r>
+      <m:oMath>
+        <m:r>
+          <m:t>ε</m:t>
+        </m:r>
+        <m:r>
+          <m:rPr>
+            <m:sty m:val="p"/>
+          </m:rPr>
+          <m:t>→</m:t>
+        </m:r>
+        <m:r>
+          <m:rPr>
+            <m:sty m:val="p"/>
+          </m:rPr>
+          <m:t>∞</m:t>
+        </m:r>
+      </m:oMath>
+      <w:r>
+        <w:t xml:space="preserve">. The condition is due to Robinson (1933); the observation that a minimum wage between</w:t>
+      </w:r>
+      <w:r>
+        <w:t xml:space="preserve"> </w:t>
+      </w:r>
+      <m:oMath>
+        <m:sSub>
+          <m:e>
+            <m:r>
+              <m:t>w</m:t>
+            </m:r>
+          </m:e>
+          <m:sub>
+            <m:r>
+              <m:t>m</m:t>
+            </m:r>
+          </m:sub>
+        </m:sSub>
+      </m:oMath>
+      <w:r>
+        <w:t xml:space="preserve"> </w:t>
+      </w:r>
+      <w:r>
+        <w:t xml:space="preserve">and MRP raises employment is Stigler (1946);</w:t>
+      </w:r>
+      <w:r>
+        <w:t xml:space="preserve"> </w:t>
+      </w:r>
+      <w:r>
+        <w:t xml:space="preserve"> </w:t>
+      </w:r>
+      <w:r>
+        <w:t xml:space="preserve">gives the modern statement, and Card and Krueger (1995) apply it to the minimum wage.</w:t>
       </w:r>
     </w:p>
   </w:footnote>

</xml_diff>

<commit_message>
minwage: American English spelling throughout the paper and generated tables (journal titles unchanged)
Co-Authored-By: Claude Fable 5.1 <noreply@anthropic.com>
Claude-Session: https://claude.ai/code/session_01Rd74HvTpozFfpcfGubVirr
</commit_message>
<xml_diff>
--- a/minwage/paper/minwage_teens.docx
+++ b/minwage/paper/minwage_teens.docx
@@ -1855,7 +1855,7 @@
         <w:t xml:space="preserve">Keywords</w:t>
       </w:r>
       <w:r>
-        <w:t xml:space="preserve">: minimum wage, teen labour market, school enrollment, event study, monopsony.</w:t>
+        <w:t xml:space="preserve">: minimum wage, teen labor market, school enrollment, event study, monopsony.</w:t>
       </w:r>
     </w:p>
     <w:bookmarkStart w:id="21" w:name="introduction"/>
@@ -1880,7 +1880,7 @@
         <w:pStyle w:val="BodyText"/>
       </w:pPr>
       <w:r>
-        <w:t xml:space="preserve">While the effect of the minimum wage on time allocation is indirect, it is an intuitive byproduct of a simple model of human capital investment in which teens decide whether to attend school or enter the labour market by weighing the opportunity cost and psychic cost of schooling against the expected future return to skill (Mincer, 1976). To the extent that a change in the minimum wage alters the teen labour market, it alters the opportunity cost of schooling and therefore the enrollment decision. The direction depends on what the minimum does to the expected teen wage: if employment falls little, the expected wage rises and enrollment should fall; if employment falls a lot, the expected wage falls and enrollment should rise. There is a third possibility that the earlier literature did not consider. If employers of teenagers have wage-setting power, so that teen wages sit below the competitive level, a minimum wage set between the prevailing wage and the marginal product raises pay without reducing employment, and the enrollment margin, which turns on a lifetime skill premium that a few hundred dollars a year barely moves, need not respond at all.</w:t>
+        <w:t xml:space="preserve">While the effect of the minimum wage on time allocation is indirect, it is an intuitive byproduct of a simple model of human capital investment in which teens decide whether to attend school or enter the labor market by weighing the opportunity cost and psychic cost of schooling against the expected future return to skill (Mincer, 1976). To the extent that a change in the minimum wage alters the teen labor market, it alters the opportunity cost of schooling and therefore the enrollment decision. The direction depends on what the minimum does to the expected teen wage: if employment falls little, the expected wage rises and enrollment should fall; if employment falls a lot, the expected wage falls and enrollment should rise. There is a third possibility that the earlier literature did not consider. If employers of teenagers have wage-setting power, so that teen wages sit below the competitive level, a minimum wage set between the prevailing wage and the marginal product raises pay without reducing employment, and the enrollment margin, which turns on a lifetime skill premium that a few hundred dollars a year barely moves, need not respond at all.</w:t>
       </w:r>
     </w:p>
     <w:p>
@@ -2064,7 +2064,7 @@
         <w:pStyle w:val="BodyText"/>
       </w:pPr>
       <w:r>
-        <w:t xml:space="preserve">Taken together, the results suggest that the focus of the earlier literature on the teen employment and enrollment effects of the minimum wage may have mistaken the nature of the policy’s impact on teens. In the period of the largest increases in American history, the minimum wage functioned as a transfer to teenagers who work, with no offsetting cost in their jobs, their hours, or their schooling, and no measurable benefit to the schooling of the poorest teens. The fall in teen employment since 2000 must be explained by something else. The rest of the paper is organised as follows: Section 2 gives the theoretical foundation, Section 3 the data and the tables of estimates, Section 4 the empirical strategy, Section 5 the results, Section 6 robustness to alternative units, event sets, controls and weights, Section 7 a discussion, and Section 8 concludes. The appendix collects the post-event average tables, lists the events, and reports the two-way fixed effects estimates, an alternative income split, and the dropout outcome.</w:t>
+        <w:t xml:space="preserve">Taken together, the results suggest that the focus of the earlier literature on the teen employment and enrollment effects of the minimum wage may have mistaken the nature of the policy’s impact on teens. In the period of the largest increases in American history, the minimum wage functioned as a transfer to teenagers who work, with no offsetting cost in their jobs, their hours, or their schooling, and no measurable benefit to the schooling of the poorest teens. The fall in teen employment since 2000 must be explained by something else. The rest of the paper is organized as follows: Section 2 gives the theoretical foundation, Section 3 the data and the tables of estimates, Section 4 the empirical strategy, Section 5 the results, Section 6 robustness to alternative units, event sets, controls and weights, Section 7 a discussion, and Section 8 concludes. The appendix collects the post-event average tables, lists the events, and reports the two-way fixed effects estimates, an alternative income split, and the dropout outcome.</w:t>
       </w:r>
     </w:p>
     <w:bookmarkEnd w:id="21"/>
@@ -2082,7 +2082,7 @@
         <w:pStyle w:val="FirstParagraph"/>
       </w:pPr>
       <w:r>
-        <w:t xml:space="preserve">To give context for the results, this paper considers a simple two-period model derived from Mincer (1976), with help from lecture notes by Acemoglu (2009). Agents choose education versus labour force participation in the first period and receive an income in the second period. Individuals choose consumption in both periods and education in the first period, and are endowed with an exogenous starting income in period one. Second-period income is a function of first-period education.</w:t>
+        <w:t xml:space="preserve">To give context for the results, this paper considers a simple two-period model derived from Mincer (1976), with help from lecture notes by Acemoglu (2009). Agents choose education versus labor force participation in the first period and receive an income in the second period. Individuals choose consumption in both periods and education in the first period, and are endowed with an exogenous starting income in period one. Second-period income is a function of first-period education.</w:t>
       </w:r>
     </w:p>
     <w:p>
@@ -2090,7 +2090,7 @@
         <w:pStyle w:val="BodyText"/>
       </w:pPr>
       <w:r>
-        <w:t xml:space="preserve">In such a world, agents choose to maximise</w:t>
+        <w:t xml:space="preserve">In such a world, agents choose to maximize</w:t>
       </w:r>
     </w:p>
     <w:p>
@@ -2643,7 +2643,7 @@
         <w:t xml:space="preserve"> </w:t>
       </w:r>
       <w:r>
-        <w:t xml:space="preserve">is the wage for unskilled labour,</w:t>
+        <w:t xml:space="preserve">is the wage for unskilled labor,</w:t>
       </w:r>
       <w:r>
         <w:t xml:space="preserve"> </w:t>
@@ -2666,7 +2666,7 @@
         <w:t xml:space="preserve"> </w:t>
       </w:r>
       <w:r>
-        <w:t xml:space="preserve">is the wage for skilled labour,</w:t>
+        <w:t xml:space="preserve">is the wage for skilled labor,</w:t>
       </w:r>
       <w:r>
         <w:t xml:space="preserve"> </w:t>
@@ -2748,7 +2748,7 @@
         <w:t xml:space="preserve"> </w:t>
       </w:r>
       <w:r>
-        <w:t xml:space="preserve">does not necessarily equal the minimum wage, since individuals are not guaranteed employment if they enter the labour market:</w:t>
+        <w:t xml:space="preserve">does not necessarily equal the minimum wage, since individuals are not guaranteed employment if they enter the labor market:</w:t>
       </w:r>
       <w:r>
         <w:t xml:space="preserve"> </w:t>
@@ -2862,7 +2862,7 @@
         <w:pStyle w:val="BodyText"/>
       </w:pPr>
       <w:r>
-        <w:t xml:space="preserve">Maximising with respect to education yields</w:t>
+        <w:t xml:space="preserve">Maximizing with respect to education yields</w:t>
       </w:r>
     </w:p>
     <w:p>
@@ -2983,7 +2983,7 @@
         <w:pStyle w:val="FirstParagraph"/>
       </w:pPr>
       <w:r>
-        <w:t xml:space="preserve">This means that agents will choose education if the cost of attending school is less than the expected, discounted wage premium for skilled workers in period 2. This maximisation problem does not make a conclusive prediction, and leaves room for two potential outcomes. If the disemployment effect for teens is small, then the expected wage increases with the minimum wage, which in turn increases the opportunity cost of attending school. This would be likely to occur if the minimum wage does not induce older workers to enter the market and/or the minimum wage is sufficiently low that it does not appreciably change the quantity of labour demanded. In this situation, overall enrollment should decrease while labour force participation should rise.</w:t>
+        <w:t xml:space="preserve">This means that agents will choose education if the cost of attending school is less than the expected, discounted wage premium for skilled workers in period 2. This maximization problem does not make a conclusive prediction, and leaves room for two potential outcomes. If the disemployment effect for teens is small, then the expected wage increases with the minimum wage, which in turn increases the opportunity cost of attending school. This would be likely to occur if the minimum wage does not induce older workers to enter the market and/or the minimum wage is sufficiently low that it does not appreciably change the quantity of labor demanded. In this situation, overall enrollment should decrease while labor force participation should rise.</w:t>
       </w:r>
     </w:p>
     <w:p>
@@ -2991,7 +2991,7 @@
         <w:pStyle w:val="BodyText"/>
       </w:pPr>
       <w:r>
-        <w:t xml:space="preserve">Alternatively, if the disemployment effect for teens is large, then the expected wage decreases when the minimum wage rises, which in turn decreases the opportunity cost of attending school. This would be likely to occur if the new wage brings older workers into the labour force and/or the minimum wage is sufficiently high that it appreciably changes the quantity of labour demanded. In this case, getting a degree would also increase the likelihood of finding employment in the long run, thereby increasing the value of staying in school today. In this situation, overall enrollment should rise while labour force participation should decrease.</w:t>
+        <w:t xml:space="preserve">Alternatively, if the disemployment effect for teens is large, then the expected wage decreases when the minimum wage rises, which in turn decreases the opportunity cost of attending school. This would be likely to occur if the new wage brings older workers into the labor force and/or the minimum wage is sufficiently high that it appreciably changes the quantity of labor demanded. In this case, getting a degree would also increase the likelihood of finding employment in the long run, thereby increasing the value of staying in school today. In this situation, overall enrollment should rise while labor force participation should decrease.</w:t>
       </w:r>
     </w:p>
     <w:p>
@@ -2999,7 +2999,7 @@
         <w:pStyle w:val="BodyText"/>
       </w:pPr>
       <w:r>
-        <w:t xml:space="preserve">Both of these cases assume that the teen labour market is competitive, so that the minimum wage is set above a market-clearing wage and the only question is how much employment falls. There is a third possibility. If each employer faces an upward-sloping supply of teenage labour, because teens search infrequently, have few employers within reach of home and school, or differ in their preferences over jobs, the employer sets the wage below the marginal product. With supply elasticity</w:t>
+        <w:t xml:space="preserve">Both of these cases assume that the teen labor market is competitive, so that the minimum wage is set above a market-clearing wage and the only question is how much employment falls. There is a third possibility. If each employer faces an upward-sloping supply of teenage labor, because teens search infrequently, have few employers within reach of home and school, or differ in their preferences over jobs, the employer sets the wage below the marginal product. With supply elasticity</w:t>
       </w:r>
       <w:r>
         <w:t xml:space="preserve"> </w:t>
@@ -3013,7 +3013,7 @@
         <w:t xml:space="preserve"> </w:t>
       </w:r>
       <w:r>
-        <w:t xml:space="preserve">to the firm, the profit-maximising wage satisfies</w:t>
+        <w:t xml:space="preserve">to the firm, the profit-maximizing wage satisfies</w:t>
       </w:r>
     </w:p>
     <w:p>
@@ -3263,7 +3263,7 @@
         <w:t xml:space="preserve"> </w:t>
       </w:r>
       <w:r>
-        <w:t xml:space="preserve">rises one for one with the minimum, and the earnings of teens who work rise by the same proportion as their wage. Evidence that low-wage labour markets have this structure has accumulated: employer concentration is high in the local markets where teens work (Azar et al., 2019), the employment responses to large increases are close to zero (Cengiz et al., 2019), and the wage gains are not offset by reductions in hours or other compensation (Dube, 2019). Teenagers are the group for whom search frictions and limited geographic reach are most severe, and so the group for whom this case is most plausible.</w:t>
+        <w:t xml:space="preserve">rises one for one with the minimum, and the earnings of teens who work rise by the same proportion as their wage. Evidence that low-wage labor markets have this structure has accumulated: employer concentration is high in the local markets where teens work (Azar et al., 2019), the employment responses to large increases are close to zero (Cengiz et al., 2019), and the wage gains are not offset by reductions in hours or other compensation (Dube, 2019). Teenagers are the group for whom search frictions and limited geographic reach are most severe, and so the group for whom this case is most plausible.</w:t>
       </w:r>
     </w:p>
     <w:p>
@@ -3309,7 +3309,7 @@
         <w:pStyle w:val="FirstParagraph"/>
       </w:pPr>
       <w:r>
-        <w:t xml:space="preserve">The individual data are the basic monthly files of the Current Population Survey from January 2007, three years before the first event, to August 2026, from IPUMS-CPS (Flood et al., 2024); every estimate, figure and table in the paper uses this window. The basic monthly survey asks every person aged 16–24 whether they attended school or college in the previous week and whether full or part time, which is the enrollment measure used here; the March and October supplements ask enrollment of wider age ranges but only once a year. I keep all 16–24 year olds, 3.08 million person-months, about 6,100 aged 16–19 each month. Employment, labour force status and usual hours come from the standard labour force items. In the outgoing rotation groups, the fourth and eighth months a household is in the survey and a quarter of the sample, the survey records the hourly wage of workers paid by the hour and weekly earnings of all workers; these give the wage outcomes. Person weights are the monthly final weights, and the earnings weights for the outgoing rotation items. The household’s income category is recorded for every teen and is the measure of socioeconomic standing; parents’ education is not available in an extract of 16–24 year olds.</w:t>
+        <w:t xml:space="preserve">The individual data are the basic monthly files of the Current Population Survey from January 2007, three years before the first event, to August 2026, from IPUMS-CPS (Flood et al., 2024); every estimate, figure and table in the paper uses this window. The basic monthly survey asks every person aged 16–24 whether they attended school or college in the previous week and whether full or part time, which is the enrollment measure used here; the March and October supplements ask enrollment of wider age ranges but only once a year. I keep all 16–24 year olds, 3.08 million person-months, about 6,100 aged 16–19 each month. Employment, labor force status and usual hours come from the standard labor force items. In the outgoing rotation groups, the fourth and eighth months a household is in the survey and a quarter of the sample, the survey records the hourly wage of workers paid by the hour and weekly earnings of all workers; these give the wage outcomes. Person weights are the monthly final weights, and the earnings weights for the outgoing rotation items. The household’s income category is recorded for every teen and is the measure of socioeconomic standing; parents’ education is not available in an extract of 16–24 year olds.</w:t>
       </w:r>
     </w:p>
     <w:p>
@@ -3325,7 +3325,7 @@
         <w:pStyle w:val="BodyText"/>
       </w:pPr>
       <w:r>
-        <w:t xml:space="preserve">Minimum wage histories are from the state, federal and substate change lists of Vaghul and Zipperer (2016), which record the effective date and level of every change from 1974 to the end of 2022, including the steps of schedules enacted by then. I extend the state list through 2025 with the changes enacted or triggered by indexation after 2022, compiled from state labour departments and flagged for verification in the replication files; local rates are carried forward at their end-2022 levels. Sixty localities are mapped to the county codes the CPS identifies for the larger counties, about 40 percent of respondents, with one locality representing each county: the county-wide rate where one exists, otherwise the largest city’s.</w:t>
+        <w:t xml:space="preserve">Minimum wage histories are from the state, federal and substate change lists of Vaghul and Zipperer (2016), which record the effective date and level of every change from 1974 to the end of 2022, including the steps of schedules enacted by then. I extend the state list through 2025 with the changes enacted or triggered by indexation after 2022, compiled from state labor departments and flagged for verification in the replication files; local rates are carried forward at their end-2022 levels. Sixty localities are mapped to the county codes the CPS identifies for the larger counties, about 40 percent of respondents, with one locality representing each county: the county-wide rate where one exists, otherwise the largest city’s.</w:t>
       </w:r>
     </w:p>
     <w:p>
@@ -3756,7 +3756,7 @@
               <w:jc w:val="left"/>
             </w:pPr>
             <w:r>
-              <w:t xml:space="preserve">In labour force</w:t>
+              <w:t xml:space="preserve">In labor force</w:t>
             </w:r>
           </w:p>
         </w:tc>
@@ -10077,7 +10077,7 @@
         <w:pStyle w:val="FirstParagraph"/>
       </w:pPr>
       <w:r>
-        <w:t xml:space="preserve">Non-Hispanic white teens are 53 percent of 16–19 year olds over 2010–2026; the rest are Hispanic (half of the non-white group), Black (a third) and other. The two groups enrol at the same rate, 75 percent, but white teens are employed at 35 percent against 25 percent for non-white teens, and the share neither in school nor at work is 11 against 14 percent. Non-white teens are concentrated in the jurisdictions that raised their minimums, the large states of the West and Northeast and the big-city counties, so they carry more of the weight in the treated population than in the controls, and their families have lower incomes on average, so the liquidity channel, if it operates, should show among them. Appendix Tables 21 and 22 give the post-event averages by race and age, Table 5 the stacked coefficients, and Figure 6 the event-time coefficients for the pooled ages.</w:t>
+        <w:t xml:space="preserve">Non-Hispanic white teens are 53 percent of 16–19 year olds over 2010–2026; the rest are Hispanic (half of the non-white group), Black (a third) and other. The two groups enroll at the same rate, 75 percent, but white teens are employed at 35 percent against 25 percent for non-white teens, and the share neither in school nor at work is 11 against 14 percent. Non-white teens are concentrated in the jurisdictions that raised their minimums, the large states of the West and Northeast and the big-city counties, so they carry more of the weight in the treated population than in the controls, and their families have lower incomes on average, so the liquidity channel, if it operates, should show among them. Appendix Tables 21 and 22 give the post-event averages by race and age, Table 5 the stacked coefficients, and Figure 6 the event-time coefficients for the pooled ages.</w:t>
       </w:r>
     </w:p>
     <w:p>
@@ -20012,7 +20012,7 @@
         <w:pStyle w:val="FirstParagraph"/>
       </w:pPr>
       <w:r>
-        <w:t xml:space="preserve">The results match the third case of Section 2. The wage of teens who work rose with the minimum, and by more for teens from poorer families and in the counties with the largest local increases; employment, hours and weekly earnings did not fall; and the allocation of time between school and work did not change for any age, income or racial group; the one movement, among girls aged 16–17, is a shift of about a point from working while in school to school only, with enrollment unchanged, and boys of the same age shift the other way. In a competitive teen labour market a 38 percent rise in the wage floor should have reduced employment or hours, and either the expected wage or the enrollment rate should have moved. Neither did. The pattern is the one a market with employer wage-setting power produces, in which a minimum between the prevailing wage and the marginal product raises pay without reducing the chance of a job, and it is consistent with the bunching estimates of Cengiz et al. (2019) for all low-wage workers and with the direct evidence of concentration in the markets where teens work (Azar et al., 2019; Manning, 2003).</w:t>
+        <w:t xml:space="preserve">The results match the third case of Section 2. The wage of teens who work rose with the minimum, and by more for teens from poorer families and in the counties with the largest local increases; employment, hours and weekly earnings did not fall; and the allocation of time between school and work did not change for any age, income or racial group; the one movement, among girls aged 16–17, is a shift of about a point from working while in school to school only, with enrollment unchanged, and boys of the same age shift the other way. In a competitive teen labor market a 38 percent rise in the wage floor should have reduced employment or hours, and either the expected wage or the enrollment rate should have moved. Neither did. The pattern is the one a market with employer wage-setting power produces, in which a minimum between the prevailing wage and the marginal product raises pay without reducing the chance of a job, and it is consistent with the bunching estimates of Cengiz et al. (2019) for all low-wage workers and with the direct evidence of concentration in the markets where teens work (Azar et al., 2019; Manning, 2003).</w:t>
       </w:r>
     </w:p>
     <w:p>
@@ -43552,7 +43552,7 @@
         <w:t xml:space="preserve"> </w:t>
       </w:r>
       <w:r>
-        <w:t xml:space="preserve">(0.018) and 0.008 (0.010) at 16–19). Region-by-month fixed effects and dropping the pandemic years change little; restricting to 2010–2019 cuts the neither coefficient at 16–19 to a third; a 24-month lead of the log minimum has no predictive power, which is a point in the specification’s favour; and unit-specific linear trends remove the neither coefficient at 16–17 while producing implausible positive enrollment effects elsewhere, the pattern Meer and West (2016) describe when trends absorb a trending treatment.</w:t>
+        <w:t xml:space="preserve">(0.018) and 0.008 (0.010) at 16–19). Region-by-month fixed effects and dropping the pandemic years change little; restricting to 2010–2019 cuts the neither coefficient at 16–19 to a third; a 24-month lead of the log minimum has no predictive power, which is a point in the specification’s favor; and unit-specific linear trends remove the neither coefficient at 16–17 while producing implausible positive enrollment effects elsewhere, the pattern Meer and West (2016) describe when trends absorb a trending treatment.</w:t>
       </w:r>
     </w:p>
     <w:p>
@@ -48649,7 +48649,7 @@
         <w:t xml:space="preserve"> </w:t>
       </w:r>
       <w:r>
-        <w:t xml:space="preserve">Equation (4) is the wage-setting condition of a single employer facing an upward-sloping labour supply curve</w:t>
+        <w:t xml:space="preserve">Equation (4) is the wage-setting condition of a single employer facing an upward-sloping labor supply curve</w:t>
       </w:r>
       <w:r>
         <w:t xml:space="preserve"> </w:t>
@@ -48690,7 +48690,7 @@
         <w:t xml:space="preserve"> </w:t>
       </w:r>
       <w:r>
-        <w:t xml:space="preserve">to maximise</w:t>
+        <w:t xml:space="preserve">to maximize</w:t>
       </w:r>
       <w:r>
         <w:t xml:space="preserve"> </w:t>
@@ -48904,7 +48904,7 @@
         <w:t xml:space="preserve"> </w:t>
       </w:r>
       <w:r>
-        <w:t xml:space="preserve">is the elasticity of labour supply to the firm. Solving for</w:t>
+        <w:t xml:space="preserve">is the elasticity of labor supply to the firm. Solving for</w:t>
       </w:r>
       <w:r>
         <w:t xml:space="preserve"> </w:t>

</xml_diff>

<commit_message>
minwage: Table 1 rebuilt on the 73 unit events; descriptive statistics in the text recomputed on 2007-2026; TWFE start date explained
Co-Authored-By: Claude Fable 5.1 <noreply@anthropic.com>
Claude-Session: https://claude.ai/code/session_01Rd74HvTpozFfpcfGubVirr
</commit_message>
<xml_diff>
--- a/minwage/paper/minwage_teens.docx
+++ b/minwage/paper/minwage_teens.docx
@@ -1872,7 +1872,7 @@
         <w:pStyle w:val="FirstParagraph"/>
       </w:pPr>
       <w:r>
-        <w:t xml:space="preserve">The economic literature on the consequences of the minimum wage is both vast and contentious. Researchers concentrate mainly on the possible disemployment effects of the policy, frequently focusing on teenagers, the age group most subject to the minimum wage: a quarter of 16–19 year old wage earners are paid at or near it, against a tenth of 20–24 year olds. Far less attention has been paid to the policy’s effect on how teenagers allocate their time between school and work, even though that allocation is the channel through which the minimum wage would matter for their later lives and the one policymakers care most about. The question has become pressing for a specific reason. In the published CPS series, employment of 16–19 year olds fell from 45 percent in 2000 to 27 percent in 2010 and has only partly recovered, school enrollment rose from 68 to 77 percent, and the share of teens both enrolled and employed fell from 26 to 17 percent. Neumark and Shupe (2019) weigh the candidate explanations against one another in CPS data for 1986–2015 and conclude that higher minimum wages are the predominant factor, moving teens from being enrolled and employed to being enrolled only. Smith (2021) finds, for 1992–2012, that minimum wage increases lower high school dropout among teens from low-socioeconomic-status families and do nothing for other teens. I contribute to this literature by using the event design that the minimum wage employment literature adopted after Cengiz et al. (2019), on the largest increases in the modern era and with local minimums treated as the policies they are, to establish the causal effect of minimum wage changes on teenagers’ wages and on their division between school and work.</w:t>
+        <w:t xml:space="preserve">The economic literature on the consequences of the minimum wage is both vast and contentious. Researchers concentrate mainly on the possible disemployment effects of the policy, frequently focusing on teenagers, the age group most subject to the minimum wage: in the 2007–2026 CPS a third of hourly-paid 16–19 year olds earn within 25 cents of their jurisdiction’s minimum, against a sixth of 20–24 year olds. Far less attention has been paid to the policy’s effect on how teenagers allocate their time between school and work, even though that allocation is the channel through which the minimum wage would matter for their later lives and the one policymakers care most about. The question has become pressing for a specific reason. In the published CPS series, employment of 16–19 year olds fell from 45 percent in 2000 to 27 percent in 2010 and has only partly recovered, school enrollment rose from 68 to 77 percent, and the share of teens both enrolled and employed fell from 26 to 17 percent. Neumark and Shupe (2019) weigh the candidate explanations against one another in CPS data for 1986–2015 and conclude that higher minimum wages are the predominant factor, moving teens from being enrolled and employed to being enrolled only. Smith (2021) finds, for 1992–2012, that minimum wage increases lower high school dropout among teens from low-socioeconomic-status families and do nothing for other teens. I contribute to this literature by using the event design that the minimum wage employment literature adopted after Cengiz et al. (2019), on the largest increases in the modern era and with local minimums treated as the policies they are, to establish the causal effect of minimum wage changes on teenagers’ wages and on their division between school and work.</w:t>
       </w:r>
     </w:p>
     <w:p>
@@ -3333,7 +3333,7 @@
         <w:pStyle w:val="BodyText"/>
       </w:pPr>
       <w:r>
-        <w:t xml:space="preserve">Figure 1 shows the aggregate series over the window. Teen employment fell from 36 percent in 2007 to 27 percent in 2010, from 26 to 17 percent at 16–17 and from 48 to 38 percent at 18–19, and recovered to 32 percent by 2019 and 33 percent in 2022, where it has stayed; enrollment moved between 74 and 77 percent; the share enrolled and employed fell from 22 to 17 percent and recovered to 18 to 19 percent, while the share neither enrolled nor employed stayed between 11 and 13 percent. Figure 2 shows the population-weighted effective minimum wage and the calendar of state events: the federal increases of 2007–2009, no federal change since, and the wave of large state schedules from 2014. Table 1 gives the means in the year before the event for teens in the event states and in their clean controls, for the 39 state events from 2010. In event states, 85 percent of 16–17 year olds and 64 percent of 18–19 year olds are enrolled; 19 and 39 percent are employed; hourly-paid teens earn $9.61 and $10.69 an hour. The control states have slightly lower enrollment, slightly higher employment and lower wages, the differences one expects between jurisdictions that raise their minimum and jurisdictions that do not, and the design compares changes rather than levels.</w:t>
+        <w:t xml:space="preserve">Figure 1 shows the aggregate series over the window. Teen employment fell from 36 percent in 2007 to 27 percent in 2010, from 26 to 17 percent at 16–17 and from 48 to 38 percent at 18–19, and recovered to 32 percent by 2019 and 33 percent in 2022, where it has stayed; enrollment moved between 74 and 77 percent; the share enrolled and employed fell from 22 to 17 percent and recovered to 18 to 19 percent, while the share neither enrolled nor employed stayed between 11 and 13 percent. Figure 2 shows the population-weighted effective minimum wage and the calendar of state events: the federal increases of 2007–2009, no federal change since, and the wave of large state schedules from 2014. Table 1 gives the means in the twelve months before the event for teens in the event units and in their clean control units, pooled over the 73 events of the main design. In event units, 85 percent of 16–17 year olds and 64 percent of 18–19 year olds are enrolled; 18 and 39 percent are employed; hourly-paid teens earn $9.60 and $10.70 an hour. The control units have slightly lower enrollment, slightly higher employment and lower wages, the differences one expects between jurisdictions that raise their minimum and jurisdictions that do not, and the design compares changes rather than levels.</w:t>
       </w:r>
     </w:p>
     <w:tbl>
@@ -3509,7 +3509,7 @@
         <w:pStyle w:val="TableCaption"/>
       </w:pPr>
       <w:r>
-        <w:t xml:space="preserve">Table 1: Means in the year before the event, 39 state events from 2010: event states and clean controls</w:t>
+        <w:t xml:space="preserve">Table 1: Means in the year before the event, 73 unit events from 2010: event units and clean controls</w:t>
       </w:r>
     </w:p>
     <w:tbl>
@@ -3518,7 +3518,7 @@
         <w:tblW w:type="dxa" w:w="9360"/>
         <w:tblLook w:firstRow="0" w:lastRow="0" w:firstColumn="0" w:lastColumn="0" w:noHBand="0" w:noVBand="0" w:val="0000"/>
         <w:jc w:val="start"/>
-        <w:tblCaption w:val="Table 1: Means in the year before the event, 39 state events from 2010: event states and clean controls"/>
+        <w:tblCaption w:val="Table 1: Means in the year before the event, 73 unit events from 2010: event units and clean controls"/>
       </w:tblPr>
       <w:tblGrid>
         <w:gridCol w:w="2808"/>
@@ -3582,7 +3582,7 @@
               <w:jc w:val="right"/>
             </w:pPr>
             <w:r>
-              <w:t xml:space="preserve">Event states</w:t>
+              <w:t xml:space="preserve">Event units</w:t>
             </w:r>
           </w:p>
         </w:tc>
@@ -3606,7 +3606,7 @@
               <w:jc w:val="right"/>
             </w:pPr>
             <w:r>
-              <w:t xml:space="preserve">Event states</w:t>
+              <w:t xml:space="preserve">Event units</w:t>
             </w:r>
           </w:p>
         </w:tc>
@@ -3644,7 +3644,7 @@
               <w:jc w:val="right"/>
             </w:pPr>
             <w:r>
-              <w:t xml:space="preserve">0.854</w:t>
+              <w:t xml:space="preserve">0.853</w:t>
             </w:r>
           </w:p>
         </w:tc>
@@ -3668,7 +3668,7 @@
               <w:jc w:val="right"/>
             </w:pPr>
             <w:r>
-              <w:t xml:space="preserve">0.644</w:t>
+              <w:t xml:space="preserve">0.642</w:t>
             </w:r>
           </w:p>
         </w:tc>
@@ -3680,7 +3680,7 @@
               <w:jc w:val="right"/>
             </w:pPr>
             <w:r>
-              <w:t xml:space="preserve">0.609</w:t>
+              <w:t xml:space="preserve">0.611</w:t>
             </w:r>
           </w:p>
         </w:tc>
@@ -3706,7 +3706,7 @@
               <w:jc w:val="right"/>
             </w:pPr>
             <w:r>
-              <w:t xml:space="preserve">0.185</w:t>
+              <w:t xml:space="preserve">0.184</w:t>
             </w:r>
           </w:p>
         </w:tc>
@@ -3718,7 +3718,7 @@
               <w:jc w:val="right"/>
             </w:pPr>
             <w:r>
-              <w:t xml:space="preserve">0.211</w:t>
+              <w:t xml:space="preserve">0.203</w:t>
             </w:r>
           </w:p>
         </w:tc>
@@ -3742,7 +3742,7 @@
               <w:jc w:val="right"/>
             </w:pPr>
             <w:r>
-              <w:t xml:space="preserve">0.431</w:t>
+              <w:t xml:space="preserve">0.425</w:t>
             </w:r>
           </w:p>
         </w:tc>
@@ -3768,7 +3768,7 @@
               <w:jc w:val="right"/>
             </w:pPr>
             <w:r>
-              <w:t xml:space="preserve">0.227</w:t>
+              <w:t xml:space="preserve">0.226</w:t>
             </w:r>
           </w:p>
         </w:tc>
@@ -3780,7 +3780,7 @@
               <w:jc w:val="right"/>
             </w:pPr>
             <w:r>
-              <w:t xml:space="preserve">0.255</w:t>
+              <w:t xml:space="preserve">0.251</w:t>
             </w:r>
           </w:p>
         </w:tc>
@@ -3792,7 +3792,7 @@
               <w:jc w:val="right"/>
             </w:pPr>
             <w:r>
-              <w:t xml:space="preserve">0.471</w:t>
+              <w:t xml:space="preserve">0.472</w:t>
             </w:r>
           </w:p>
         </w:tc>
@@ -3804,7 +3804,7 @@
               <w:jc w:val="right"/>
             </w:pPr>
             <w:r>
-              <w:t xml:space="preserve">0.507</w:t>
+              <w:t xml:space="preserve">0.506</w:t>
             </w:r>
           </w:p>
         </w:tc>
@@ -3842,7 +3842,7 @@
               <w:jc w:val="right"/>
             </w:pPr>
             <w:r>
-              <w:t xml:space="preserve">0.157</w:t>
+              <w:t xml:space="preserve">0.151</w:t>
             </w:r>
           </w:p>
         </w:tc>
@@ -3866,7 +3866,7 @@
               <w:jc w:val="right"/>
             </w:pPr>
             <w:r>
-              <w:t xml:space="preserve">0.209</w:t>
+              <w:t xml:space="preserve">0.207</w:t>
             </w:r>
           </w:p>
         </w:tc>
@@ -3904,7 +3904,7 @@
               <w:jc w:val="right"/>
             </w:pPr>
             <w:r>
-              <w:t xml:space="preserve">0.686</w:t>
+              <w:t xml:space="preserve">0.692</w:t>
             </w:r>
           </w:p>
         </w:tc>
@@ -3916,7 +3916,7 @@
               <w:jc w:val="right"/>
             </w:pPr>
             <w:r>
-              <w:t xml:space="preserve">0.448</w:t>
+              <w:t xml:space="preserve">0.446</w:t>
             </w:r>
           </w:p>
         </w:tc>
@@ -3928,7 +3928,7 @@
               <w:jc w:val="right"/>
             </w:pPr>
             <w:r>
-              <w:t xml:space="preserve">0.400</w:t>
+              <w:t xml:space="preserve">0.404</w:t>
             </w:r>
           </w:p>
         </w:tc>
@@ -3954,7 +3954,7 @@
               <w:jc w:val="right"/>
             </w:pPr>
             <w:r>
-              <w:t xml:space="preserve">0.050</w:t>
+              <w:t xml:space="preserve">0.049</w:t>
             </w:r>
           </w:p>
         </w:tc>
@@ -3966,7 +3966,7 @@
               <w:jc w:val="right"/>
             </w:pPr>
             <w:r>
-              <w:t xml:space="preserve">0.055</w:t>
+              <w:t xml:space="preserve">0.053</w:t>
             </w:r>
           </w:p>
         </w:tc>
@@ -3978,7 +3978,7 @@
               <w:jc w:val="right"/>
             </w:pPr>
             <w:r>
-              <w:t xml:space="preserve">0.197</w:t>
+              <w:t xml:space="preserve">0.198</w:t>
             </w:r>
           </w:p>
         </w:tc>
@@ -3990,7 +3990,7 @@
               <w:jc w:val="right"/>
             </w:pPr>
             <w:r>
-              <w:t xml:space="preserve">0.222</w:t>
+              <w:t xml:space="preserve">0.218</w:t>
             </w:r>
           </w:p>
         </w:tc>
@@ -4016,7 +4016,7 @@
               <w:jc w:val="right"/>
             </w:pPr>
             <w:r>
-              <w:t xml:space="preserve">0.096</w:t>
+              <w:t xml:space="preserve">0.097</w:t>
             </w:r>
           </w:p>
         </w:tc>
@@ -4028,7 +4028,7 @@
               <w:jc w:val="right"/>
             </w:pPr>
             <w:r>
-              <w:t xml:space="preserve">0.102</w:t>
+              <w:t xml:space="preserve">0.105</w:t>
             </w:r>
           </w:p>
         </w:tc>
@@ -4040,7 +4040,7 @@
               <w:jc w:val="right"/>
             </w:pPr>
             <w:r>
-              <w:t xml:space="preserve">0.159</w:t>
+              <w:t xml:space="preserve">0.160</w:t>
             </w:r>
           </w:p>
         </w:tc>
@@ -4052,7 +4052,7 @@
               <w:jc w:val="right"/>
             </w:pPr>
             <w:r>
-              <w:t xml:space="preserve">0.168</w:t>
+              <w:t xml:space="preserve">0.172</w:t>
             </w:r>
           </w:p>
         </w:tc>
@@ -4078,7 +4078,7 @@
               <w:jc w:val="right"/>
             </w:pPr>
             <w:r>
-              <w:t xml:space="preserve">3.18</w:t>
+              <w:t xml:space="preserve">3.15</w:t>
             </w:r>
           </w:p>
         </w:tc>
@@ -4090,7 +4090,7 @@
               <w:jc w:val="right"/>
             </w:pPr>
             <w:r>
-              <w:t xml:space="preserve">3.67</w:t>
+              <w:t xml:space="preserve">3.51</w:t>
             </w:r>
           </w:p>
         </w:tc>
@@ -4102,7 +4102,7 @@
               <w:jc w:val="right"/>
             </w:pPr>
             <w:r>
-              <w:t xml:space="preserve">9.86</w:t>
+              <w:t xml:space="preserve">9.88</w:t>
             </w:r>
           </w:p>
         </w:tc>
@@ -4114,7 +4114,7 @@
               <w:jc w:val="right"/>
             </w:pPr>
             <w:r>
-              <w:t xml:space="preserve">11.32</w:t>
+              <w:t xml:space="preserve">11.05</w:t>
             </w:r>
           </w:p>
         </w:tc>
@@ -4140,7 +4140,7 @@
               <w:jc w:val="right"/>
             </w:pPr>
             <w:r>
-              <w:t xml:space="preserve">9.61</w:t>
+              <w:t xml:space="preserve">9.60</w:t>
             </w:r>
           </w:p>
         </w:tc>
@@ -4152,7 +4152,7 @@
               <w:jc w:val="right"/>
             </w:pPr>
             <w:r>
-              <w:t xml:space="preserve">9.20</w:t>
+              <w:t xml:space="preserve">8.93</w:t>
             </w:r>
           </w:p>
         </w:tc>
@@ -4164,7 +4164,7 @@
               <w:jc w:val="right"/>
             </w:pPr>
             <w:r>
-              <w:t xml:space="preserve">10.69</w:t>
+              <w:t xml:space="preserve">10.70</w:t>
             </w:r>
           </w:p>
         </w:tc>
@@ -4176,7 +4176,7 @@
               <w:jc w:val="right"/>
             </w:pPr>
             <w:r>
-              <w:t xml:space="preserve">10.12</w:t>
+              <w:t xml:space="preserve">9.78</w:t>
             </w:r>
           </w:p>
         </w:tc>
@@ -4214,7 +4214,7 @@
               <w:jc w:val="right"/>
             </w:pPr>
             <w:r>
-              <w:t xml:space="preserve">0.497</w:t>
+              <w:t xml:space="preserve">0.498</w:t>
             </w:r>
           </w:p>
         </w:tc>
@@ -4226,7 +4226,7 @@
               <w:jc w:val="right"/>
             </w:pPr>
             <w:r>
-              <w:t xml:space="preserve">0.498</w:t>
+              <w:t xml:space="preserve">0.499</w:t>
             </w:r>
           </w:p>
         </w:tc>
@@ -4238,7 +4238,7 @@
               <w:jc w:val="right"/>
             </w:pPr>
             <w:r>
-              <w:t xml:space="preserve">0.494</w:t>
+              <w:t xml:space="preserve">0.493</w:t>
             </w:r>
           </w:p>
         </w:tc>
@@ -4288,7 +4288,7 @@
               <w:jc w:val="right"/>
             </w:pPr>
             <w:r>
-              <w:t xml:space="preserve">0.130</w:t>
+              <w:t xml:space="preserve">0.131</w:t>
             </w:r>
           </w:p>
         </w:tc>
@@ -4300,7 +4300,7 @@
               <w:jc w:val="right"/>
             </w:pPr>
             <w:r>
-              <w:t xml:space="preserve">0.177</w:t>
+              <w:t xml:space="preserve">0.178</w:t>
             </w:r>
           </w:p>
         </w:tc>
@@ -4326,7 +4326,7 @@
               <w:jc w:val="right"/>
             </w:pPr>
             <w:r>
-              <w:t xml:space="preserve">0.242</w:t>
+              <w:t xml:space="preserve">0.239</w:t>
             </w:r>
           </w:p>
         </w:tc>
@@ -4338,7 +4338,7 @@
               <w:jc w:val="right"/>
             </w:pPr>
             <w:r>
-              <w:t xml:space="preserve">0.186</w:t>
+              <w:t xml:space="preserve">0.183</w:t>
             </w:r>
           </w:p>
         </w:tc>
@@ -4350,7 +4350,7 @@
               <w:jc w:val="right"/>
             </w:pPr>
             <w:r>
-              <w:t xml:space="preserve">0.249</w:t>
+              <w:t xml:space="preserve">0.250</w:t>
             </w:r>
           </w:p>
         </w:tc>
@@ -4362,7 +4362,7 @@
               <w:jc w:val="right"/>
             </w:pPr>
             <w:r>
-              <w:t xml:space="preserve">0.193</w:t>
+              <w:t xml:space="preserve">0.188</w:t>
             </w:r>
           </w:p>
         </w:tc>
@@ -4388,7 +4388,7 @@
               <w:jc w:val="right"/>
             </w:pPr>
             <w:r>
-              <w:t xml:space="preserve">29,115</w:t>
+              <w:t xml:space="preserve">29,475</w:t>
             </w:r>
           </w:p>
         </w:tc>
@@ -4400,7 +4400,7 @@
               <w:jc w:val="right"/>
             </w:pPr>
             <w:r>
-              <w:t xml:space="preserve">763,850</w:t>
+              <w:t xml:space="preserve">1,473,323</w:t>
             </w:r>
           </w:p>
         </w:tc>
@@ -4412,7 +4412,7 @@
               <w:jc w:val="right"/>
             </w:pPr>
             <w:r>
-              <w:t xml:space="preserve">26,859</w:t>
+              <w:t xml:space="preserve">27,207</w:t>
             </w:r>
           </w:p>
         </w:tc>
@@ -4424,7 +4424,7 @@
               <w:jc w:val="right"/>
             </w:pPr>
             <w:r>
-              <w:t xml:space="preserve">665,432</w:t>
+              <w:t xml:space="preserve">1,281,928</w:t>
             </w:r>
           </w:p>
         </w:tc>
@@ -4435,7 +4435,7 @@
         <w:pStyle w:val="BodyText"/>
       </w:pPr>
       <w:r>
-        <w:t xml:space="preserve">Notes: Weighted means over the twelve months before each event, pooled across events. Hourly wage among hourly-paid workers in the outgoing rotation groups, earnings-weighted.</w:t>
+        <w:t xml:space="preserve">Notes: Weighted means over the twelve months before each event, pooled across the 73 events; event units are the treated county or state remainder, controls the clean control units of that event. Hourly wage among hourly-paid workers in the outgoing rotation groups, earnings-weighted.</w:t>
       </w:r>
     </w:p>
     <w:bookmarkEnd w:id="30"/>
@@ -8473,7 +8473,7 @@
         <w:pStyle w:val="FirstParagraph"/>
       </w:pPr>
       <w:r>
-        <w:t xml:space="preserve">Girls and boys differ on both margins that the theory of Section 2 turns on. Over 2010–2026, 77 percent of 16–19 year old girls are enrolled and 31 percent employed, against 74 and 29 percent of boys, and hourly-paid girls earn $10.84 an hour against $11.71 for boys, so a rise in the minimum binds on more of the jobs girls hold. If the opportunity-cost channel operates, it should show first among girls, whose wage moves more; if the liquidity channel operates, it should show among whichever group is closer to the enrollment margin, which at 18–19 is boys. Appendix Tables 19 and 20 give the post-event averages for the four shares by sex and age, Table 4 the stacked coefficients, and Figure 5 the event-time coefficients for the pooled ages.</w:t>
+        <w:t xml:space="preserve">Girls and boys differ on both margins that the theory of Section 2 turns on. Over 2007–2026, 76 percent of 16–19 year old girls are enrolled and 31 percent employed, against 74 and 30 percent of boys, and hourly-paid girls earn $10.35 an hour against $11.19 for boys, so a rise in the minimum binds on more of the jobs girls hold. If the opportunity-cost channel operates, it should show first among girls, whose wage moves more; if the liquidity channel operates, it should show among whichever group is closer to the enrollment margin, which at 18–19 is boys. Appendix Tables 19 and 20 give the post-event averages for the four shares by sex and age, Table 4 the stacked coefficients, and Figure 5 the event-time coefficients for the pooled ages.</w:t>
       </w:r>
     </w:p>
     <w:p>
@@ -10077,7 +10077,7 @@
         <w:pStyle w:val="FirstParagraph"/>
       </w:pPr>
       <w:r>
-        <w:t xml:space="preserve">Non-Hispanic white teens are 53 percent of 16–19 year olds over 2010–2026; the rest are Hispanic (half of the non-white group), Black (a third) and other. The two groups enroll at the same rate, 75 percent, but white teens are employed at 35 percent against 25 percent for non-white teens, and the share neither in school nor at work is 11 against 14 percent. Non-white teens are concentrated in the jurisdictions that raised their minimums, the large states of the West and Northeast and the big-city counties, so they carry more of the weight in the treated population than in the controls, and their families have lower incomes on average, so the liquidity channel, if it operates, should show among them. Appendix Tables 21 and 22 give the post-event averages by race and age, Table 5 the stacked coefficients, and Figure 6 the event-time coefficients for the pooled ages.</w:t>
+        <w:t xml:space="preserve">Non-Hispanic white teens are 54 percent of 16–19 year olds over 2007–2026; the rest are Hispanic (half of the non-white group), Black (a third) and other. The two groups enroll at the same rate, 75 percent, but white teens are employed at 35 percent against 25 percent for non-white teens, and the share neither in school nor at work is 11 against 14 percent. Non-white teens are concentrated in the jurisdictions that raised their minimums, the large states of the West and Northeast and the big-city counties, so they carry more of the weight in the treated population than in the controls, and their families have lower incomes on average, so the liquidity channel, if it operates, should show among them. Appendix Tables 21 and 22 give the post-event averages by race and age, Table 5 the stacked coefficients, and Figure 6 the event-time coefficients for the pooled ages.</w:t>
       </w:r>
     </w:p>
     <w:p>
@@ -37980,7 +37980,7 @@
         <w:pStyle w:val="FirstParagraph"/>
       </w:pPr>
       <w:r>
-        <w:t xml:space="preserve">estimated on every teen observed from January 2010 with unit and year-month fixed effects, controls for single year of age, sex, race and Hispanic origin, survey weights, and standard errors clustered by state.</w:t>
+        <w:t xml:space="preserve">estimated on every teen observed from January 2010, the month of the first event, with unit and year-month fixed effects, controls for single year of age, sex, race and Hispanic origin, survey weights, and standard errors clustered by state. The regression starts in 2010 rather than at the start of the event windows in 2007 because the federal increases of July 2007, 2008 and 2009 would otherwise supply most of the within-unit variation in the log minimum, and they are not the state and local policies the paper studies.</w:t>
       </w:r>
       <w:r>
         <w:t xml:space="preserve"> </w:t>

</xml_diff>